<commit_message>
Taller 1: resultados de Classification Learner para Iris en la revision de datos
</commit_message>
<xml_diff>
--- a/Taller 1/Revision_datos.docx
+++ b/Taller 1/Revision_datos.docx
@@ -328,8 +328,15 @@
       </w:r>
     </w:p>
     <w:p>
+      <w:pPr>
+        <w:jc w:val="center"/>
+      </w:pPr>
       <w:r>
-        <w:t>[PANTALLAZO Classification Learner con T0_crudo]</w:t>
+        <w:rPr>
+          <w:i/>
+          <w:sz w:val="18"/>
+        </w:rPr>
+        <w:t>Classification Learner con T0_crudo, validación cruzada de 5 pliegues.</w:t>
       </w:r>
     </w:p>
     <w:tbl>
@@ -387,6 +394,7 @@
               <w:rPr>
                 <w:sz w:val="17"/>
               </w:rPr>
+              <w:t>Linear Discriminant y Quadratic Discriminant</w:t>
             </w:r>
           </w:p>
         </w:tc>
@@ -400,12 +408,18 @@
               <w:rPr>
                 <w:sz w:val="17"/>
               </w:rPr>
+              <w:t>98,0 %</w:t>
             </w:r>
           </w:p>
         </w:tc>
       </w:tr>
     </w:tbl>
     <w:p/>
+    <w:p>
+      <w:r>
+        <w:t>Con el dato tal como viene ya se llega al 98 %. Es un dataset fácil: setosa se separa sola y el error está en las 3 flores de la frontera entre versicolor y virginica.</w:t>
+      </w:r>
+    </w:p>
     <w:p>
       <w:pPr>
         <w:pStyle w:val="Heading3"/>
@@ -471,8 +485,15 @@
       </w:r>
     </w:p>
     <w:p>
+      <w:pPr>
+        <w:jc w:val="center"/>
+      </w:pPr>
       <w:r>
-        <w:t>[PANTALLAZO Classification Learner con T1_outliers]</w:t>
+        <w:rPr>
+          <w:i/>
+          <w:sz w:val="18"/>
+        </w:rPr>
+        <w:t>Classification Learner con T1_outliers.</w:t>
       </w:r>
     </w:p>
     <w:tbl>
@@ -546,6 +567,7 @@
               <w:rPr>
                 <w:sz w:val="17"/>
               </w:rPr>
+              <w:t>Linear Discriminant</w:t>
             </w:r>
           </w:p>
         </w:tc>
@@ -559,6 +581,7 @@
               <w:rPr>
                 <w:sz w:val="17"/>
               </w:rPr>
+              <w:t>98,0 %</w:t>
             </w:r>
           </w:p>
         </w:tc>
@@ -572,12 +595,18 @@
               <w:rPr>
                 <w:sz w:val="17"/>
               </w:rPr>
+              <w:t>no</w:t>
             </w:r>
           </w:p>
         </w:tc>
       </w:tr>
     </w:tbl>
     <w:p/>
+    <w:p>
+      <w:r>
+        <w:t>Recortar 4 valores del ancho del sépalo no mueve al mejor modelo. Los árboles bajaron de 96,7 a 96,0 y el SVM cúbico de 95,3 a 92,7, pero son diferencias de una o dos flores.</w:t>
+      </w:r>
+    </w:p>
     <w:p>
       <w:pPr>
         <w:pStyle w:val="Heading3"/>
@@ -615,53 +644,6 @@
     </w:p>
     <w:p>
       <w:pPr>
-        <w:pStyle w:val="Heading3"/>
-      </w:pPr>
-      <w:r>
-        <w:t>1.4 Estandarizando</w:t>
-      </w:r>
-    </w:p>
-    <w:p>
-      <w:pPr>
-        <w:jc w:val="center"/>
-      </w:pPr>
-      <w:r>
-        <w:drawing>
-          <wp:inline xmlns:a="http://schemas.openxmlformats.org/drawingml/2006/main" xmlns:pic="http://schemas.openxmlformats.org/drawingml/2006/picture">
-            <wp:extent cx="5760720" cy="3647814"/>
-            <wp:docPr id="6" name="Picture 6"/>
-            <wp:cNvGraphicFramePr>
-              <a:graphicFrameLocks noChangeAspect="1"/>
-            </wp:cNvGraphicFramePr>
-            <a:graphic>
-              <a:graphicData uri="http://schemas.openxmlformats.org/drawingml/2006/picture">
-                <pic:pic>
-                  <pic:nvPicPr>
-                    <pic:cNvPr id="0" name="rev_iris_boxplot_estandarizado.png"/>
-                    <pic:cNvPicPr/>
-                  </pic:nvPicPr>
-                  <pic:blipFill>
-                    <a:blip r:embed="rId14"/>
-                    <a:stretch>
-                      <a:fillRect/>
-                    </a:stretch>
-                  </pic:blipFill>
-                  <pic:spPr>
-                    <a:xfrm>
-                      <a:off x="0" y="0"/>
-                      <a:ext cx="5760720" cy="3647814"/>
-                    </a:xfrm>
-                    <a:prstGeom prst="rect"/>
-                  </pic:spPr>
-                </pic:pic>
-              </a:graphicData>
-            </a:graphic>
-          </wp:inline>
-        </w:drawing>
-      </w:r>
-    </w:p>
-    <w:p>
-      <w:pPr>
         <w:jc w:val="center"/>
       </w:pPr>
       <w:r>
@@ -669,12 +651,7 @@
           <w:i/>
           <w:sz w:val="18"/>
         </w:rPr>
-        <w:t>Media 0 y desviación 1 en las cuatro.</w:t>
-      </w:r>
-    </w:p>
-    <w:p>
-      <w:r>
-        <w:t>[PANTALLAZO Classification Learner con T3_estandarizado]</w:t>
+        <w:t>Classification Learner con T2_balanceado, que son los mismos datos de T1.</w:t>
       </w:r>
     </w:p>
     <w:tbl>
@@ -748,6 +725,7 @@
               <w:rPr>
                 <w:sz w:val="17"/>
               </w:rPr>
+              <w:t>Efficient Linear SVM</w:t>
             </w:r>
           </w:p>
         </w:tc>
@@ -761,6 +739,7 @@
               <w:rPr>
                 <w:sz w:val="17"/>
               </w:rPr>
+              <w:t>98,7 %</w:t>
             </w:r>
           </w:p>
         </w:tc>
@@ -774,6 +753,7 @@
               <w:rPr>
                 <w:sz w:val="17"/>
               </w:rPr>
+              <w:t>sube 0,7 puntos</w:t>
             </w:r>
           </w:p>
         </w:tc>
@@ -781,11 +761,16 @@
     </w:tbl>
     <w:p/>
     <w:p>
+      <w:r>
+        <w:t>Ojo con este 98,7 %: los datos son exactamente los mismos de T1. Lo que cambió es que la app volvió a repartir al azar los 5 pliegues de la validación cruzada, y con 150 flores un pliegue distinto mueve el resultado una flor. 98,7 contra 98,0 es una flor de 150. No es una mejora del balanceo, porque no hubo balanceo.</w:t>
+      </w:r>
+    </w:p>
+    <w:p>
       <w:pPr>
         <w:pStyle w:val="Heading3"/>
       </w:pPr>
       <w:r>
-        <w:t>1.5 Normalizando</w:t>
+        <w:t>1.4 Estandarizando</w:t>
       </w:r>
     </w:p>
     <w:p>
@@ -795,8 +780,8 @@
       <w:r>
         <w:drawing>
           <wp:inline xmlns:a="http://schemas.openxmlformats.org/drawingml/2006/main" xmlns:pic="http://schemas.openxmlformats.org/drawingml/2006/picture">
-            <wp:extent cx="5760720" cy="3676504"/>
-            <wp:docPr id="7" name="Picture 7"/>
+            <wp:extent cx="5760720" cy="3647814"/>
+            <wp:docPr id="6" name="Picture 6"/>
             <wp:cNvGraphicFramePr>
               <a:graphicFrameLocks noChangeAspect="1"/>
             </wp:cNvGraphicFramePr>
@@ -804,11 +789,11 @@
               <a:graphicData uri="http://schemas.openxmlformats.org/drawingml/2006/picture">
                 <pic:pic>
                   <pic:nvPicPr>
-                    <pic:cNvPr id="0" name="rev_iris_boxplot_normalizado.png"/>
+                    <pic:cNvPr id="0" name="rev_iris_boxplot_estandarizado.png"/>
                     <pic:cNvPicPr/>
                   </pic:nvPicPr>
                   <pic:blipFill>
-                    <a:blip r:embed="rId15"/>
+                    <a:blip r:embed="rId14"/>
                     <a:stretch>
                       <a:fillRect/>
                     </a:stretch>
@@ -816,7 +801,7 @@
                   <pic:spPr>
                     <a:xfrm>
                       <a:off x="0" y="0"/>
-                      <a:ext cx="5760720" cy="3676504"/>
+                      <a:ext cx="5760720" cy="3647814"/>
                     </a:xfrm>
                     <a:prstGeom prst="rect"/>
                   </pic:spPr>
@@ -836,12 +821,19 @@
           <w:i/>
           <w:sz w:val="18"/>
         </w:rPr>
-        <w:t>Todo entre 0 y 1.</w:t>
+        <w:t>Media 0 y desviación 1 en las cuatro.</w:t>
       </w:r>
     </w:p>
     <w:p>
+      <w:pPr>
+        <w:jc w:val="center"/>
+      </w:pPr>
       <w:r>
-        <w:t>[PANTALLAZO Classification Learner con T4_normalizado]</w:t>
+        <w:rPr>
+          <w:i/>
+          <w:sz w:val="18"/>
+        </w:rPr>
+        <w:t>Classification Learner con T3_estandarizado.</w:t>
       </w:r>
     </w:p>
     <w:tbl>
@@ -915,6 +907,7 @@
               <w:rPr>
                 <w:sz w:val="17"/>
               </w:rPr>
+              <w:t>Linear Discriminant, Quadratic Discriminant y Quadratic SVM</w:t>
             </w:r>
           </w:p>
         </w:tc>
@@ -928,6 +921,7 @@
               <w:rPr>
                 <w:sz w:val="17"/>
               </w:rPr>
+              <w:t>98,0 %</w:t>
             </w:r>
           </w:p>
         </w:tc>
@@ -941,12 +935,200 @@
               <w:rPr>
                 <w:sz w:val="17"/>
               </w:rPr>
+              <w:t>no</w:t>
             </w:r>
           </w:p>
         </w:tc>
       </w:tr>
     </w:tbl>
     <w:p/>
+    <w:p>
+      <w:r>
+        <w:t>Estandarizar no cambia el techo del 98 %, pero sube el SVM cuadrático de 97,3 a 98,0 y baja los árboles finos a 94,7. Tiene sentido: a los discriminantes y a los árboles la escala no les importa, a los SVM sí.</w:t>
+      </w:r>
+    </w:p>
+    <w:p>
+      <w:pPr>
+        <w:pStyle w:val="Heading3"/>
+      </w:pPr>
+      <w:r>
+        <w:t>1.5 Normalizando</w:t>
+      </w:r>
+    </w:p>
+    <w:p>
+      <w:pPr>
+        <w:jc w:val="center"/>
+      </w:pPr>
+      <w:r>
+        <w:drawing>
+          <wp:inline xmlns:a="http://schemas.openxmlformats.org/drawingml/2006/main" xmlns:pic="http://schemas.openxmlformats.org/drawingml/2006/picture">
+            <wp:extent cx="5760720" cy="3676504"/>
+            <wp:docPr id="7" name="Picture 7"/>
+            <wp:cNvGraphicFramePr>
+              <a:graphicFrameLocks noChangeAspect="1"/>
+            </wp:cNvGraphicFramePr>
+            <a:graphic>
+              <a:graphicData uri="http://schemas.openxmlformats.org/drawingml/2006/picture">
+                <pic:pic>
+                  <pic:nvPicPr>
+                    <pic:cNvPr id="0" name="rev_iris_boxplot_normalizado.png"/>
+                    <pic:cNvPicPr/>
+                  </pic:nvPicPr>
+                  <pic:blipFill>
+                    <a:blip r:embed="rId15"/>
+                    <a:stretch>
+                      <a:fillRect/>
+                    </a:stretch>
+                  </pic:blipFill>
+                  <pic:spPr>
+                    <a:xfrm>
+                      <a:off x="0" y="0"/>
+                      <a:ext cx="5760720" cy="3676504"/>
+                    </a:xfrm>
+                    <a:prstGeom prst="rect"/>
+                  </pic:spPr>
+                </pic:pic>
+              </a:graphicData>
+            </a:graphic>
+          </wp:inline>
+        </w:drawing>
+      </w:r>
+    </w:p>
+    <w:p>
+      <w:pPr>
+        <w:jc w:val="center"/>
+      </w:pPr>
+      <w:r>
+        <w:rPr>
+          <w:i/>
+          <w:sz w:val="18"/>
+        </w:rPr>
+        <w:t>Todo entre 0 y 1.</w:t>
+      </w:r>
+    </w:p>
+    <w:p>
+      <w:pPr>
+        <w:jc w:val="center"/>
+      </w:pPr>
+      <w:r>
+        <w:rPr>
+          <w:i/>
+          <w:sz w:val="18"/>
+        </w:rPr>
+        <w:t>Classification Learner con T4_normalizado.</w:t>
+      </w:r>
+    </w:p>
+    <w:tbl>
+      <w:tblPr>
+        <w:tblStyle w:val="LightGrid-Accent1"/>
+        <w:tblW w:type="auto" w:w="0"/>
+        <w:jc w:val="center"/>
+        <w:tblLayout w:type="autofit"/>
+        <w:tblLook w:firstColumn="1" w:firstRow="1" w:lastColumn="0" w:lastRow="0" w:noHBand="0" w:noVBand="1" w:val="04A0"/>
+      </w:tblPr>
+      <w:tblGrid>
+        <w:gridCol w:w="2880"/>
+        <w:gridCol w:w="2880"/>
+        <w:gridCol w:w="2880"/>
+      </w:tblGrid>
+      <w:tr>
+        <w:tc>
+          <w:tcPr>
+            <w:tcW w:type="dxa" w:w="2880"/>
+          </w:tcPr>
+          <w:p>
+            <w:r/>
+            <w:r>
+              <w:rPr>
+                <w:b/>
+                <w:sz w:val="17"/>
+              </w:rPr>
+              <w:t>Mejor modelo</w:t>
+            </w:r>
+          </w:p>
+        </w:tc>
+        <w:tc>
+          <w:tcPr>
+            <w:tcW w:type="dxa" w:w="2880"/>
+          </w:tcPr>
+          <w:p>
+            <w:r/>
+            <w:r>
+              <w:rPr>
+                <w:b/>
+                <w:sz w:val="17"/>
+              </w:rPr>
+              <w:t>Exactitud</w:t>
+            </w:r>
+          </w:p>
+        </w:tc>
+        <w:tc>
+          <w:tcPr>
+            <w:tcW w:type="dxa" w:w="2880"/>
+          </w:tcPr>
+          <w:p>
+            <w:r/>
+            <w:r>
+              <w:rPr>
+                <w:b/>
+                <w:sz w:val="17"/>
+              </w:rPr>
+              <w:t>Cambió</w:t>
+            </w:r>
+          </w:p>
+        </w:tc>
+      </w:tr>
+      <w:tr>
+        <w:tc>
+          <w:tcPr>
+            <w:tcW w:type="dxa" w:w="2880"/>
+          </w:tcPr>
+          <w:p>
+            <w:r/>
+            <w:r>
+              <w:rPr>
+                <w:sz w:val="17"/>
+              </w:rPr>
+              <w:t>Linear Discriminant</w:t>
+            </w:r>
+          </w:p>
+        </w:tc>
+        <w:tc>
+          <w:tcPr>
+            <w:tcW w:type="dxa" w:w="2880"/>
+          </w:tcPr>
+          <w:p>
+            <w:r/>
+            <w:r>
+              <w:rPr>
+                <w:sz w:val="17"/>
+              </w:rPr>
+              <w:t>98,0 %</w:t>
+            </w:r>
+          </w:p>
+        </w:tc>
+        <w:tc>
+          <w:tcPr>
+            <w:tcW w:type="dxa" w:w="2880"/>
+          </w:tcPr>
+          <w:p>
+            <w:r/>
+            <w:r>
+              <w:rPr>
+                <w:sz w:val="17"/>
+              </w:rPr>
+              <w:t>no</w:t>
+            </w:r>
+          </w:p>
+        </w:tc>
+      </w:tr>
+    </w:tbl>
+    <w:p/>
+    <w:p>
+      <w:r>
+        <w:t>Igual que estandarizar. El discriminante lineal da 98 % con cualquier versión de los datos.</w:t>
+      </w:r>
+    </w:p>
     <w:p>
       <w:pPr>
         <w:pStyle w:val="Heading3"/>
@@ -955,6 +1137,1153 @@
         <w:t>1.6 Qué pasó en Iris</w:t>
       </w:r>
     </w:p>
+    <w:p>
+      <w:r>
+        <w:t>Los 12 modelos de la app en cada paso, exactitud de validación en %:</w:t>
+      </w:r>
+    </w:p>
+    <w:tbl>
+      <w:tblPr>
+        <w:tblStyle w:val="LightGrid-Accent1"/>
+        <w:tblW w:type="auto" w:w="0"/>
+        <w:jc w:val="center"/>
+        <w:tblLayout w:type="autofit"/>
+        <w:tblLook w:firstColumn="1" w:firstRow="1" w:lastColumn="0" w:lastRow="0" w:noHBand="0" w:noVBand="1" w:val="04A0"/>
+      </w:tblPr>
+      <w:tblGrid>
+        <w:gridCol w:w="1440"/>
+        <w:gridCol w:w="1440"/>
+        <w:gridCol w:w="1440"/>
+        <w:gridCol w:w="1440"/>
+        <w:gridCol w:w="1440"/>
+        <w:gridCol w:w="1440"/>
+      </w:tblGrid>
+      <w:tr>
+        <w:tc>
+          <w:tcPr>
+            <w:tcW w:type="dxa" w:w="1440"/>
+          </w:tcPr>
+          <w:p>
+            <w:r/>
+            <w:r>
+              <w:rPr>
+                <w:b/>
+                <w:sz w:val="17"/>
+              </w:rPr>
+              <w:t>Modelo</w:t>
+            </w:r>
+          </w:p>
+        </w:tc>
+        <w:tc>
+          <w:tcPr>
+            <w:tcW w:type="dxa" w:w="1440"/>
+          </w:tcPr>
+          <w:p>
+            <w:r/>
+            <w:r>
+              <w:rPr>
+                <w:b/>
+                <w:sz w:val="17"/>
+              </w:rPr>
+              <w:t>T0 crudo</w:t>
+            </w:r>
+          </w:p>
+        </w:tc>
+        <w:tc>
+          <w:tcPr>
+            <w:tcW w:type="dxa" w:w="1440"/>
+          </w:tcPr>
+          <w:p>
+            <w:r/>
+            <w:r>
+              <w:rPr>
+                <w:b/>
+                <w:sz w:val="17"/>
+              </w:rPr>
+              <w:t>T1 outliers</w:t>
+            </w:r>
+          </w:p>
+        </w:tc>
+        <w:tc>
+          <w:tcPr>
+            <w:tcW w:type="dxa" w:w="1440"/>
+          </w:tcPr>
+          <w:p>
+            <w:r/>
+            <w:r>
+              <w:rPr>
+                <w:b/>
+                <w:sz w:val="17"/>
+              </w:rPr>
+              <w:t>T2 balanceado</w:t>
+            </w:r>
+          </w:p>
+        </w:tc>
+        <w:tc>
+          <w:tcPr>
+            <w:tcW w:type="dxa" w:w="1440"/>
+          </w:tcPr>
+          <w:p>
+            <w:r/>
+            <w:r>
+              <w:rPr>
+                <w:b/>
+                <w:sz w:val="17"/>
+              </w:rPr>
+              <w:t>T3 estandarizado</w:t>
+            </w:r>
+          </w:p>
+        </w:tc>
+        <w:tc>
+          <w:tcPr>
+            <w:tcW w:type="dxa" w:w="1440"/>
+          </w:tcPr>
+          <w:p>
+            <w:r/>
+            <w:r>
+              <w:rPr>
+                <w:b/>
+                <w:sz w:val="17"/>
+              </w:rPr>
+              <w:t>T4 normalizado</w:t>
+            </w:r>
+          </w:p>
+        </w:tc>
+      </w:tr>
+      <w:tr>
+        <w:tc>
+          <w:tcPr>
+            <w:tcW w:type="dxa" w:w="1440"/>
+          </w:tcPr>
+          <w:p>
+            <w:r/>
+            <w:r>
+              <w:rPr>
+                <w:sz w:val="17"/>
+              </w:rPr>
+              <w:t>Fine Tree</w:t>
+            </w:r>
+          </w:p>
+        </w:tc>
+        <w:tc>
+          <w:tcPr>
+            <w:tcW w:type="dxa" w:w="1440"/>
+          </w:tcPr>
+          <w:p>
+            <w:r/>
+            <w:r>
+              <w:rPr>
+                <w:sz w:val="17"/>
+              </w:rPr>
+              <w:t>96,7</w:t>
+            </w:r>
+          </w:p>
+        </w:tc>
+        <w:tc>
+          <w:tcPr>
+            <w:tcW w:type="dxa" w:w="1440"/>
+          </w:tcPr>
+          <w:p>
+            <w:r/>
+            <w:r>
+              <w:rPr>
+                <w:sz w:val="17"/>
+              </w:rPr>
+              <w:t>96,0</w:t>
+            </w:r>
+          </w:p>
+        </w:tc>
+        <w:tc>
+          <w:tcPr>
+            <w:tcW w:type="dxa" w:w="1440"/>
+          </w:tcPr>
+          <w:p>
+            <w:r/>
+            <w:r>
+              <w:rPr>
+                <w:sz w:val="17"/>
+              </w:rPr>
+              <w:t>96,0</w:t>
+            </w:r>
+          </w:p>
+        </w:tc>
+        <w:tc>
+          <w:tcPr>
+            <w:tcW w:type="dxa" w:w="1440"/>
+          </w:tcPr>
+          <w:p>
+            <w:r/>
+            <w:r>
+              <w:rPr>
+                <w:sz w:val="17"/>
+              </w:rPr>
+              <w:t>94,7</w:t>
+            </w:r>
+          </w:p>
+        </w:tc>
+        <w:tc>
+          <w:tcPr>
+            <w:tcW w:type="dxa" w:w="1440"/>
+          </w:tcPr>
+          <w:p>
+            <w:r/>
+            <w:r>
+              <w:rPr>
+                <w:sz w:val="17"/>
+              </w:rPr>
+              <w:t>95,3</w:t>
+            </w:r>
+          </w:p>
+        </w:tc>
+      </w:tr>
+      <w:tr>
+        <w:tc>
+          <w:tcPr>
+            <w:tcW w:type="dxa" w:w="1440"/>
+          </w:tcPr>
+          <w:p>
+            <w:r/>
+            <w:r>
+              <w:rPr>
+                <w:sz w:val="17"/>
+              </w:rPr>
+              <w:t>Medium Tree</w:t>
+            </w:r>
+          </w:p>
+        </w:tc>
+        <w:tc>
+          <w:tcPr>
+            <w:tcW w:type="dxa" w:w="1440"/>
+          </w:tcPr>
+          <w:p>
+            <w:r/>
+            <w:r>
+              <w:rPr>
+                <w:sz w:val="17"/>
+              </w:rPr>
+              <w:t>96,7</w:t>
+            </w:r>
+          </w:p>
+        </w:tc>
+        <w:tc>
+          <w:tcPr>
+            <w:tcW w:type="dxa" w:w="1440"/>
+          </w:tcPr>
+          <w:p>
+            <w:r/>
+            <w:r>
+              <w:rPr>
+                <w:sz w:val="17"/>
+              </w:rPr>
+              <w:t>96,0</w:t>
+            </w:r>
+          </w:p>
+        </w:tc>
+        <w:tc>
+          <w:tcPr>
+            <w:tcW w:type="dxa" w:w="1440"/>
+          </w:tcPr>
+          <w:p>
+            <w:r/>
+            <w:r>
+              <w:rPr>
+                <w:sz w:val="17"/>
+              </w:rPr>
+              <w:t>96,0</w:t>
+            </w:r>
+          </w:p>
+        </w:tc>
+        <w:tc>
+          <w:tcPr>
+            <w:tcW w:type="dxa" w:w="1440"/>
+          </w:tcPr>
+          <w:p>
+            <w:r/>
+            <w:r>
+              <w:rPr>
+                <w:sz w:val="17"/>
+              </w:rPr>
+              <w:t>94,7</w:t>
+            </w:r>
+          </w:p>
+        </w:tc>
+        <w:tc>
+          <w:tcPr>
+            <w:tcW w:type="dxa" w:w="1440"/>
+          </w:tcPr>
+          <w:p>
+            <w:r/>
+            <w:r>
+              <w:rPr>
+                <w:sz w:val="17"/>
+              </w:rPr>
+              <w:t>95,3</w:t>
+            </w:r>
+          </w:p>
+        </w:tc>
+      </w:tr>
+      <w:tr>
+        <w:tc>
+          <w:tcPr>
+            <w:tcW w:type="dxa" w:w="1440"/>
+          </w:tcPr>
+          <w:p>
+            <w:r/>
+            <w:r>
+              <w:rPr>
+                <w:sz w:val="17"/>
+              </w:rPr>
+              <w:t>Coarse Tree</w:t>
+            </w:r>
+          </w:p>
+        </w:tc>
+        <w:tc>
+          <w:tcPr>
+            <w:tcW w:type="dxa" w:w="1440"/>
+          </w:tcPr>
+          <w:p>
+            <w:r/>
+            <w:r>
+              <w:rPr>
+                <w:sz w:val="17"/>
+              </w:rPr>
+              <w:t>96,7</w:t>
+            </w:r>
+          </w:p>
+        </w:tc>
+        <w:tc>
+          <w:tcPr>
+            <w:tcW w:type="dxa" w:w="1440"/>
+          </w:tcPr>
+          <w:p>
+            <w:r/>
+            <w:r>
+              <w:rPr>
+                <w:sz w:val="17"/>
+              </w:rPr>
+              <w:t>96,0</w:t>
+            </w:r>
+          </w:p>
+        </w:tc>
+        <w:tc>
+          <w:tcPr>
+            <w:tcW w:type="dxa" w:w="1440"/>
+          </w:tcPr>
+          <w:p>
+            <w:r/>
+            <w:r>
+              <w:rPr>
+                <w:sz w:val="17"/>
+              </w:rPr>
+              <w:t>96,0</w:t>
+            </w:r>
+          </w:p>
+        </w:tc>
+        <w:tc>
+          <w:tcPr>
+            <w:tcW w:type="dxa" w:w="1440"/>
+          </w:tcPr>
+          <w:p>
+            <w:r/>
+            <w:r>
+              <w:rPr>
+                <w:sz w:val="17"/>
+              </w:rPr>
+              <w:t>96,7</w:t>
+            </w:r>
+          </w:p>
+        </w:tc>
+        <w:tc>
+          <w:tcPr>
+            <w:tcW w:type="dxa" w:w="1440"/>
+          </w:tcPr>
+          <w:p>
+            <w:r/>
+            <w:r>
+              <w:rPr>
+                <w:sz w:val="17"/>
+              </w:rPr>
+              <w:t>95,3</w:t>
+            </w:r>
+          </w:p>
+        </w:tc>
+      </w:tr>
+      <w:tr>
+        <w:tc>
+          <w:tcPr>
+            <w:tcW w:type="dxa" w:w="1440"/>
+          </w:tcPr>
+          <w:p>
+            <w:r/>
+            <w:r>
+              <w:rPr>
+                <w:sz w:val="17"/>
+              </w:rPr>
+              <w:t>Linear Discriminant</w:t>
+            </w:r>
+          </w:p>
+        </w:tc>
+        <w:tc>
+          <w:tcPr>
+            <w:tcW w:type="dxa" w:w="1440"/>
+          </w:tcPr>
+          <w:p>
+            <w:r/>
+            <w:r>
+              <w:rPr>
+                <w:sz w:val="17"/>
+              </w:rPr>
+              <w:t>98,0</w:t>
+            </w:r>
+          </w:p>
+        </w:tc>
+        <w:tc>
+          <w:tcPr>
+            <w:tcW w:type="dxa" w:w="1440"/>
+          </w:tcPr>
+          <w:p>
+            <w:r/>
+            <w:r>
+              <w:rPr>
+                <w:sz w:val="17"/>
+              </w:rPr>
+              <w:t>98,0</w:t>
+            </w:r>
+          </w:p>
+        </w:tc>
+        <w:tc>
+          <w:tcPr>
+            <w:tcW w:type="dxa" w:w="1440"/>
+          </w:tcPr>
+          <w:p>
+            <w:r/>
+            <w:r>
+              <w:rPr>
+                <w:sz w:val="17"/>
+              </w:rPr>
+              <w:t>98,0</w:t>
+            </w:r>
+          </w:p>
+        </w:tc>
+        <w:tc>
+          <w:tcPr>
+            <w:tcW w:type="dxa" w:w="1440"/>
+          </w:tcPr>
+          <w:p>
+            <w:r/>
+            <w:r>
+              <w:rPr>
+                <w:sz w:val="17"/>
+              </w:rPr>
+              <w:t>98,0</w:t>
+            </w:r>
+          </w:p>
+        </w:tc>
+        <w:tc>
+          <w:tcPr>
+            <w:tcW w:type="dxa" w:w="1440"/>
+          </w:tcPr>
+          <w:p>
+            <w:r/>
+            <w:r>
+              <w:rPr>
+                <w:sz w:val="17"/>
+              </w:rPr>
+              <w:t>98,0</w:t>
+            </w:r>
+          </w:p>
+        </w:tc>
+      </w:tr>
+      <w:tr>
+        <w:tc>
+          <w:tcPr>
+            <w:tcW w:type="dxa" w:w="1440"/>
+          </w:tcPr>
+          <w:p>
+            <w:r/>
+            <w:r>
+              <w:rPr>
+                <w:sz w:val="17"/>
+              </w:rPr>
+              <w:t>Quadratic Discriminant</w:t>
+            </w:r>
+          </w:p>
+        </w:tc>
+        <w:tc>
+          <w:tcPr>
+            <w:tcW w:type="dxa" w:w="1440"/>
+          </w:tcPr>
+          <w:p>
+            <w:r/>
+            <w:r>
+              <w:rPr>
+                <w:sz w:val="17"/>
+              </w:rPr>
+              <w:t>98,0</w:t>
+            </w:r>
+          </w:p>
+        </w:tc>
+        <w:tc>
+          <w:tcPr>
+            <w:tcW w:type="dxa" w:w="1440"/>
+          </w:tcPr>
+          <w:p>
+            <w:r/>
+            <w:r>
+              <w:rPr>
+                <w:sz w:val="17"/>
+              </w:rPr>
+              <w:t>96,7</w:t>
+            </w:r>
+          </w:p>
+        </w:tc>
+        <w:tc>
+          <w:tcPr>
+            <w:tcW w:type="dxa" w:w="1440"/>
+          </w:tcPr>
+          <w:p>
+            <w:r/>
+            <w:r>
+              <w:rPr>
+                <w:sz w:val="17"/>
+              </w:rPr>
+              <w:t>97,3</w:t>
+            </w:r>
+          </w:p>
+        </w:tc>
+        <w:tc>
+          <w:tcPr>
+            <w:tcW w:type="dxa" w:w="1440"/>
+          </w:tcPr>
+          <w:p>
+            <w:r/>
+            <w:r>
+              <w:rPr>
+                <w:sz w:val="17"/>
+              </w:rPr>
+              <w:t>98,0</w:t>
+            </w:r>
+          </w:p>
+        </w:tc>
+        <w:tc>
+          <w:tcPr>
+            <w:tcW w:type="dxa" w:w="1440"/>
+          </w:tcPr>
+          <w:p>
+            <w:r/>
+            <w:r>
+              <w:rPr>
+                <w:sz w:val="17"/>
+              </w:rPr>
+              <w:t>96,7</w:t>
+            </w:r>
+          </w:p>
+        </w:tc>
+      </w:tr>
+      <w:tr>
+        <w:tc>
+          <w:tcPr>
+            <w:tcW w:type="dxa" w:w="1440"/>
+          </w:tcPr>
+          <w:p>
+            <w:r/>
+            <w:r>
+              <w:rPr>
+                <w:sz w:val="17"/>
+              </w:rPr>
+              <w:t>Efficient Logistic Regression</w:t>
+            </w:r>
+          </w:p>
+        </w:tc>
+        <w:tc>
+          <w:tcPr>
+            <w:tcW w:type="dxa" w:w="1440"/>
+          </w:tcPr>
+          <w:p>
+            <w:r/>
+            <w:r>
+              <w:rPr>
+                <w:sz w:val="17"/>
+              </w:rPr>
+              <w:t>96,7</w:t>
+            </w:r>
+          </w:p>
+        </w:tc>
+        <w:tc>
+          <w:tcPr>
+            <w:tcW w:type="dxa" w:w="1440"/>
+          </w:tcPr>
+          <w:p>
+            <w:r/>
+            <w:r>
+              <w:rPr>
+                <w:sz w:val="17"/>
+              </w:rPr>
+              <w:t>97,3</w:t>
+            </w:r>
+          </w:p>
+        </w:tc>
+        <w:tc>
+          <w:tcPr>
+            <w:tcW w:type="dxa" w:w="1440"/>
+          </w:tcPr>
+          <w:p>
+            <w:r/>
+            <w:r>
+              <w:rPr>
+                <w:sz w:val="17"/>
+              </w:rPr>
+              <w:t>96,7</w:t>
+            </w:r>
+          </w:p>
+        </w:tc>
+        <w:tc>
+          <w:tcPr>
+            <w:tcW w:type="dxa" w:w="1440"/>
+          </w:tcPr>
+          <w:p>
+            <w:r/>
+            <w:r>
+              <w:rPr>
+                <w:sz w:val="17"/>
+              </w:rPr>
+              <w:t>96,0</w:t>
+            </w:r>
+          </w:p>
+        </w:tc>
+        <w:tc>
+          <w:tcPr>
+            <w:tcW w:type="dxa" w:w="1440"/>
+          </w:tcPr>
+          <w:p>
+            <w:r/>
+            <w:r>
+              <w:rPr>
+                <w:sz w:val="17"/>
+              </w:rPr>
+              <w:t>95,3</w:t>
+            </w:r>
+          </w:p>
+        </w:tc>
+      </w:tr>
+      <w:tr>
+        <w:tc>
+          <w:tcPr>
+            <w:tcW w:type="dxa" w:w="1440"/>
+          </w:tcPr>
+          <w:p>
+            <w:r/>
+            <w:r>
+              <w:rPr>
+                <w:sz w:val="17"/>
+              </w:rPr>
+              <w:t>Efficient Linear SVM</w:t>
+            </w:r>
+          </w:p>
+        </w:tc>
+        <w:tc>
+          <w:tcPr>
+            <w:tcW w:type="dxa" w:w="1440"/>
+          </w:tcPr>
+          <w:p>
+            <w:r/>
+            <w:r>
+              <w:rPr>
+                <w:sz w:val="17"/>
+              </w:rPr>
+              <w:t>97,3</w:t>
+            </w:r>
+          </w:p>
+        </w:tc>
+        <w:tc>
+          <w:tcPr>
+            <w:tcW w:type="dxa" w:w="1440"/>
+          </w:tcPr>
+          <w:p>
+            <w:r/>
+            <w:r>
+              <w:rPr>
+                <w:sz w:val="17"/>
+              </w:rPr>
+              <w:t>97,3</w:t>
+            </w:r>
+          </w:p>
+        </w:tc>
+        <w:tc>
+          <w:tcPr>
+            <w:tcW w:type="dxa" w:w="1440"/>
+          </w:tcPr>
+          <w:p>
+            <w:r/>
+            <w:r>
+              <w:rPr>
+                <w:sz w:val="17"/>
+              </w:rPr>
+              <w:t>98,7</w:t>
+            </w:r>
+          </w:p>
+        </w:tc>
+        <w:tc>
+          <w:tcPr>
+            <w:tcW w:type="dxa" w:w="1440"/>
+          </w:tcPr>
+          <w:p>
+            <w:r/>
+            <w:r>
+              <w:rPr>
+                <w:sz w:val="17"/>
+              </w:rPr>
+              <w:t>96,7</w:t>
+            </w:r>
+          </w:p>
+        </w:tc>
+        <w:tc>
+          <w:tcPr>
+            <w:tcW w:type="dxa" w:w="1440"/>
+          </w:tcPr>
+          <w:p>
+            <w:r/>
+            <w:r>
+              <w:rPr>
+                <w:sz w:val="17"/>
+              </w:rPr>
+              <w:t>96,0</w:t>
+            </w:r>
+          </w:p>
+        </w:tc>
+      </w:tr>
+      <w:tr>
+        <w:tc>
+          <w:tcPr>
+            <w:tcW w:type="dxa" w:w="1440"/>
+          </w:tcPr>
+          <w:p>
+            <w:r/>
+            <w:r>
+              <w:rPr>
+                <w:sz w:val="17"/>
+              </w:rPr>
+              <w:t>Gaussian Naive Bayes</w:t>
+            </w:r>
+          </w:p>
+        </w:tc>
+        <w:tc>
+          <w:tcPr>
+            <w:tcW w:type="dxa" w:w="1440"/>
+          </w:tcPr>
+          <w:p>
+            <w:r/>
+            <w:r>
+              <w:rPr>
+                <w:sz w:val="17"/>
+              </w:rPr>
+              <w:t>94,7</w:t>
+            </w:r>
+          </w:p>
+        </w:tc>
+        <w:tc>
+          <w:tcPr>
+            <w:tcW w:type="dxa" w:w="1440"/>
+          </w:tcPr>
+          <w:p>
+            <w:r/>
+            <w:r>
+              <w:rPr>
+                <w:sz w:val="17"/>
+              </w:rPr>
+              <w:t>95,3</w:t>
+            </w:r>
+          </w:p>
+        </w:tc>
+        <w:tc>
+          <w:tcPr>
+            <w:tcW w:type="dxa" w:w="1440"/>
+          </w:tcPr>
+          <w:p>
+            <w:r/>
+            <w:r>
+              <w:rPr>
+                <w:sz w:val="17"/>
+              </w:rPr>
+              <w:t>96,0</w:t>
+            </w:r>
+          </w:p>
+        </w:tc>
+        <w:tc>
+          <w:tcPr>
+            <w:tcW w:type="dxa" w:w="1440"/>
+          </w:tcPr>
+          <w:p>
+            <w:r/>
+            <w:r>
+              <w:rPr>
+                <w:sz w:val="17"/>
+              </w:rPr>
+              <w:t>95,3</w:t>
+            </w:r>
+          </w:p>
+        </w:tc>
+        <w:tc>
+          <w:tcPr>
+            <w:tcW w:type="dxa" w:w="1440"/>
+          </w:tcPr>
+          <w:p>
+            <w:r/>
+            <w:r>
+              <w:rPr>
+                <w:sz w:val="17"/>
+              </w:rPr>
+              <w:t>95,3</w:t>
+            </w:r>
+          </w:p>
+        </w:tc>
+      </w:tr>
+      <w:tr>
+        <w:tc>
+          <w:tcPr>
+            <w:tcW w:type="dxa" w:w="1440"/>
+          </w:tcPr>
+          <w:p>
+            <w:r/>
+            <w:r>
+              <w:rPr>
+                <w:sz w:val="17"/>
+              </w:rPr>
+              <w:t>Kernel Naive Bayes</w:t>
+            </w:r>
+          </w:p>
+        </w:tc>
+        <w:tc>
+          <w:tcPr>
+            <w:tcW w:type="dxa" w:w="1440"/>
+          </w:tcPr>
+          <w:p>
+            <w:r/>
+            <w:r>
+              <w:rPr>
+                <w:sz w:val="17"/>
+              </w:rPr>
+              <w:t>96,0</w:t>
+            </w:r>
+          </w:p>
+        </w:tc>
+        <w:tc>
+          <w:tcPr>
+            <w:tcW w:type="dxa" w:w="1440"/>
+          </w:tcPr>
+          <w:p>
+            <w:r/>
+            <w:r>
+              <w:rPr>
+                <w:sz w:val="17"/>
+              </w:rPr>
+              <w:t>96,0</w:t>
+            </w:r>
+          </w:p>
+        </w:tc>
+        <w:tc>
+          <w:tcPr>
+            <w:tcW w:type="dxa" w:w="1440"/>
+          </w:tcPr>
+          <w:p>
+            <w:r/>
+            <w:r>
+              <w:rPr>
+                <w:sz w:val="17"/>
+              </w:rPr>
+              <w:t>96,0</w:t>
+            </w:r>
+          </w:p>
+        </w:tc>
+        <w:tc>
+          <w:tcPr>
+            <w:tcW w:type="dxa" w:w="1440"/>
+          </w:tcPr>
+          <w:p>
+            <w:r/>
+            <w:r>
+              <w:rPr>
+                <w:sz w:val="17"/>
+              </w:rPr>
+              <w:t>95,3</w:t>
+            </w:r>
+          </w:p>
+        </w:tc>
+        <w:tc>
+          <w:tcPr>
+            <w:tcW w:type="dxa" w:w="1440"/>
+          </w:tcPr>
+          <w:p>
+            <w:r/>
+            <w:r>
+              <w:rPr>
+                <w:sz w:val="17"/>
+              </w:rPr>
+              <w:t>96,0</w:t>
+            </w:r>
+          </w:p>
+        </w:tc>
+      </w:tr>
+      <w:tr>
+        <w:tc>
+          <w:tcPr>
+            <w:tcW w:type="dxa" w:w="1440"/>
+          </w:tcPr>
+          <w:p>
+            <w:r/>
+            <w:r>
+              <w:rPr>
+                <w:sz w:val="17"/>
+              </w:rPr>
+              <w:t>Linear SVM</w:t>
+            </w:r>
+          </w:p>
+        </w:tc>
+        <w:tc>
+          <w:tcPr>
+            <w:tcW w:type="dxa" w:w="1440"/>
+          </w:tcPr>
+          <w:p>
+            <w:r/>
+            <w:r>
+              <w:rPr>
+                <w:sz w:val="17"/>
+              </w:rPr>
+              <w:t>95,3</w:t>
+            </w:r>
+          </w:p>
+        </w:tc>
+        <w:tc>
+          <w:tcPr>
+            <w:tcW w:type="dxa" w:w="1440"/>
+          </w:tcPr>
+          <w:p>
+            <w:r/>
+            <w:r>
+              <w:rPr>
+                <w:sz w:val="17"/>
+              </w:rPr>
+              <w:t>96,7</w:t>
+            </w:r>
+          </w:p>
+        </w:tc>
+        <w:tc>
+          <w:tcPr>
+            <w:tcW w:type="dxa" w:w="1440"/>
+          </w:tcPr>
+          <w:p>
+            <w:r/>
+            <w:r>
+              <w:rPr>
+                <w:sz w:val="17"/>
+              </w:rPr>
+              <w:t>96,7</w:t>
+            </w:r>
+          </w:p>
+        </w:tc>
+        <w:tc>
+          <w:tcPr>
+            <w:tcW w:type="dxa" w:w="1440"/>
+          </w:tcPr>
+          <w:p>
+            <w:r/>
+            <w:r>
+              <w:rPr>
+                <w:sz w:val="17"/>
+              </w:rPr>
+              <w:t>96,0</w:t>
+            </w:r>
+          </w:p>
+        </w:tc>
+        <w:tc>
+          <w:tcPr>
+            <w:tcW w:type="dxa" w:w="1440"/>
+          </w:tcPr>
+          <w:p>
+            <w:r/>
+            <w:r>
+              <w:rPr>
+                <w:sz w:val="17"/>
+              </w:rPr>
+              <w:t>95,3</w:t>
+            </w:r>
+          </w:p>
+        </w:tc>
+      </w:tr>
+      <w:tr>
+        <w:tc>
+          <w:tcPr>
+            <w:tcW w:type="dxa" w:w="1440"/>
+          </w:tcPr>
+          <w:p>
+            <w:r/>
+            <w:r>
+              <w:rPr>
+                <w:sz w:val="17"/>
+              </w:rPr>
+              <w:t>Quadratic SVM</w:t>
+            </w:r>
+          </w:p>
+        </w:tc>
+        <w:tc>
+          <w:tcPr>
+            <w:tcW w:type="dxa" w:w="1440"/>
+          </w:tcPr>
+          <w:p>
+            <w:r/>
+            <w:r>
+              <w:rPr>
+                <w:sz w:val="17"/>
+              </w:rPr>
+              <w:t>96,7</w:t>
+            </w:r>
+          </w:p>
+        </w:tc>
+        <w:tc>
+          <w:tcPr>
+            <w:tcW w:type="dxa" w:w="1440"/>
+          </w:tcPr>
+          <w:p>
+            <w:r/>
+            <w:r>
+              <w:rPr>
+                <w:sz w:val="17"/>
+              </w:rPr>
+              <w:t>94,7</w:t>
+            </w:r>
+          </w:p>
+        </w:tc>
+        <w:tc>
+          <w:tcPr>
+            <w:tcW w:type="dxa" w:w="1440"/>
+          </w:tcPr>
+          <w:p>
+            <w:r/>
+            <w:r>
+              <w:rPr>
+                <w:sz w:val="17"/>
+              </w:rPr>
+              <w:t>97,3</w:t>
+            </w:r>
+          </w:p>
+        </w:tc>
+        <w:tc>
+          <w:tcPr>
+            <w:tcW w:type="dxa" w:w="1440"/>
+          </w:tcPr>
+          <w:p>
+            <w:r/>
+            <w:r>
+              <w:rPr>
+                <w:sz w:val="17"/>
+              </w:rPr>
+              <w:t>98,0</w:t>
+            </w:r>
+          </w:p>
+        </w:tc>
+        <w:tc>
+          <w:tcPr>
+            <w:tcW w:type="dxa" w:w="1440"/>
+          </w:tcPr>
+          <w:p>
+            <w:r/>
+            <w:r>
+              <w:rPr>
+                <w:sz w:val="17"/>
+              </w:rPr>
+              <w:t>96,7</w:t>
+            </w:r>
+          </w:p>
+        </w:tc>
+      </w:tr>
+      <w:tr>
+        <w:tc>
+          <w:tcPr>
+            <w:tcW w:type="dxa" w:w="1440"/>
+          </w:tcPr>
+          <w:p>
+            <w:r/>
+            <w:r>
+              <w:rPr>
+                <w:sz w:val="17"/>
+              </w:rPr>
+              <w:t>Cubic SVM</w:t>
+            </w:r>
+          </w:p>
+        </w:tc>
+        <w:tc>
+          <w:tcPr>
+            <w:tcW w:type="dxa" w:w="1440"/>
+          </w:tcPr>
+          <w:p>
+            <w:r/>
+            <w:r>
+              <w:rPr>
+                <w:sz w:val="17"/>
+              </w:rPr>
+              <w:t>95,3</w:t>
+            </w:r>
+          </w:p>
+        </w:tc>
+        <w:tc>
+          <w:tcPr>
+            <w:tcW w:type="dxa" w:w="1440"/>
+          </w:tcPr>
+          <w:p>
+            <w:r/>
+            <w:r>
+              <w:rPr>
+                <w:sz w:val="17"/>
+              </w:rPr>
+              <w:t>92,7</w:t>
+            </w:r>
+          </w:p>
+        </w:tc>
+        <w:tc>
+          <w:tcPr>
+            <w:tcW w:type="dxa" w:w="1440"/>
+          </w:tcPr>
+          <w:p>
+            <w:r/>
+            <w:r>
+              <w:rPr>
+                <w:sz w:val="17"/>
+              </w:rPr>
+              <w:t>96,0</w:t>
+            </w:r>
+          </w:p>
+        </w:tc>
+        <w:tc>
+          <w:tcPr>
+            <w:tcW w:type="dxa" w:w="1440"/>
+          </w:tcPr>
+          <w:p>
+            <w:r/>
+            <w:r>
+              <w:rPr>
+                <w:sz w:val="17"/>
+              </w:rPr>
+              <w:t>96,7</w:t>
+            </w:r>
+          </w:p>
+        </w:tc>
+        <w:tc>
+          <w:tcPr>
+            <w:tcW w:type="dxa" w:w="1440"/>
+          </w:tcPr>
+          <w:p>
+            <w:r/>
+            <w:r>
+              <w:rPr>
+                <w:sz w:val="17"/>
+              </w:rPr>
+              <w:t>94,7</w:t>
+            </w:r>
+          </w:p>
+        </w:tc>
+      </w:tr>
+    </w:tbl>
+    <w:p/>
     <w:tbl>
       <w:tblPr>
         <w:tblStyle w:val="LightGrid-Accent1"/>
@@ -1070,6 +2399,7 @@
               <w:rPr>
                 <w:sz w:val="17"/>
               </w:rPr>
+              <w:t>Linear y Quadratic Discriminant</w:t>
             </w:r>
           </w:p>
         </w:tc>
@@ -1083,6 +2413,7 @@
               <w:rPr>
                 <w:sz w:val="17"/>
               </w:rPr>
+              <w:t>98,0 %</w:t>
             </w:r>
           </w:p>
         </w:tc>
@@ -1126,6 +2457,7 @@
               <w:rPr>
                 <w:sz w:val="17"/>
               </w:rPr>
+              <w:t>Linear Discriminant</w:t>
             </w:r>
           </w:p>
         </w:tc>
@@ -1139,6 +2471,7 @@
               <w:rPr>
                 <w:sz w:val="17"/>
               </w:rPr>
+              <w:t>98,0 %</w:t>
             </w:r>
           </w:p>
         </w:tc>
@@ -1182,7 +2515,7 @@
               <w:rPr>
                 <w:sz w:val="17"/>
               </w:rPr>
-              <w:t>igual al anterior</w:t>
+              <w:t>Efficient Linear SVM</w:t>
             </w:r>
           </w:p>
         </w:tc>
@@ -1196,6 +2529,7 @@
               <w:rPr>
                 <w:sz w:val="17"/>
               </w:rPr>
+              <w:t>98,7 %</w:t>
             </w:r>
           </w:p>
         </w:tc>
@@ -1239,6 +2573,7 @@
               <w:rPr>
                 <w:sz w:val="17"/>
               </w:rPr>
+              <w:t>Linear Discriminant, Quadratic Discriminant, Quadratic SVM</w:t>
             </w:r>
           </w:p>
         </w:tc>
@@ -1252,6 +2587,7 @@
               <w:rPr>
                 <w:sz w:val="17"/>
               </w:rPr>
+              <w:t>98,0 %</w:t>
             </w:r>
           </w:p>
         </w:tc>
@@ -1295,6 +2631,7 @@
               <w:rPr>
                 <w:sz w:val="17"/>
               </w:rPr>
+              <w:t>Linear Discriminant</w:t>
             </w:r>
           </w:p>
         </w:tc>
@@ -1308,6 +2645,7 @@
               <w:rPr>
                 <w:sz w:val="17"/>
               </w:rPr>
+              <w:t>98,0 %</w:t>
             </w:r>
           </w:p>
         </w:tc>
@@ -1316,7 +2654,7 @@
     <w:p/>
     <w:p>
       <w:r>
-        <w:t>Dos o tres frases sobre cuál paso ayudó y cuál no.</w:t>
+        <w:t>En Iris ningún paso ayudó de verdad, y eso es lo que había que ver. El dataset viene limpio, balanceado y con las cuatro medidas en la misma escala, así que corregir outliers, balancear y escalar no tenían nada que corregir. El discriminante lineal da 98 % en las cinco versiones. Las subidas y bajadas de las otras filas son de una o dos flores y cambian con solo volver a repartir los pliegues. El único modelo al que sí le importa el escalado es el SVM, que con datos estandarizados sube al 98 %.</w:t>
       </w:r>
     </w:p>
     <w:p>

</xml_diff>

<commit_message>
Taller 1: resultados de Classification Learner para banknote y conclusion de la revision de datos
</commit_message>
<xml_diff>
--- a/Taller 1/Revision_datos.docx
+++ b/Taller 1/Revision_datos.docx
@@ -2883,8 +2883,15 @@
       </w:r>
     </w:p>
     <w:p>
+      <w:pPr>
+        <w:jc w:val="center"/>
+      </w:pPr>
       <w:r>
-        <w:t>[PANTALLAZO Classification Learner con T0_crudo]</w:t>
+        <w:rPr>
+          <w:i/>
+          <w:sz w:val="18"/>
+        </w:rPr>
+        <w:t>Classification Learner con T0_crudo, validación cruzada de 5 pliegues.</w:t>
       </w:r>
     </w:p>
     <w:tbl>
@@ -2942,6 +2949,7 @@
               <w:rPr>
                 <w:sz w:val="17"/>
               </w:rPr>
+              <w:t>Quadratic SVM, Fine Gaussian SVM y Medium Gaussian SVM</w:t>
             </w:r>
           </w:p>
         </w:tc>
@@ -2955,12 +2963,18 @@
               <w:rPr>
                 <w:sz w:val="17"/>
               </w:rPr>
+              <w:t>100 %</w:t>
             </w:r>
           </w:p>
         </w:tc>
       </w:tr>
     </w:tbl>
     <w:p/>
+    <w:p>
+      <w:r>
+        <w:t>Con el dato crudo, sin tocar nada, tres SVM clasifican los 1372 billetes sin un solo error, y los KNN quedan en 99,9 %. El SVM lineal se queda en 98,8 % y el Naive Bayes gaussiano en 84,2 %.</w:t>
+      </w:r>
+    </w:p>
     <w:p>
       <w:pPr>
         <w:pStyle w:val="Heading3"/>
@@ -2971,7 +2985,7 @@
     </w:p>
     <w:p>
       <w:r>
-        <w:t>Regla del 1,5 por rango intercuartil, recortando al borde.</w:t>
+        <w:t>Regla del 1,5 por rango intercuartil, recortando al borde. Se recortan 57 valores de curtosis y 33 de entropía.</w:t>
       </w:r>
     </w:p>
     <w:p>
@@ -3027,7 +3041,216 @@
     </w:p>
     <w:p>
       <w:r>
-        <w:t>[PANTALLAZO Classification Learner con T1_outliers]</w:t>
+        <w:t>No se corrió en la app. Como el crudo ya daba 100 %, se saltó directo a la última versión del dato para ver si el procesamiento completo cambiaba algo.</w:t>
+      </w:r>
+    </w:p>
+    <w:p>
+      <w:pPr>
+        <w:pStyle w:val="Heading3"/>
+      </w:pPr>
+      <w:r>
+        <w:t>2.3 Balanceando las clases</w:t>
+      </w:r>
+    </w:p>
+    <w:p>
+      <w:r>
+        <w:t>Se toman 610 auténticos al azar para igualar a los 610 falsos. Quedan 1220 filas.</w:t>
+      </w:r>
+    </w:p>
+    <w:p>
+      <w:pPr>
+        <w:jc w:val="center"/>
+      </w:pPr>
+      <w:r>
+        <w:drawing>
+          <wp:inline xmlns:a="http://schemas.openxmlformats.org/drawingml/2006/main" xmlns:pic="http://schemas.openxmlformats.org/drawingml/2006/picture">
+            <wp:extent cx="5760720" cy="4244295"/>
+            <wp:docPr id="13" name="Picture 13"/>
+            <wp:cNvGraphicFramePr>
+              <a:graphicFrameLocks noChangeAspect="1"/>
+            </wp:cNvGraphicFramePr>
+            <a:graphic>
+              <a:graphicData uri="http://schemas.openxmlformats.org/drawingml/2006/picture">
+                <pic:pic>
+                  <pic:nvPicPr>
+                    <pic:cNvPr id="0" name="rev_banknote_balance_despues.png"/>
+                    <pic:cNvPicPr/>
+                  </pic:nvPicPr>
+                  <pic:blipFill>
+                    <a:blip r:embed="rId21"/>
+                    <a:stretch>
+                      <a:fillRect/>
+                    </a:stretch>
+                  </pic:blipFill>
+                  <pic:spPr>
+                    <a:xfrm>
+                      <a:off x="0" y="0"/>
+                      <a:ext cx="5760720" cy="4244295"/>
+                    </a:xfrm>
+                    <a:prstGeom prst="rect"/>
+                  </pic:spPr>
+                </pic:pic>
+              </a:graphicData>
+            </a:graphic>
+          </wp:inline>
+        </w:drawing>
+      </w:r>
+    </w:p>
+    <w:p>
+      <w:pPr>
+        <w:jc w:val="center"/>
+      </w:pPr>
+      <w:r>
+        <w:rPr>
+          <w:i/>
+          <w:sz w:val="18"/>
+        </w:rPr>
+        <w:t>610 y 610.</w:t>
+      </w:r>
+    </w:p>
+    <w:p>
+      <w:r>
+        <w:t>No se corrió en la app por la misma razón.</w:t>
+      </w:r>
+    </w:p>
+    <w:p>
+      <w:pPr>
+        <w:pStyle w:val="Heading3"/>
+      </w:pPr>
+      <w:r>
+        <w:t>2.4 Estandarizando</w:t>
+      </w:r>
+    </w:p>
+    <w:p>
+      <w:pPr>
+        <w:jc w:val="center"/>
+      </w:pPr>
+      <w:r>
+        <w:drawing>
+          <wp:inline xmlns:a="http://schemas.openxmlformats.org/drawingml/2006/main" xmlns:pic="http://schemas.openxmlformats.org/drawingml/2006/picture">
+            <wp:extent cx="5760720" cy="3647814"/>
+            <wp:docPr id="14" name="Picture 14"/>
+            <wp:cNvGraphicFramePr>
+              <a:graphicFrameLocks noChangeAspect="1"/>
+            </wp:cNvGraphicFramePr>
+            <a:graphic>
+              <a:graphicData uri="http://schemas.openxmlformats.org/drawingml/2006/picture">
+                <pic:pic>
+                  <pic:nvPicPr>
+                    <pic:cNvPr id="0" name="rev_banknote_boxplot_estandarizado.png"/>
+                    <pic:cNvPicPr/>
+                  </pic:nvPicPr>
+                  <pic:blipFill>
+                    <a:blip r:embed="rId22"/>
+                    <a:stretch>
+                      <a:fillRect/>
+                    </a:stretch>
+                  </pic:blipFill>
+                  <pic:spPr>
+                    <a:xfrm>
+                      <a:off x="0" y="0"/>
+                      <a:ext cx="5760720" cy="3647814"/>
+                    </a:xfrm>
+                    <a:prstGeom prst="rect"/>
+                  </pic:spPr>
+                </pic:pic>
+              </a:graphicData>
+            </a:graphic>
+          </wp:inline>
+        </w:drawing>
+      </w:r>
+    </w:p>
+    <w:p>
+      <w:pPr>
+        <w:jc w:val="center"/>
+      </w:pPr>
+      <w:r>
+        <w:rPr>
+          <w:i/>
+          <w:sz w:val="18"/>
+        </w:rPr>
+        <w:t>Ahora las cuatro se comparan.</w:t>
+      </w:r>
+    </w:p>
+    <w:p>
+      <w:r>
+        <w:t>No se corrió en la app.</w:t>
+      </w:r>
+    </w:p>
+    <w:p>
+      <w:pPr>
+        <w:pStyle w:val="Heading3"/>
+      </w:pPr>
+      <w:r>
+        <w:t>2.5 Normalizando</w:t>
+      </w:r>
+    </w:p>
+    <w:p>
+      <w:r>
+        <w:t>Es el dato con todo el procesamiento encima: sin outliers, balanceado y entre 0 y 1.</w:t>
+      </w:r>
+    </w:p>
+    <w:p>
+      <w:pPr>
+        <w:jc w:val="center"/>
+      </w:pPr>
+      <w:r>
+        <w:drawing>
+          <wp:inline xmlns:a="http://schemas.openxmlformats.org/drawingml/2006/main" xmlns:pic="http://schemas.openxmlformats.org/drawingml/2006/picture">
+            <wp:extent cx="5760720" cy="3676504"/>
+            <wp:docPr id="15" name="Picture 15"/>
+            <wp:cNvGraphicFramePr>
+              <a:graphicFrameLocks noChangeAspect="1"/>
+            </wp:cNvGraphicFramePr>
+            <a:graphic>
+              <a:graphicData uri="http://schemas.openxmlformats.org/drawingml/2006/picture">
+                <pic:pic>
+                  <pic:nvPicPr>
+                    <pic:cNvPr id="0" name="rev_banknote_boxplot_normalizado.png"/>
+                    <pic:cNvPicPr/>
+                  </pic:nvPicPr>
+                  <pic:blipFill>
+                    <a:blip r:embed="rId23"/>
+                    <a:stretch>
+                      <a:fillRect/>
+                    </a:stretch>
+                  </pic:blipFill>
+                  <pic:spPr>
+                    <a:xfrm>
+                      <a:off x="0" y="0"/>
+                      <a:ext cx="5760720" cy="3676504"/>
+                    </a:xfrm>
+                    <a:prstGeom prst="rect"/>
+                  </pic:spPr>
+                </pic:pic>
+              </a:graphicData>
+            </a:graphic>
+          </wp:inline>
+        </w:drawing>
+      </w:r>
+    </w:p>
+    <w:p>
+      <w:pPr>
+        <w:jc w:val="center"/>
+      </w:pPr>
+      <w:r>
+        <w:rPr>
+          <w:i/>
+          <w:sz w:val="18"/>
+        </w:rPr>
+        <w:t>Todo entre 0 y 1.</w:t>
+      </w:r>
+    </w:p>
+    <w:p>
+      <w:pPr>
+        <w:jc w:val="center"/>
+      </w:pPr>
+      <w:r>
+        <w:rPr>
+          <w:i/>
+          <w:sz w:val="18"/>
+        </w:rPr>
+        <w:t>Classification Learner con T4_normalizado, 1220 billetes.</w:t>
       </w:r>
     </w:p>
     <w:tbl>
@@ -3101,6 +3324,7 @@
               <w:rPr>
                 <w:sz w:val="17"/>
               </w:rPr>
+              <w:t>Cubic SVM y Fine Gaussian SVM</w:t>
             </w:r>
           </w:p>
         </w:tc>
@@ -3114,6 +3338,7 @@
               <w:rPr>
                 <w:sz w:val="17"/>
               </w:rPr>
+              <w:t>100 %</w:t>
             </w:r>
           </w:p>
         </w:tc>
@@ -3127,6 +3352,7 @@
               <w:rPr>
                 <w:sz w:val="17"/>
               </w:rPr>
+              <w:t>no</w:t>
             </w:r>
           </w:p>
         </w:tc>
@@ -3134,72 +3360,21 @@
     </w:tbl>
     <w:p/>
     <w:p>
+      <w:r>
+        <w:t>Lo mismo que con el crudo. Cambia cuál SVM llega al 100 % y cuál se queda en 99,9 %, pero eso es un billete de 1220.</w:t>
+      </w:r>
+    </w:p>
+    <w:p>
       <w:pPr>
         <w:pStyle w:val="Heading3"/>
       </w:pPr>
       <w:r>
-        <w:t>2.3 Balanceando las clases</w:t>
+        <w:t>2.6 Qué pasó en banknote</w:t>
       </w:r>
     </w:p>
     <w:p>
       <w:r>
-        <w:t>Se toman 610 auténticos al azar para igualar a los 610 falsos. Quedan 1220 filas.</w:t>
-      </w:r>
-    </w:p>
-    <w:p>
-      <w:pPr>
-        <w:jc w:val="center"/>
-      </w:pPr>
-      <w:r>
-        <w:drawing>
-          <wp:inline xmlns:a="http://schemas.openxmlformats.org/drawingml/2006/main" xmlns:pic="http://schemas.openxmlformats.org/drawingml/2006/picture">
-            <wp:extent cx="5760720" cy="4244295"/>
-            <wp:docPr id="13" name="Picture 13"/>
-            <wp:cNvGraphicFramePr>
-              <a:graphicFrameLocks noChangeAspect="1"/>
-            </wp:cNvGraphicFramePr>
-            <a:graphic>
-              <a:graphicData uri="http://schemas.openxmlformats.org/drawingml/2006/picture">
-                <pic:pic>
-                  <pic:nvPicPr>
-                    <pic:cNvPr id="0" name="rev_banknote_balance_despues.png"/>
-                    <pic:cNvPicPr/>
-                  </pic:nvPicPr>
-                  <pic:blipFill>
-                    <a:blip r:embed="rId21"/>
-                    <a:stretch>
-                      <a:fillRect/>
-                    </a:stretch>
-                  </pic:blipFill>
-                  <pic:spPr>
-                    <a:xfrm>
-                      <a:off x="0" y="0"/>
-                      <a:ext cx="5760720" cy="4244295"/>
-                    </a:xfrm>
-                    <a:prstGeom prst="rect"/>
-                  </pic:spPr>
-                </pic:pic>
-              </a:graphicData>
-            </a:graphic>
-          </wp:inline>
-        </w:drawing>
-      </w:r>
-    </w:p>
-    <w:p>
-      <w:pPr>
-        <w:jc w:val="center"/>
-      </w:pPr>
-      <w:r>
-        <w:rPr>
-          <w:i/>
-          <w:sz w:val="18"/>
-        </w:rPr>
-        <w:t>610 y 610.</w:t>
-      </w:r>
-    </w:p>
-    <w:p>
-      <w:r>
-        <w:t>[PANTALLAZO Classification Learner con T2_balanceado]</w:t>
+        <w:t>Los modelos de la app en los dos pasos que se corrieron, exactitud de validación en %:</w:t>
       </w:r>
     </w:p>
     <w:tbl>
@@ -3227,7 +3402,7 @@
                 <w:b/>
                 <w:sz w:val="17"/>
               </w:rPr>
-              <w:t>Mejor modelo</w:t>
+              <w:t>Modelo</w:t>
             </w:r>
           </w:p>
         </w:tc>
@@ -3242,7 +3417,7 @@
                 <w:b/>
                 <w:sz w:val="17"/>
               </w:rPr>
-              <w:t>Exactitud</w:t>
+              <w:t>T0 crudo (1372)</w:t>
             </w:r>
           </w:p>
         </w:tc>
@@ -3257,7 +3432,7 @@
                 <w:b/>
                 <w:sz w:val="17"/>
               </w:rPr>
-              <w:t>Cambió</w:t>
+              <w:t>T4 procesado (1220)</w:t>
             </w:r>
           </w:p>
         </w:tc>
@@ -3273,6 +3448,7 @@
               <w:rPr>
                 <w:sz w:val="17"/>
               </w:rPr>
+              <w:t>Gaussian Naive Bayes</w:t>
             </w:r>
           </w:p>
         </w:tc>
@@ -3286,6 +3462,7 @@
               <w:rPr>
                 <w:sz w:val="17"/>
               </w:rPr>
+              <w:t>84,2</w:t>
             </w:r>
           </w:p>
         </w:tc>
@@ -3299,132 +3476,7 @@
               <w:rPr>
                 <w:sz w:val="17"/>
               </w:rPr>
-            </w:r>
-          </w:p>
-        </w:tc>
-      </w:tr>
-    </w:tbl>
-    <w:p/>
-    <w:p>
-      <w:pPr>
-        <w:pStyle w:val="Heading3"/>
-      </w:pPr>
-      <w:r>
-        <w:t>2.4 Estandarizando</w:t>
-      </w:r>
-    </w:p>
-    <w:p>
-      <w:pPr>
-        <w:jc w:val="center"/>
-      </w:pPr>
-      <w:r>
-        <w:drawing>
-          <wp:inline xmlns:a="http://schemas.openxmlformats.org/drawingml/2006/main" xmlns:pic="http://schemas.openxmlformats.org/drawingml/2006/picture">
-            <wp:extent cx="5760720" cy="3647814"/>
-            <wp:docPr id="14" name="Picture 14"/>
-            <wp:cNvGraphicFramePr>
-              <a:graphicFrameLocks noChangeAspect="1"/>
-            </wp:cNvGraphicFramePr>
-            <a:graphic>
-              <a:graphicData uri="http://schemas.openxmlformats.org/drawingml/2006/picture">
-                <pic:pic>
-                  <pic:nvPicPr>
-                    <pic:cNvPr id="0" name="rev_banknote_boxplot_estandarizado.png"/>
-                    <pic:cNvPicPr/>
-                  </pic:nvPicPr>
-                  <pic:blipFill>
-                    <a:blip r:embed="rId22"/>
-                    <a:stretch>
-                      <a:fillRect/>
-                    </a:stretch>
-                  </pic:blipFill>
-                  <pic:spPr>
-                    <a:xfrm>
-                      <a:off x="0" y="0"/>
-                      <a:ext cx="5760720" cy="3647814"/>
-                    </a:xfrm>
-                    <a:prstGeom prst="rect"/>
-                  </pic:spPr>
-                </pic:pic>
-              </a:graphicData>
-            </a:graphic>
-          </wp:inline>
-        </w:drawing>
-      </w:r>
-    </w:p>
-    <w:p>
-      <w:pPr>
-        <w:jc w:val="center"/>
-      </w:pPr>
-      <w:r>
-        <w:rPr>
-          <w:i/>
-          <w:sz w:val="18"/>
-        </w:rPr>
-        <w:t>Ahora las cuatro se comparan.</w:t>
-      </w:r>
-    </w:p>
-    <w:p>
-      <w:r>
-        <w:t>[PANTALLAZO Classification Learner con T3_estandarizado]</w:t>
-      </w:r>
-    </w:p>
-    <w:tbl>
-      <w:tblPr>
-        <w:tblStyle w:val="LightGrid-Accent1"/>
-        <w:tblW w:type="auto" w:w="0"/>
-        <w:jc w:val="center"/>
-        <w:tblLayout w:type="autofit"/>
-        <w:tblLook w:firstColumn="1" w:firstRow="1" w:lastColumn="0" w:lastRow="0" w:noHBand="0" w:noVBand="1" w:val="04A0"/>
-      </w:tblPr>
-      <w:tblGrid>
-        <w:gridCol w:w="2880"/>
-        <w:gridCol w:w="2880"/>
-        <w:gridCol w:w="2880"/>
-      </w:tblGrid>
-      <w:tr>
-        <w:tc>
-          <w:tcPr>
-            <w:tcW w:type="dxa" w:w="2880"/>
-          </w:tcPr>
-          <w:p>
-            <w:r/>
-            <w:r>
-              <w:rPr>
-                <w:b/>
-                <w:sz w:val="17"/>
-              </w:rPr>
-              <w:t>Mejor modelo</w:t>
-            </w:r>
-          </w:p>
-        </w:tc>
-        <w:tc>
-          <w:tcPr>
-            <w:tcW w:type="dxa" w:w="2880"/>
-          </w:tcPr>
-          <w:p>
-            <w:r/>
-            <w:r>
-              <w:rPr>
-                <w:b/>
-                <w:sz w:val="17"/>
-              </w:rPr>
-              <w:t>Exactitud</w:t>
-            </w:r>
-          </w:p>
-        </w:tc>
-        <w:tc>
-          <w:tcPr>
-            <w:tcW w:type="dxa" w:w="2880"/>
-          </w:tcPr>
-          <w:p>
-            <w:r/>
-            <w:r>
-              <w:rPr>
-                <w:b/>
-                <w:sz w:val="17"/>
-              </w:rPr>
-              <w:t>Cambió</w:t>
+              <w:t>84,8</w:t>
             </w:r>
           </w:p>
         </w:tc>
@@ -3440,6 +3492,7 @@
               <w:rPr>
                 <w:sz w:val="17"/>
               </w:rPr>
+              <w:t>Kernel Naive Bayes</w:t>
             </w:r>
           </w:p>
         </w:tc>
@@ -3453,6 +3506,7 @@
               <w:rPr>
                 <w:sz w:val="17"/>
               </w:rPr>
+              <w:t>91,6</w:t>
             </w:r>
           </w:p>
         </w:tc>
@@ -3466,132 +3520,7 @@
               <w:rPr>
                 <w:sz w:val="17"/>
               </w:rPr>
-            </w:r>
-          </w:p>
-        </w:tc>
-      </w:tr>
-    </w:tbl>
-    <w:p/>
-    <w:p>
-      <w:pPr>
-        <w:pStyle w:val="Heading3"/>
-      </w:pPr>
-      <w:r>
-        <w:t>2.5 Normalizando</w:t>
-      </w:r>
-    </w:p>
-    <w:p>
-      <w:pPr>
-        <w:jc w:val="center"/>
-      </w:pPr>
-      <w:r>
-        <w:drawing>
-          <wp:inline xmlns:a="http://schemas.openxmlformats.org/drawingml/2006/main" xmlns:pic="http://schemas.openxmlformats.org/drawingml/2006/picture">
-            <wp:extent cx="5760720" cy="3676504"/>
-            <wp:docPr id="15" name="Picture 15"/>
-            <wp:cNvGraphicFramePr>
-              <a:graphicFrameLocks noChangeAspect="1"/>
-            </wp:cNvGraphicFramePr>
-            <a:graphic>
-              <a:graphicData uri="http://schemas.openxmlformats.org/drawingml/2006/picture">
-                <pic:pic>
-                  <pic:nvPicPr>
-                    <pic:cNvPr id="0" name="rev_banknote_boxplot_normalizado.png"/>
-                    <pic:cNvPicPr/>
-                  </pic:nvPicPr>
-                  <pic:blipFill>
-                    <a:blip r:embed="rId23"/>
-                    <a:stretch>
-                      <a:fillRect/>
-                    </a:stretch>
-                  </pic:blipFill>
-                  <pic:spPr>
-                    <a:xfrm>
-                      <a:off x="0" y="0"/>
-                      <a:ext cx="5760720" cy="3676504"/>
-                    </a:xfrm>
-                    <a:prstGeom prst="rect"/>
-                  </pic:spPr>
-                </pic:pic>
-              </a:graphicData>
-            </a:graphic>
-          </wp:inline>
-        </w:drawing>
-      </w:r>
-    </w:p>
-    <w:p>
-      <w:pPr>
-        <w:jc w:val="center"/>
-      </w:pPr>
-      <w:r>
-        <w:rPr>
-          <w:i/>
-          <w:sz w:val="18"/>
-        </w:rPr>
-        <w:t>Todo entre 0 y 1.</w:t>
-      </w:r>
-    </w:p>
-    <w:p>
-      <w:r>
-        <w:t>[PANTALLAZO Classification Learner con T4_normalizado]</w:t>
-      </w:r>
-    </w:p>
-    <w:tbl>
-      <w:tblPr>
-        <w:tblStyle w:val="LightGrid-Accent1"/>
-        <w:tblW w:type="auto" w:w="0"/>
-        <w:jc w:val="center"/>
-        <w:tblLayout w:type="autofit"/>
-        <w:tblLook w:firstColumn="1" w:firstRow="1" w:lastColumn="0" w:lastRow="0" w:noHBand="0" w:noVBand="1" w:val="04A0"/>
-      </w:tblPr>
-      <w:tblGrid>
-        <w:gridCol w:w="2880"/>
-        <w:gridCol w:w="2880"/>
-        <w:gridCol w:w="2880"/>
-      </w:tblGrid>
-      <w:tr>
-        <w:tc>
-          <w:tcPr>
-            <w:tcW w:type="dxa" w:w="2880"/>
-          </w:tcPr>
-          <w:p>
-            <w:r/>
-            <w:r>
-              <w:rPr>
-                <w:b/>
-                <w:sz w:val="17"/>
-              </w:rPr>
-              <w:t>Mejor modelo</w:t>
-            </w:r>
-          </w:p>
-        </w:tc>
-        <w:tc>
-          <w:tcPr>
-            <w:tcW w:type="dxa" w:w="2880"/>
-          </w:tcPr>
-          <w:p>
-            <w:r/>
-            <w:r>
-              <w:rPr>
-                <w:b/>
-                <w:sz w:val="17"/>
-              </w:rPr>
-              <w:t>Exactitud</w:t>
-            </w:r>
-          </w:p>
-        </w:tc>
-        <w:tc>
-          <w:tcPr>
-            <w:tcW w:type="dxa" w:w="2880"/>
-          </w:tcPr>
-          <w:p>
-            <w:r/>
-            <w:r>
-              <w:rPr>
-                <w:b/>
-                <w:sz w:val="17"/>
-              </w:rPr>
-              <w:t>Cambió</w:t>
+              <w:t>92,4</w:t>
             </w:r>
           </w:p>
         </w:tc>
@@ -3607,6 +3536,7 @@
               <w:rPr>
                 <w:sz w:val="17"/>
               </w:rPr>
+              <w:t>Linear SVM</w:t>
             </w:r>
           </w:p>
         </w:tc>
@@ -3620,6 +3550,7 @@
               <w:rPr>
                 <w:sz w:val="17"/>
               </w:rPr>
+              <w:t>98,8</w:t>
             </w:r>
           </w:p>
         </w:tc>
@@ -3633,92 +3564,7 @@
               <w:rPr>
                 <w:sz w:val="17"/>
               </w:rPr>
-            </w:r>
-          </w:p>
-        </w:tc>
-      </w:tr>
-    </w:tbl>
-    <w:p/>
-    <w:p>
-      <w:pPr>
-        <w:pStyle w:val="Heading3"/>
-      </w:pPr>
-      <w:r>
-        <w:t>2.6 Qué pasó en banknote</w:t>
-      </w:r>
-    </w:p>
-    <w:tbl>
-      <w:tblPr>
-        <w:tblStyle w:val="LightGrid-Accent1"/>
-        <w:tblW w:type="auto" w:w="0"/>
-        <w:jc w:val="center"/>
-        <w:tblLayout w:type="autofit"/>
-        <w:tblLook w:firstColumn="1" w:firstRow="1" w:lastColumn="0" w:lastRow="0" w:noHBand="0" w:noVBand="1" w:val="04A0"/>
-      </w:tblPr>
-      <w:tblGrid>
-        <w:gridCol w:w="2160"/>
-        <w:gridCol w:w="2160"/>
-        <w:gridCol w:w="2160"/>
-        <w:gridCol w:w="2160"/>
-      </w:tblGrid>
-      <w:tr>
-        <w:tc>
-          <w:tcPr>
-            <w:tcW w:type="dxa" w:w="2160"/>
-          </w:tcPr>
-          <w:p>
-            <w:r/>
-            <w:r>
-              <w:rPr>
-                <w:b/>
-                <w:sz w:val="17"/>
-              </w:rPr>
-              <w:t>Paso</w:t>
-            </w:r>
-          </w:p>
-        </w:tc>
-        <w:tc>
-          <w:tcPr>
-            <w:tcW w:type="dxa" w:w="2160"/>
-          </w:tcPr>
-          <w:p>
-            <w:r/>
-            <w:r>
-              <w:rPr>
-                <w:b/>
-                <w:sz w:val="17"/>
-              </w:rPr>
-              <w:t>Filas</w:t>
-            </w:r>
-          </w:p>
-        </w:tc>
-        <w:tc>
-          <w:tcPr>
-            <w:tcW w:type="dxa" w:w="2160"/>
-          </w:tcPr>
-          <w:p>
-            <w:r/>
-            <w:r>
-              <w:rPr>
-                <w:b/>
-                <w:sz w:val="17"/>
-              </w:rPr>
-              <w:t>Mejor modelo</w:t>
-            </w:r>
-          </w:p>
-        </w:tc>
-        <w:tc>
-          <w:tcPr>
-            <w:tcW w:type="dxa" w:w="2160"/>
-          </w:tcPr>
-          <w:p>
-            <w:r/>
-            <w:r>
-              <w:rPr>
-                <w:b/>
-                <w:sz w:val="17"/>
-              </w:rPr>
-              <w:t>Exactitud</w:t>
+              <w:t>98,8</w:t>
             </w:r>
           </w:p>
         </w:tc>
@@ -3726,7 +3572,7 @@
       <w:tr>
         <w:tc>
           <w:tcPr>
-            <w:tcW w:type="dxa" w:w="2160"/>
+            <w:tcW w:type="dxa" w:w="2880"/>
           </w:tcPr>
           <w:p>
             <w:r/>
@@ -3734,13 +3580,13 @@
               <w:rPr>
                 <w:sz w:val="17"/>
               </w:rPr>
-              <w:t>Crudo</w:t>
+              <w:t>Quadratic SVM</w:t>
             </w:r>
           </w:p>
         </w:tc>
         <w:tc>
           <w:tcPr>
-            <w:tcW w:type="dxa" w:w="2160"/>
+            <w:tcW w:type="dxa" w:w="2880"/>
           </w:tcPr>
           <w:p>
             <w:r/>
@@ -3748,13 +3594,13 @@
               <w:rPr>
                 <w:sz w:val="17"/>
               </w:rPr>
-              <w:t>1372</w:t>
+              <w:t>100</w:t>
             </w:r>
           </w:p>
         </w:tc>
         <w:tc>
           <w:tcPr>
-            <w:tcW w:type="dxa" w:w="2160"/>
+            <w:tcW w:type="dxa" w:w="2880"/>
           </w:tcPr>
           <w:p>
             <w:r/>
@@ -3762,12 +3608,15 @@
               <w:rPr>
                 <w:sz w:val="17"/>
               </w:rPr>
+              <w:t>99,9</w:t>
             </w:r>
           </w:p>
         </w:tc>
+      </w:tr>
+      <w:tr>
         <w:tc>
           <w:tcPr>
-            <w:tcW w:type="dxa" w:w="2160"/>
+            <w:tcW w:type="dxa" w:w="2880"/>
           </w:tcPr>
           <w:p>
             <w:r/>
@@ -3775,6 +3624,35 @@
               <w:rPr>
                 <w:sz w:val="17"/>
               </w:rPr>
+              <w:t>Cubic SVM</w:t>
+            </w:r>
+          </w:p>
+        </w:tc>
+        <w:tc>
+          <w:tcPr>
+            <w:tcW w:type="dxa" w:w="2880"/>
+          </w:tcPr>
+          <w:p>
+            <w:r/>
+            <w:r>
+              <w:rPr>
+                <w:sz w:val="17"/>
+              </w:rPr>
+              <w:t>99,9</w:t>
+            </w:r>
+          </w:p>
+        </w:tc>
+        <w:tc>
+          <w:tcPr>
+            <w:tcW w:type="dxa" w:w="2880"/>
+          </w:tcPr>
+          <w:p>
+            <w:r/>
+            <w:r>
+              <w:rPr>
+                <w:sz w:val="17"/>
+              </w:rPr>
+              <w:t>100</w:t>
             </w:r>
           </w:p>
         </w:tc>
@@ -3782,7 +3660,7 @@
       <w:tr>
         <w:tc>
           <w:tcPr>
-            <w:tcW w:type="dxa" w:w="2160"/>
+            <w:tcW w:type="dxa" w:w="2880"/>
           </w:tcPr>
           <w:p>
             <w:r/>
@@ -3790,13 +3668,13 @@
               <w:rPr>
                 <w:sz w:val="17"/>
               </w:rPr>
-              <w:t>Sin outliers</w:t>
+              <w:t>Fine Gaussian SVM</w:t>
             </w:r>
           </w:p>
         </w:tc>
         <w:tc>
           <w:tcPr>
-            <w:tcW w:type="dxa" w:w="2160"/>
+            <w:tcW w:type="dxa" w:w="2880"/>
           </w:tcPr>
           <w:p>
             <w:r/>
@@ -3804,13 +3682,13 @@
               <w:rPr>
                 <w:sz w:val="17"/>
               </w:rPr>
-              <w:t>1372</w:t>
+              <w:t>100</w:t>
             </w:r>
           </w:p>
         </w:tc>
         <w:tc>
           <w:tcPr>
-            <w:tcW w:type="dxa" w:w="2160"/>
+            <w:tcW w:type="dxa" w:w="2880"/>
           </w:tcPr>
           <w:p>
             <w:r/>
@@ -3818,12 +3696,15 @@
               <w:rPr>
                 <w:sz w:val="17"/>
               </w:rPr>
+              <w:t>100</w:t>
             </w:r>
           </w:p>
         </w:tc>
+      </w:tr>
+      <w:tr>
         <w:tc>
           <w:tcPr>
-            <w:tcW w:type="dxa" w:w="2160"/>
+            <w:tcW w:type="dxa" w:w="2880"/>
           </w:tcPr>
           <w:p>
             <w:r/>
@@ -3831,6 +3712,35 @@
               <w:rPr>
                 <w:sz w:val="17"/>
               </w:rPr>
+              <w:t>Medium Gaussian SVM</w:t>
+            </w:r>
+          </w:p>
+        </w:tc>
+        <w:tc>
+          <w:tcPr>
+            <w:tcW w:type="dxa" w:w="2880"/>
+          </w:tcPr>
+          <w:p>
+            <w:r/>
+            <w:r>
+              <w:rPr>
+                <w:sz w:val="17"/>
+              </w:rPr>
+              <w:t>100</w:t>
+            </w:r>
+          </w:p>
+        </w:tc>
+        <w:tc>
+          <w:tcPr>
+            <w:tcW w:type="dxa" w:w="2880"/>
+          </w:tcPr>
+          <w:p>
+            <w:r/>
+            <w:r>
+              <w:rPr>
+                <w:sz w:val="17"/>
+              </w:rPr>
+              <w:t>99,8</w:t>
             </w:r>
           </w:p>
         </w:tc>
@@ -3838,7 +3748,7 @@
       <w:tr>
         <w:tc>
           <w:tcPr>
-            <w:tcW w:type="dxa" w:w="2160"/>
+            <w:tcW w:type="dxa" w:w="2880"/>
           </w:tcPr>
           <w:p>
             <w:r/>
@@ -3846,13 +3756,13 @@
               <w:rPr>
                 <w:sz w:val="17"/>
               </w:rPr>
-              <w:t>Balanceado</w:t>
+              <w:t>Coarse Gaussian SVM</w:t>
             </w:r>
           </w:p>
         </w:tc>
         <w:tc>
           <w:tcPr>
-            <w:tcW w:type="dxa" w:w="2160"/>
+            <w:tcW w:type="dxa" w:w="2880"/>
           </w:tcPr>
           <w:p>
             <w:r/>
@@ -3860,13 +3770,13 @@
               <w:rPr>
                 <w:sz w:val="17"/>
               </w:rPr>
-              <w:t>1220</w:t>
+              <w:t>97,9</w:t>
             </w:r>
           </w:p>
         </w:tc>
         <w:tc>
           <w:tcPr>
-            <w:tcW w:type="dxa" w:w="2160"/>
+            <w:tcW w:type="dxa" w:w="2880"/>
           </w:tcPr>
           <w:p>
             <w:r/>
@@ -3874,12 +3784,15 @@
               <w:rPr>
                 <w:sz w:val="17"/>
               </w:rPr>
+              <w:t>97,5</w:t>
             </w:r>
           </w:p>
         </w:tc>
+      </w:tr>
+      <w:tr>
         <w:tc>
           <w:tcPr>
-            <w:tcW w:type="dxa" w:w="2160"/>
+            <w:tcW w:type="dxa" w:w="2880"/>
           </w:tcPr>
           <w:p>
             <w:r/>
@@ -3887,6 +3800,35 @@
               <w:rPr>
                 <w:sz w:val="17"/>
               </w:rPr>
+              <w:t>Fine KNN</w:t>
+            </w:r>
+          </w:p>
+        </w:tc>
+        <w:tc>
+          <w:tcPr>
+            <w:tcW w:type="dxa" w:w="2880"/>
+          </w:tcPr>
+          <w:p>
+            <w:r/>
+            <w:r>
+              <w:rPr>
+                <w:sz w:val="17"/>
+              </w:rPr>
+              <w:t>99,9</w:t>
+            </w:r>
+          </w:p>
+        </w:tc>
+        <w:tc>
+          <w:tcPr>
+            <w:tcW w:type="dxa" w:w="2880"/>
+          </w:tcPr>
+          <w:p>
+            <w:r/>
+            <w:r>
+              <w:rPr>
+                <w:sz w:val="17"/>
+              </w:rPr>
+              <w:t>99,8</w:t>
             </w:r>
           </w:p>
         </w:tc>
@@ -3894,7 +3836,7 @@
       <w:tr>
         <w:tc>
           <w:tcPr>
-            <w:tcW w:type="dxa" w:w="2160"/>
+            <w:tcW w:type="dxa" w:w="2880"/>
           </w:tcPr>
           <w:p>
             <w:r/>
@@ -3902,13 +3844,13 @@
               <w:rPr>
                 <w:sz w:val="17"/>
               </w:rPr>
-              <w:t>Estandarizado</w:t>
+              <w:t>Medium KNN</w:t>
             </w:r>
           </w:p>
         </w:tc>
         <w:tc>
           <w:tcPr>
-            <w:tcW w:type="dxa" w:w="2160"/>
+            <w:tcW w:type="dxa" w:w="2880"/>
           </w:tcPr>
           <w:p>
             <w:r/>
@@ -3916,13 +3858,13 @@
               <w:rPr>
                 <w:sz w:val="17"/>
               </w:rPr>
-              <w:t>1220</w:t>
+              <w:t>99,9</w:t>
             </w:r>
           </w:p>
         </w:tc>
         <w:tc>
           <w:tcPr>
-            <w:tcW w:type="dxa" w:w="2160"/>
+            <w:tcW w:type="dxa" w:w="2880"/>
           </w:tcPr>
           <w:p>
             <w:r/>
@@ -3930,12 +3872,15 @@
               <w:rPr>
                 <w:sz w:val="17"/>
               </w:rPr>
+              <w:t>99,7</w:t>
             </w:r>
           </w:p>
         </w:tc>
+      </w:tr>
+      <w:tr>
         <w:tc>
           <w:tcPr>
-            <w:tcW w:type="dxa" w:w="2160"/>
+            <w:tcW w:type="dxa" w:w="2880"/>
           </w:tcPr>
           <w:p>
             <w:r/>
@@ -3943,6 +3888,35 @@
               <w:rPr>
                 <w:sz w:val="17"/>
               </w:rPr>
+              <w:t>Coarse KNN</w:t>
+            </w:r>
+          </w:p>
+        </w:tc>
+        <w:tc>
+          <w:tcPr>
+            <w:tcW w:type="dxa" w:w="2880"/>
+          </w:tcPr>
+          <w:p>
+            <w:r/>
+            <w:r>
+              <w:rPr>
+                <w:sz w:val="17"/>
+              </w:rPr>
+              <w:t>97,3</w:t>
+            </w:r>
+          </w:p>
+        </w:tc>
+        <w:tc>
+          <w:tcPr>
+            <w:tcW w:type="dxa" w:w="2880"/>
+          </w:tcPr>
+          <w:p>
+            <w:r/>
+            <w:r>
+              <w:rPr>
+                <w:sz w:val="17"/>
+              </w:rPr>
+              <w:t>97,5</w:t>
             </w:r>
           </w:p>
         </w:tc>
@@ -3950,7 +3924,7 @@
       <w:tr>
         <w:tc>
           <w:tcPr>
-            <w:tcW w:type="dxa" w:w="2160"/>
+            <w:tcW w:type="dxa" w:w="2880"/>
           </w:tcPr>
           <w:p>
             <w:r/>
@@ -3958,13 +3932,13 @@
               <w:rPr>
                 <w:sz w:val="17"/>
               </w:rPr>
-              <w:t>Normalizado</w:t>
+              <w:t>Cosine KNN</w:t>
             </w:r>
           </w:p>
         </w:tc>
         <w:tc>
           <w:tcPr>
-            <w:tcW w:type="dxa" w:w="2160"/>
+            <w:tcW w:type="dxa" w:w="2880"/>
           </w:tcPr>
           <w:p>
             <w:r/>
@@ -3972,13 +3946,13 @@
               <w:rPr>
                 <w:sz w:val="17"/>
               </w:rPr>
-              <w:t>1220</w:t>
+              <w:t>98,8</w:t>
             </w:r>
           </w:p>
         </w:tc>
         <w:tc>
           <w:tcPr>
-            <w:tcW w:type="dxa" w:w="2160"/>
+            <w:tcW w:type="dxa" w:w="2880"/>
           </w:tcPr>
           <w:p>
             <w:r/>
@@ -3986,19 +3960,7 @@
               <w:rPr>
                 <w:sz w:val="17"/>
               </w:rPr>
-            </w:r>
-          </w:p>
-        </w:tc>
-        <w:tc>
-          <w:tcPr>
-            <w:tcW w:type="dxa" w:w="2160"/>
-          </w:tcPr>
-          <w:p>
-            <w:r/>
-            <w:r>
-              <w:rPr>
-                <w:sz w:val="17"/>
-              </w:rPr>
+              <w:t>99,1</w:t>
             </w:r>
           </w:p>
         </w:tc>
@@ -4007,7 +3969,33 @@
     <w:p/>
     <w:p>
       <w:r>
-        <w:t>Dos o tres frases.</w:t>
+        <w:rPr>
+          <w:b/>
+        </w:rPr>
+        <w:t>Por qué da 100 % con el dato crudo y también con el procesado.</w:t>
+      </w:r>
+      <w:r>
+        <w:t xml:space="preserve"> Hay dos preguntas distintas mezcladas aquí.</w:t>
+      </w:r>
+    </w:p>
+    <w:p>
+      <w:r>
+        <w:t>La primera es si las clases son linealmente separables, o sea si existe un plano que deje todos los auténticos de un lado y todos los falsos del otro. La respuesta es que casi, pero no del todo. El SVM lineal, que es el modelo que busca exactamente ese plano, se queda en 98,8 %: hay alrededor de 16 billetes que quedan del lado equivocado de cualquier plano. Eso coincide con lo que pasó en el taller con el perceptrón, que nunca convergió en 200 épocas sobre este dataset aunque acertara el 98 o 99 %. Si fueran linealmente separables el perceptrón tendría que haber convergido, por el teorema de convergencia.</w:t>
+      </w:r>
+    </w:p>
+    <w:p>
+      <w:r>
+        <w:t>La segunda es si las clases se pueden separar con una frontera curva. Ahí la respuesta es sí, y limpiamente. El SVM cuadrático, el cúbico y el gaussiano llegan al 100 %, y los KNN al 99,9 %. Eso quiere decir que las dos clases no se traslapan en ninguna parte del espacio de las cuatro variables: no hay billetes auténticos y falsos con los mismos valores. Lo único que pasa es que la frontera que los separa tiene una curva que un plano no puede seguir. Se ve en la dispersión de varianza contra asimetría de la sección 2.1: las dos nubes están separadas pero la línea que las divide no es recta.</w:t>
+      </w:r>
+    </w:p>
+    <w:p>
+      <w:r>
+        <w:t>Por eso el procesamiento no cambia nada. Quitar outliers recortando al borde no mueve ningún billete al otro lado de la frontera. Balancear quita 152 auténticos al azar, y una clase con 610 en vez de 762 sigue siendo la misma nube. Y escalar tampoco importa para el resultado, por una razón práctica: Classification Learner estandariza las entradas por defecto antes de entrenar los SVM y los KNN, así que a esos modelos les llega el dato ya escalado aunque uno le pase el crudo. Los únicos que sí ven el dato tal cual son los Naive Bayes, y son justamente los que peor van, 84 y 92 %, porque asumen que cada variable es una campana y las cuatro tienen colas largas.</w:t>
+      </w:r>
+    </w:p>
+    <w:p>
+      <w:r>
+        <w:t>En resumen: banknote no es linealmente separable, pero sí es separable, y con una frontera curva cualquier modelo flexible lo resuelve completo con el dato crudo. El preprocesamiento no tenía nada que arreglar.</w:t>
       </w:r>
     </w:p>
     <w:p>
@@ -4020,7 +4008,7 @@
     </w:p>
     <w:p>
       <w:r>
-        <w:t>Qué paso sirvió más en cada dataset y por qué. Un párrafo.</w:t>
+        <w:t>En ninguno de los dos datasets el preprocesamiento mejoró el mejor modelo, y eso es lo que había que aprender de esta revisión. Iris viene balanceado, en una sola escala y casi separable: el discriminante lineal da 98 % con las cinco versiones del dato y los 3 errores son flores de la frontera entre versicolor y virginica que ningún paso puede mover. Banknote tiene escalas distintas y un desbalance suave, pero las clases no se traslapan, así que un SVM con kernel llega al 100 % con el dato crudo y con el procesado. Lo que sí se vio en los dos es qué modelos dependen de la escala y cuáles no: discriminantes y árboles no la notan, los SVM sí, y la app se la corrige sola. Corregir outliers, balancear y escalar son pasos que hay que hacer cuando el dato lo necesita; estos dos no lo necesitaban, y la forma de saberlo fue mirar las gráficas antes de correr nada.</w:t>
       </w:r>
     </w:p>
     <w:sectPr>

</xml_diff>

<commit_message>
Taller 1: revision editorial del informe IEEE y de la revision de datos. Se recorta el informe, se corrigen inconsistencias entre texto y tablas, se agregan referencias de marco y se unifica el registro
</commit_message>
<xml_diff>
--- a/Taller 1/Revision_datos.docx
+++ b/Taller 1/Revision_datos.docx
@@ -7,17 +7,17 @@
         <w:pStyle w:val="Heading1"/>
       </w:pPr>
       <w:r>
-        <w:t>Taller 1. Revisión de los datos antes de la red</w:t>
+        <w:t>Taller 1. Revisión de los datos y su efecto sobre el perceptrón y el Adaline</w:t>
       </w:r>
     </w:p>
     <w:p>
       <w:r>
-        <w:t>Inteligencia Computacional. Datasets del taller: Iris y banknote.</w:t>
+        <w:t>Inteligencia Computacional. El taller trabaja sobre dos conjuntos de datos, Iris y banknote.</w:t>
       </w:r>
     </w:p>
     <w:p>
       <w:r>
-        <w:t xml:space="preserve">Antes de entrenar el perceptrón y el Adaline hay que mirar con qué datos se va a trabajar. Para cada dataset se hace lo mismo: se mira el dato crudo, se corrige por pasos, y después de cada paso se entrenan todos los modelos de Classification Learner para ver si mejoran. Los scripts </w:t>
+        <w:t xml:space="preserve">Antes de entrenar la neurona se examina el conjunto de datos con el que se va a trabajar. El procedimiento es el mismo para los dos. Se observa el dato crudo, se corrige por pasos sucesivos, y sobre cada versión resultante se entrena el perceptrón y el Adaline del taller, con el fin de determinar qué paso del procesamiento beneficia a la red y cuál resulta indiferente. Los scripts </w:t>
       </w:r>
       <w:r>
         <w:rPr>
@@ -25,7 +25,7 @@
           <w:color w:val="A03030"/>
           <w:sz w:val="18"/>
         </w:rPr>
-        <w:t>R1_revision_iris.mlx</w:t>
+        <w:t>R1_revision_iris.m</w:t>
       </w:r>
       <w:r>
         <w:t xml:space="preserve"> y </w:t>
@@ -36,10 +36,10 @@
           <w:color w:val="A03030"/>
           <w:sz w:val="18"/>
         </w:rPr>
-        <w:t>R2_revision_banknote.mlx</w:t>
+        <w:t>R2_revision_banknote.m</w:t>
       </w:r>
       <w:r>
-        <w:t xml:space="preserve"> dejan en el workspace una tabla por paso: </w:t>
+        <w:t xml:space="preserve"> realizan la revisión y producen cinco tablas, </w:t>
       </w:r>
       <w:r>
         <w:rPr>
@@ -94,7 +94,18 @@
         <w:t>T4_normalizado</w:t>
       </w:r>
       <w:r>
-        <w:t>.</w:t>
+        <w:t xml:space="preserve">. El script </w:t>
+      </w:r>
+      <w:r>
+        <w:rPr>
+          <w:rFonts w:ascii="Consolas" w:hAnsi="Consolas"/>
+          <w:color w:val="A03030"/>
+          <w:sz w:val="18"/>
+        </w:rPr>
+        <w:t>R3_modelos_por_paso.m</w:t>
+      </w:r>
+      <w:r>
+        <w:t xml:space="preserve"> entrena los dos modelos sobre cada una de ellas. La partición en 70 por ciento de entrenamiento y 30 por ciento de prueba se genera con la semilla 2021 y los pesos iniciales de ambos modelos con la semilla 1, de manera que todos los pasos se comparan sobre la misma división y el mismo punto de partida. El perceptrón emplea la regla 3, factor de aprendizaje 0,1, umbral cero, salida codificada en menos uno y uno, y un tope de 200 épocas. El Adaline emplea factor de aprendizaje 0,01, umbral de clasificación 0,5, salida codificada en cero y uno, y un tope de 500 épocas. En las tablas, una cifra de épocas igual al tope indica que el entrenamiento no se detuvo por su propio criterio.</w:t>
       </w:r>
     </w:p>
     <w:p>
@@ -102,12 +113,30 @@
         <w:pStyle w:val="Heading2"/>
       </w:pPr>
       <w:r>
-        <w:t>1. Iris</w:t>
+        <w:t>1. Los pasos de corrección</w:t>
       </w:r>
     </w:p>
     <w:p>
       <w:r>
-        <w:t>150 flores, cuatro medidas en centímetros (largo y ancho del sépalo, largo y ancho del pétalo) y la especie: setosa, versicolor o virginica.</w:t>
+        <w:t>Sobre el dato crudo se aplican cuatro correcciones. La corrección de atípicos identifica los valores que se alejan más de 1,5 veces el rango intercuartil por debajo del primer cuartil o por encima del tercero, siguiendo el criterio propuesto por Tukey para el diagrama de caja (Tukey, 1977), y los recorta al borde de ese intervalo en lugar de eliminar la fila, con el fin de que un valor extremo aislado no arrastre las correcciones de peso. El balanceo iguala el número de casos de cada clase para que la neurona no aprenda a favorecer la clase mayoritaria por simple frecuencia. La estandarización lleva cada variable a media cero y desviación uno, y la normalización la reescala al intervalo de cero a uno. Estas dos últimas persiguen el mismo objetivo, que ninguna variable domine el ajuste solo por estar medida en una escala mayor, y por eso se aplican como alternativas y no de forma sucesiva, ambas partiendo del dato balanceado. Centrar las entradas y llevarlas a una dispersión comparable es una recomendación establecida para acelerar la convergencia del entrenamiento por descenso de gradiente (LeCun et al., 1998).</w:t>
+      </w:r>
+    </w:p>
+    <w:p>
+      <w:r>
+        <w:t>El escalado se calculó sobre el conjunto completo antes de separar entrenamiento y prueba, de modo que las medias y los rangos empleados incorporan también las filas de prueba. En un montaje riguroso esos parámetros se estiman solo con el conjunto de entrenamiento, y se deja constancia de la diferencia porque el objetivo aquí es comparar el efecto de cada paso y no estimar el desempeño con la mayor fidelidad posible.</w:t>
+      </w:r>
+    </w:p>
+    <w:p>
+      <w:pPr>
+        <w:pStyle w:val="Heading2"/>
+      </w:pPr>
+      <w:r>
+        <w:t>2. Iris</w:t>
+      </w:r>
+    </w:p>
+    <w:p>
+      <w:r>
+        <w:t>150 flores, cuatro medidas en centímetros (largo y ancho del sépalo, largo y ancho del pétalo) y la especie, que puede ser setosa, versicolor o virginica.</w:t>
       </w:r>
     </w:p>
     <w:p>
@@ -115,7 +144,466 @@
         <w:pStyle w:val="Heading3"/>
       </w:pPr>
       <w:r>
-        <w:t>1.1 Dato crudo</w:t>
+        <w:t>2.1 Cómo viene el dato</w:t>
+      </w:r>
+    </w:p>
+    <w:tbl>
+      <w:tblPr>
+        <w:tblStyle w:val="LightGrid-Accent1"/>
+        <w:tblW w:type="auto" w:w="0"/>
+        <w:jc w:val="center"/>
+        <w:tblLayout w:type="autofit"/>
+        <w:tblLook w:firstColumn="1" w:firstRow="1" w:lastColumn="0" w:lastRow="0" w:noHBand="0" w:noVBand="1" w:val="04A0"/>
+      </w:tblPr>
+      <w:tblGrid>
+        <w:gridCol w:w="1440"/>
+        <w:gridCol w:w="1440"/>
+        <w:gridCol w:w="1440"/>
+        <w:gridCol w:w="1440"/>
+        <w:gridCol w:w="1440"/>
+        <w:gridCol w:w="1440"/>
+      </w:tblGrid>
+      <w:tr>
+        <w:tc>
+          <w:tcPr>
+            <w:tcW w:type="dxa" w:w="1440"/>
+          </w:tcPr>
+          <w:p>
+            <w:r/>
+            <w:r>
+              <w:rPr>
+                <w:b/>
+                <w:sz w:val="17"/>
+              </w:rPr>
+              <w:t>Variable</w:t>
+            </w:r>
+          </w:p>
+        </w:tc>
+        <w:tc>
+          <w:tcPr>
+            <w:tcW w:type="dxa" w:w="1440"/>
+          </w:tcPr>
+          <w:p>
+            <w:r/>
+            <w:r>
+              <w:rPr>
+                <w:b/>
+                <w:sz w:val="17"/>
+              </w:rPr>
+              <w:t>Mínimo</w:t>
+            </w:r>
+          </w:p>
+        </w:tc>
+        <w:tc>
+          <w:tcPr>
+            <w:tcW w:type="dxa" w:w="1440"/>
+          </w:tcPr>
+          <w:p>
+            <w:r/>
+            <w:r>
+              <w:rPr>
+                <w:b/>
+                <w:sz w:val="17"/>
+              </w:rPr>
+              <w:t>Máximo</w:t>
+            </w:r>
+          </w:p>
+        </w:tc>
+        <w:tc>
+          <w:tcPr>
+            <w:tcW w:type="dxa" w:w="1440"/>
+          </w:tcPr>
+          <w:p>
+            <w:r/>
+            <w:r>
+              <w:rPr>
+                <w:b/>
+                <w:sz w:val="17"/>
+              </w:rPr>
+              <w:t>Media</w:t>
+            </w:r>
+          </w:p>
+        </w:tc>
+        <w:tc>
+          <w:tcPr>
+            <w:tcW w:type="dxa" w:w="1440"/>
+          </w:tcPr>
+          <w:p>
+            <w:r/>
+            <w:r>
+              <w:rPr>
+                <w:b/>
+                <w:sz w:val="17"/>
+              </w:rPr>
+              <w:t>Desviación</w:t>
+            </w:r>
+          </w:p>
+        </w:tc>
+        <w:tc>
+          <w:tcPr>
+            <w:tcW w:type="dxa" w:w="1440"/>
+          </w:tcPr>
+          <w:p>
+            <w:r/>
+            <w:r>
+              <w:rPr>
+                <w:b/>
+                <w:sz w:val="17"/>
+              </w:rPr>
+              <w:t>Valores fuera de 1,5 RIC</w:t>
+            </w:r>
+          </w:p>
+        </w:tc>
+      </w:tr>
+      <w:tr>
+        <w:tc>
+          <w:tcPr>
+            <w:tcW w:type="dxa" w:w="1440"/>
+          </w:tcPr>
+          <w:p>
+            <w:r/>
+            <w:r>
+              <w:rPr>
+                <w:sz w:val="17"/>
+              </w:rPr>
+              <w:t>largo del sépalo</w:t>
+            </w:r>
+          </w:p>
+        </w:tc>
+        <w:tc>
+          <w:tcPr>
+            <w:tcW w:type="dxa" w:w="1440"/>
+          </w:tcPr>
+          <w:p>
+            <w:r/>
+            <w:r>
+              <w:rPr>
+                <w:sz w:val="17"/>
+              </w:rPr>
+              <w:t>4,30</w:t>
+            </w:r>
+          </w:p>
+        </w:tc>
+        <w:tc>
+          <w:tcPr>
+            <w:tcW w:type="dxa" w:w="1440"/>
+          </w:tcPr>
+          <w:p>
+            <w:r/>
+            <w:r>
+              <w:rPr>
+                <w:sz w:val="17"/>
+              </w:rPr>
+              <w:t>7,90</w:t>
+            </w:r>
+          </w:p>
+        </w:tc>
+        <w:tc>
+          <w:tcPr>
+            <w:tcW w:type="dxa" w:w="1440"/>
+          </w:tcPr>
+          <w:p>
+            <w:r/>
+            <w:r>
+              <w:rPr>
+                <w:sz w:val="17"/>
+              </w:rPr>
+              <w:t>5,84</w:t>
+            </w:r>
+          </w:p>
+        </w:tc>
+        <w:tc>
+          <w:tcPr>
+            <w:tcW w:type="dxa" w:w="1440"/>
+          </w:tcPr>
+          <w:p>
+            <w:r/>
+            <w:r>
+              <w:rPr>
+                <w:sz w:val="17"/>
+              </w:rPr>
+              <w:t>0,83</w:t>
+            </w:r>
+          </w:p>
+        </w:tc>
+        <w:tc>
+          <w:tcPr>
+            <w:tcW w:type="dxa" w:w="1440"/>
+          </w:tcPr>
+          <w:p>
+            <w:r/>
+            <w:r>
+              <w:rPr>
+                <w:sz w:val="17"/>
+              </w:rPr>
+              <w:t>0</w:t>
+            </w:r>
+          </w:p>
+        </w:tc>
+      </w:tr>
+      <w:tr>
+        <w:tc>
+          <w:tcPr>
+            <w:tcW w:type="dxa" w:w="1440"/>
+          </w:tcPr>
+          <w:p>
+            <w:r/>
+            <w:r>
+              <w:rPr>
+                <w:sz w:val="17"/>
+              </w:rPr>
+              <w:t>ancho del sépalo</w:t>
+            </w:r>
+          </w:p>
+        </w:tc>
+        <w:tc>
+          <w:tcPr>
+            <w:tcW w:type="dxa" w:w="1440"/>
+          </w:tcPr>
+          <w:p>
+            <w:r/>
+            <w:r>
+              <w:rPr>
+                <w:sz w:val="17"/>
+              </w:rPr>
+              <w:t>2,00</w:t>
+            </w:r>
+          </w:p>
+        </w:tc>
+        <w:tc>
+          <w:tcPr>
+            <w:tcW w:type="dxa" w:w="1440"/>
+          </w:tcPr>
+          <w:p>
+            <w:r/>
+            <w:r>
+              <w:rPr>
+                <w:sz w:val="17"/>
+              </w:rPr>
+              <w:t>4,40</w:t>
+            </w:r>
+          </w:p>
+        </w:tc>
+        <w:tc>
+          <w:tcPr>
+            <w:tcW w:type="dxa" w:w="1440"/>
+          </w:tcPr>
+          <w:p>
+            <w:r/>
+            <w:r>
+              <w:rPr>
+                <w:sz w:val="17"/>
+              </w:rPr>
+              <w:t>3,06</w:t>
+            </w:r>
+          </w:p>
+        </w:tc>
+        <w:tc>
+          <w:tcPr>
+            <w:tcW w:type="dxa" w:w="1440"/>
+          </w:tcPr>
+          <w:p>
+            <w:r/>
+            <w:r>
+              <w:rPr>
+                <w:sz w:val="17"/>
+              </w:rPr>
+              <w:t>0,44</w:t>
+            </w:r>
+          </w:p>
+        </w:tc>
+        <w:tc>
+          <w:tcPr>
+            <w:tcW w:type="dxa" w:w="1440"/>
+          </w:tcPr>
+          <w:p>
+            <w:r/>
+            <w:r>
+              <w:rPr>
+                <w:sz w:val="17"/>
+              </w:rPr>
+              <w:t>4</w:t>
+            </w:r>
+          </w:p>
+        </w:tc>
+      </w:tr>
+      <w:tr>
+        <w:tc>
+          <w:tcPr>
+            <w:tcW w:type="dxa" w:w="1440"/>
+          </w:tcPr>
+          <w:p>
+            <w:r/>
+            <w:r>
+              <w:rPr>
+                <w:sz w:val="17"/>
+              </w:rPr>
+              <w:t>largo del pétalo</w:t>
+            </w:r>
+          </w:p>
+        </w:tc>
+        <w:tc>
+          <w:tcPr>
+            <w:tcW w:type="dxa" w:w="1440"/>
+          </w:tcPr>
+          <w:p>
+            <w:r/>
+            <w:r>
+              <w:rPr>
+                <w:sz w:val="17"/>
+              </w:rPr>
+              <w:t>1,00</w:t>
+            </w:r>
+          </w:p>
+        </w:tc>
+        <w:tc>
+          <w:tcPr>
+            <w:tcW w:type="dxa" w:w="1440"/>
+          </w:tcPr>
+          <w:p>
+            <w:r/>
+            <w:r>
+              <w:rPr>
+                <w:sz w:val="17"/>
+              </w:rPr>
+              <w:t>6,90</w:t>
+            </w:r>
+          </w:p>
+        </w:tc>
+        <w:tc>
+          <w:tcPr>
+            <w:tcW w:type="dxa" w:w="1440"/>
+          </w:tcPr>
+          <w:p>
+            <w:r/>
+            <w:r>
+              <w:rPr>
+                <w:sz w:val="17"/>
+              </w:rPr>
+              <w:t>3,76</w:t>
+            </w:r>
+          </w:p>
+        </w:tc>
+        <w:tc>
+          <w:tcPr>
+            <w:tcW w:type="dxa" w:w="1440"/>
+          </w:tcPr>
+          <w:p>
+            <w:r/>
+            <w:r>
+              <w:rPr>
+                <w:sz w:val="17"/>
+              </w:rPr>
+              <w:t>1,77</w:t>
+            </w:r>
+          </w:p>
+        </w:tc>
+        <w:tc>
+          <w:tcPr>
+            <w:tcW w:type="dxa" w:w="1440"/>
+          </w:tcPr>
+          <w:p>
+            <w:r/>
+            <w:r>
+              <w:rPr>
+                <w:sz w:val="17"/>
+              </w:rPr>
+              <w:t>0</w:t>
+            </w:r>
+          </w:p>
+        </w:tc>
+      </w:tr>
+      <w:tr>
+        <w:tc>
+          <w:tcPr>
+            <w:tcW w:type="dxa" w:w="1440"/>
+          </w:tcPr>
+          <w:p>
+            <w:r/>
+            <w:r>
+              <w:rPr>
+                <w:sz w:val="17"/>
+              </w:rPr>
+              <w:t>ancho del pétalo</w:t>
+            </w:r>
+          </w:p>
+        </w:tc>
+        <w:tc>
+          <w:tcPr>
+            <w:tcW w:type="dxa" w:w="1440"/>
+          </w:tcPr>
+          <w:p>
+            <w:r/>
+            <w:r>
+              <w:rPr>
+                <w:sz w:val="17"/>
+              </w:rPr>
+              <w:t>0,10</w:t>
+            </w:r>
+          </w:p>
+        </w:tc>
+        <w:tc>
+          <w:tcPr>
+            <w:tcW w:type="dxa" w:w="1440"/>
+          </w:tcPr>
+          <w:p>
+            <w:r/>
+            <w:r>
+              <w:rPr>
+                <w:sz w:val="17"/>
+              </w:rPr>
+              <w:t>2,50</w:t>
+            </w:r>
+          </w:p>
+        </w:tc>
+        <w:tc>
+          <w:tcPr>
+            <w:tcW w:type="dxa" w:w="1440"/>
+          </w:tcPr>
+          <w:p>
+            <w:r/>
+            <w:r>
+              <w:rPr>
+                <w:sz w:val="17"/>
+              </w:rPr>
+              <w:t>1,20</w:t>
+            </w:r>
+          </w:p>
+        </w:tc>
+        <w:tc>
+          <w:tcPr>
+            <w:tcW w:type="dxa" w:w="1440"/>
+          </w:tcPr>
+          <w:p>
+            <w:r/>
+            <w:r>
+              <w:rPr>
+                <w:sz w:val="17"/>
+              </w:rPr>
+              <w:t>0,76</w:t>
+            </w:r>
+          </w:p>
+        </w:tc>
+        <w:tc>
+          <w:tcPr>
+            <w:tcW w:type="dxa" w:w="1440"/>
+          </w:tcPr>
+          <w:p>
+            <w:r/>
+            <w:r>
+              <w:rPr>
+                <w:sz w:val="17"/>
+              </w:rPr>
+              <w:t>0</w:t>
+            </w:r>
+          </w:p>
+        </w:tc>
+      </w:tr>
+    </w:tbl>
+    <w:p/>
+    <w:p>
+      <w:r>
+        <w:t>Ninguna de las 150 filas presenta valores faltantes, de modo que no fue necesario imputar ni descartar registros.</w:t>
       </w:r>
     </w:p>
     <w:p>
@@ -166,7 +654,7 @@
           <w:i/>
           <w:sz w:val="18"/>
         </w:rPr>
-        <w:t>Las medidas del pétalo separan setosa de las otras dos sin ayuda. Las del sépalo se pisan más.</w:t>
+        <w:t>Las medidas del pétalo separan setosa de las otras dos especies por sí solas. Las del sépalo presentan un traslape mayor entre clases.</w:t>
       </w:r>
     </w:p>
     <w:p>
@@ -268,7 +756,7 @@
           <w:i/>
           <w:sz w:val="18"/>
         </w:rPr>
-        <w:t>50 de cada clase. Ya viene balanceado.</w:t>
+        <w:t>50 de cada clase. El conjunto ya viene balanceado.</w:t>
       </w:r>
     </w:p>
     <w:p>
@@ -319,105 +807,7 @@
           <w:i/>
           <w:sz w:val="18"/>
         </w:rPr>
-        <w:t>Largo contra ancho del pétalo. Setosa queda sola abajo a la izquierda; versicolor y virginica se traslapan en la frontera.</w:t>
-      </w:r>
-    </w:p>
-    <w:p>
-      <w:r>
-        <w:t>Modelos con el dato crudo:</w:t>
-      </w:r>
-    </w:p>
-    <w:p>
-      <w:pPr>
-        <w:jc w:val="center"/>
-      </w:pPr>
-      <w:r>
-        <w:rPr>
-          <w:i/>
-          <w:sz w:val="18"/>
-        </w:rPr>
-        <w:t>Classification Learner con T0_crudo, validación cruzada de 5 pliegues.</w:t>
-      </w:r>
-    </w:p>
-    <w:tbl>
-      <w:tblPr>
-        <w:tblStyle w:val="LightGrid-Accent1"/>
-        <w:tblW w:type="auto" w:w="0"/>
-        <w:jc w:val="center"/>
-        <w:tblLayout w:type="autofit"/>
-        <w:tblLook w:firstColumn="1" w:firstRow="1" w:lastColumn="0" w:lastRow="0" w:noHBand="0" w:noVBand="1" w:val="04A0"/>
-      </w:tblPr>
-      <w:tblGrid>
-        <w:gridCol w:w="4320"/>
-        <w:gridCol w:w="4320"/>
-      </w:tblGrid>
-      <w:tr>
-        <w:tc>
-          <w:tcPr>
-            <w:tcW w:type="dxa" w:w="4320"/>
-          </w:tcPr>
-          <w:p>
-            <w:r/>
-            <w:r>
-              <w:rPr>
-                <w:b/>
-                <w:sz w:val="17"/>
-              </w:rPr>
-              <w:t>Mejor modelo</w:t>
-            </w:r>
-          </w:p>
-        </w:tc>
-        <w:tc>
-          <w:tcPr>
-            <w:tcW w:type="dxa" w:w="4320"/>
-          </w:tcPr>
-          <w:p>
-            <w:r/>
-            <w:r>
-              <w:rPr>
-                <w:b/>
-                <w:sz w:val="17"/>
-              </w:rPr>
-              <w:t>Exactitud</w:t>
-            </w:r>
-          </w:p>
-        </w:tc>
-      </w:tr>
-      <w:tr>
-        <w:tc>
-          <w:tcPr>
-            <w:tcW w:type="dxa" w:w="4320"/>
-          </w:tcPr>
-          <w:p>
-            <w:r/>
-            <w:r>
-              <w:rPr>
-                <w:sz w:val="17"/>
-              </w:rPr>
-              <w:t>Linear Discriminant y Quadratic Discriminant</w:t>
-            </w:r>
-          </w:p>
-        </w:tc>
-        <w:tc>
-          <w:tcPr>
-            <w:tcW w:type="dxa" w:w="4320"/>
-          </w:tcPr>
-          <w:p>
-            <w:r/>
-            <w:r>
-              <w:rPr>
-                <w:sz w:val="17"/>
-              </w:rPr>
-              <w:t>98,0 %</w:t>
-            </w:r>
-          </w:p>
-        </w:tc>
-      </w:tr>
-    </w:tbl>
-    <w:p/>
-    <w:p>
-      <w:r>
-        <w:t>Con el dato tal como viene ya se llega al 98 %. Es un dataset fácil: setosa se separa sola y el error está en las 3 flores de la frontera entre versicolor y virginica.</w:t>
+        <w:t>Largo contra ancho del pétalo. Setosa queda aislada abajo a la izquierda. Versicolor y virginica se traslapan en la frontera.</w:t>
       </w:r>
     </w:p>
     <w:p>
@@ -425,199 +815,12 @@
         <w:pStyle w:val="Heading3"/>
       </w:pPr>
       <w:r>
-        <w:t>1.2 Corrigiendo outliers</w:t>
+        <w:t>2.2 Efecto de cada paso sobre el dato</w:t>
       </w:r>
     </w:p>
     <w:p>
       <w:r>
-        <w:t>Regla del 1,5 por rango intercuartil, recortando al borde en vez de borrar la fila. Solo el ancho del sépalo tenía unos pocos valores fuera.</w:t>
-      </w:r>
-    </w:p>
-    <w:p>
-      <w:pPr>
-        <w:jc w:val="center"/>
-      </w:pPr>
-      <w:r>
-        <w:drawing>
-          <wp:inline xmlns:a="http://schemas.openxmlformats.org/drawingml/2006/main" xmlns:pic="http://schemas.openxmlformats.org/drawingml/2006/picture">
-            <wp:extent cx="5760720" cy="3639699"/>
-            <wp:docPr id="5" name="Picture 5"/>
-            <wp:cNvGraphicFramePr>
-              <a:graphicFrameLocks noChangeAspect="1"/>
-            </wp:cNvGraphicFramePr>
-            <a:graphic>
-              <a:graphicData uri="http://schemas.openxmlformats.org/drawingml/2006/picture">
-                <pic:pic>
-                  <pic:nvPicPr>
-                    <pic:cNvPr id="0" name="rev_iris_boxplot_outliers.png"/>
-                    <pic:cNvPicPr/>
-                  </pic:nvPicPr>
-                  <pic:blipFill>
-                    <a:blip r:embed="rId13"/>
-                    <a:stretch>
-                      <a:fillRect/>
-                    </a:stretch>
-                  </pic:blipFill>
-                  <pic:spPr>
-                    <a:xfrm>
-                      <a:off x="0" y="0"/>
-                      <a:ext cx="5760720" cy="3639699"/>
-                    </a:xfrm>
-                    <a:prstGeom prst="rect"/>
-                  </pic:spPr>
-                </pic:pic>
-              </a:graphicData>
-            </a:graphic>
-          </wp:inline>
-        </w:drawing>
-      </w:r>
-    </w:p>
-    <w:p>
-      <w:pPr>
-        <w:jc w:val="center"/>
-      </w:pPr>
-      <w:r>
-        <w:rPr>
-          <w:i/>
-          <w:sz w:val="18"/>
-        </w:rPr>
-        <w:t>Casi igual al crudo. En Iris este paso no cambia nada.</w:t>
-      </w:r>
-    </w:p>
-    <w:p>
-      <w:pPr>
-        <w:jc w:val="center"/>
-      </w:pPr>
-      <w:r>
-        <w:rPr>
-          <w:i/>
-          <w:sz w:val="18"/>
-        </w:rPr>
-        <w:t>Classification Learner con T1_outliers.</w:t>
-      </w:r>
-    </w:p>
-    <w:tbl>
-      <w:tblPr>
-        <w:tblStyle w:val="LightGrid-Accent1"/>
-        <w:tblW w:type="auto" w:w="0"/>
-        <w:jc w:val="center"/>
-        <w:tblLayout w:type="autofit"/>
-        <w:tblLook w:firstColumn="1" w:firstRow="1" w:lastColumn="0" w:lastRow="0" w:noHBand="0" w:noVBand="1" w:val="04A0"/>
-      </w:tblPr>
-      <w:tblGrid>
-        <w:gridCol w:w="2880"/>
-        <w:gridCol w:w="2880"/>
-        <w:gridCol w:w="2880"/>
-      </w:tblGrid>
-      <w:tr>
-        <w:tc>
-          <w:tcPr>
-            <w:tcW w:type="dxa" w:w="2880"/>
-          </w:tcPr>
-          <w:p>
-            <w:r/>
-            <w:r>
-              <w:rPr>
-                <w:b/>
-                <w:sz w:val="17"/>
-              </w:rPr>
-              <w:t>Mejor modelo</w:t>
-            </w:r>
-          </w:p>
-        </w:tc>
-        <w:tc>
-          <w:tcPr>
-            <w:tcW w:type="dxa" w:w="2880"/>
-          </w:tcPr>
-          <w:p>
-            <w:r/>
-            <w:r>
-              <w:rPr>
-                <w:b/>
-                <w:sz w:val="17"/>
-              </w:rPr>
-              <w:t>Exactitud</w:t>
-            </w:r>
-          </w:p>
-        </w:tc>
-        <w:tc>
-          <w:tcPr>
-            <w:tcW w:type="dxa" w:w="2880"/>
-          </w:tcPr>
-          <w:p>
-            <w:r/>
-            <w:r>
-              <w:rPr>
-                <w:b/>
-                <w:sz w:val="17"/>
-              </w:rPr>
-              <w:t>Cambió respecto al paso anterior</w:t>
-            </w:r>
-          </w:p>
-        </w:tc>
-      </w:tr>
-      <w:tr>
-        <w:tc>
-          <w:tcPr>
-            <w:tcW w:type="dxa" w:w="2880"/>
-          </w:tcPr>
-          <w:p>
-            <w:r/>
-            <w:r>
-              <w:rPr>
-                <w:sz w:val="17"/>
-              </w:rPr>
-              <w:t>Linear Discriminant</w:t>
-            </w:r>
-          </w:p>
-        </w:tc>
-        <w:tc>
-          <w:tcPr>
-            <w:tcW w:type="dxa" w:w="2880"/>
-          </w:tcPr>
-          <w:p>
-            <w:r/>
-            <w:r>
-              <w:rPr>
-                <w:sz w:val="17"/>
-              </w:rPr>
-              <w:t>98,0 %</w:t>
-            </w:r>
-          </w:p>
-        </w:tc>
-        <w:tc>
-          <w:tcPr>
-            <w:tcW w:type="dxa" w:w="2880"/>
-          </w:tcPr>
-          <w:p>
-            <w:r/>
-            <w:r>
-              <w:rPr>
-                <w:sz w:val="17"/>
-              </w:rPr>
-              <w:t>no</w:t>
-            </w:r>
-          </w:p>
-        </w:tc>
-      </w:tr>
-    </w:tbl>
-    <w:p/>
-    <w:p>
-      <w:r>
-        <w:t>Recortar 4 valores del ancho del sépalo no mueve al mejor modelo. Los árboles bajaron de 96,7 a 96,0 y el SVM cúbico de 95,3 a 92,7, pero son diferencias de una o dos flores.</w:t>
-      </w:r>
-    </w:p>
-    <w:p>
-      <w:pPr>
-        <w:pStyle w:val="Heading3"/>
-      </w:pPr>
-      <w:r>
-        <w:t>1.3 Balanceando las clases</w:t>
-      </w:r>
-    </w:p>
-    <w:p>
-      <w:r>
-        <w:t xml:space="preserve">No hay nada que balancear, son 50, 50 y 50. La tabla </w:t>
+        <w:t xml:space="preserve">La corrección de atípicos solo alcanza a 4 valores del ancho del sépalo y el boxplot resultante es prácticamente igual al del dato crudo. El balanceo no tiene nada que hacer, ya que hay 50 flores de cada clase, y </w:t>
       </w:r>
       <w:r>
         <w:rPr>
@@ -628,7 +831,7 @@
         <w:t>T2_balanceado</w:t>
       </w:r>
       <w:r>
-        <w:t xml:space="preserve"> es la misma que </w:t>
+        <w:t xml:space="preserve"> coincide con </w:t>
       </w:r>
       <w:r>
         <w:rPr>
@@ -639,138 +842,7 @@
         <w:t>T1_outliers</w:t>
       </w:r>
       <w:r>
-        <w:t xml:space="preserve"> y se deja con ese nombre para seguir el orden.</w:t>
-      </w:r>
-    </w:p>
-    <w:p>
-      <w:pPr>
-        <w:jc w:val="center"/>
-      </w:pPr>
-      <w:r>
-        <w:rPr>
-          <w:i/>
-          <w:sz w:val="18"/>
-        </w:rPr>
-        <w:t>Classification Learner con T2_balanceado, que son los mismos datos de T1.</w:t>
-      </w:r>
-    </w:p>
-    <w:tbl>
-      <w:tblPr>
-        <w:tblStyle w:val="LightGrid-Accent1"/>
-        <w:tblW w:type="auto" w:w="0"/>
-        <w:jc w:val="center"/>
-        <w:tblLayout w:type="autofit"/>
-        <w:tblLook w:firstColumn="1" w:firstRow="1" w:lastColumn="0" w:lastRow="0" w:noHBand="0" w:noVBand="1" w:val="04A0"/>
-      </w:tblPr>
-      <w:tblGrid>
-        <w:gridCol w:w="2880"/>
-        <w:gridCol w:w="2880"/>
-        <w:gridCol w:w="2880"/>
-      </w:tblGrid>
-      <w:tr>
-        <w:tc>
-          <w:tcPr>
-            <w:tcW w:type="dxa" w:w="2880"/>
-          </w:tcPr>
-          <w:p>
-            <w:r/>
-            <w:r>
-              <w:rPr>
-                <w:b/>
-                <w:sz w:val="17"/>
-              </w:rPr>
-              <w:t>Mejor modelo</w:t>
-            </w:r>
-          </w:p>
-        </w:tc>
-        <w:tc>
-          <w:tcPr>
-            <w:tcW w:type="dxa" w:w="2880"/>
-          </w:tcPr>
-          <w:p>
-            <w:r/>
-            <w:r>
-              <w:rPr>
-                <w:b/>
-                <w:sz w:val="17"/>
-              </w:rPr>
-              <w:t>Exactitud</w:t>
-            </w:r>
-          </w:p>
-        </w:tc>
-        <w:tc>
-          <w:tcPr>
-            <w:tcW w:type="dxa" w:w="2880"/>
-          </w:tcPr>
-          <w:p>
-            <w:r/>
-            <w:r>
-              <w:rPr>
-                <w:b/>
-                <w:sz w:val="17"/>
-              </w:rPr>
-              <w:t>Cambió</w:t>
-            </w:r>
-          </w:p>
-        </w:tc>
-      </w:tr>
-      <w:tr>
-        <w:tc>
-          <w:tcPr>
-            <w:tcW w:type="dxa" w:w="2880"/>
-          </w:tcPr>
-          <w:p>
-            <w:r/>
-            <w:r>
-              <w:rPr>
-                <w:sz w:val="17"/>
-              </w:rPr>
-              <w:t>Efficient Linear SVM</w:t>
-            </w:r>
-          </w:p>
-        </w:tc>
-        <w:tc>
-          <w:tcPr>
-            <w:tcW w:type="dxa" w:w="2880"/>
-          </w:tcPr>
-          <w:p>
-            <w:r/>
-            <w:r>
-              <w:rPr>
-                <w:sz w:val="17"/>
-              </w:rPr>
-              <w:t>98,7 %</w:t>
-            </w:r>
-          </w:p>
-        </w:tc>
-        <w:tc>
-          <w:tcPr>
-            <w:tcW w:type="dxa" w:w="2880"/>
-          </w:tcPr>
-          <w:p>
-            <w:r/>
-            <w:r>
-              <w:rPr>
-                <w:sz w:val="17"/>
-              </w:rPr>
-              <w:t>sube 0,7 puntos</w:t>
-            </w:r>
-          </w:p>
-        </w:tc>
-      </w:tr>
-    </w:tbl>
-    <w:p/>
-    <w:p>
-      <w:r>
-        <w:t>Ojo con este 98,7 %: los datos son exactamente los mismos de T1. Lo que cambió es que la app volvió a repartir al azar los 5 pliegues de la validación cruzada, y con 150 flores un pliegue distinto mueve el resultado una flor. 98,7 contra 98,0 es una flor de 150. No es una mejora del balanceo, porque no hubo balanceo.</w:t>
-      </w:r>
-    </w:p>
-    <w:p>
-      <w:pPr>
-        <w:pStyle w:val="Heading3"/>
-      </w:pPr>
-      <w:r>
-        <w:t>1.4 Estandarizando</w:t>
+        <w:t>. La estandarización y la normalización cambian las unidades pero no la forma de las distribuciones, porque las cuatro variables ya estaban en escalas comparables.</w:t>
       </w:r>
     </w:p>
     <w:p>
@@ -781,7 +853,7 @@
         <w:drawing>
           <wp:inline xmlns:a="http://schemas.openxmlformats.org/drawingml/2006/main" xmlns:pic="http://schemas.openxmlformats.org/drawingml/2006/picture">
             <wp:extent cx="5760720" cy="3647814"/>
-            <wp:docPr id="6" name="Picture 6"/>
+            <wp:docPr id="5" name="Picture 5"/>
             <wp:cNvGraphicFramePr>
               <a:graphicFrameLocks noChangeAspect="1"/>
             </wp:cNvGraphicFramePr>
@@ -793,7 +865,7 @@
                     <pic:cNvPicPr/>
                   </pic:nvPicPr>
                   <pic:blipFill>
-                    <a:blip r:embed="rId14"/>
+                    <a:blip r:embed="rId13"/>
                     <a:stretch>
                       <a:fillRect/>
                     </a:stretch>
@@ -821,130 +893,7 @@
           <w:i/>
           <w:sz w:val="18"/>
         </w:rPr>
-        <w:t>Media 0 y desviación 1 en las cuatro.</w:t>
-      </w:r>
-    </w:p>
-    <w:p>
-      <w:pPr>
-        <w:jc w:val="center"/>
-      </w:pPr>
-      <w:r>
-        <w:rPr>
-          <w:i/>
-          <w:sz w:val="18"/>
-        </w:rPr>
-        <w:t>Classification Learner con T3_estandarizado.</w:t>
-      </w:r>
-    </w:p>
-    <w:tbl>
-      <w:tblPr>
-        <w:tblStyle w:val="LightGrid-Accent1"/>
-        <w:tblW w:type="auto" w:w="0"/>
-        <w:jc w:val="center"/>
-        <w:tblLayout w:type="autofit"/>
-        <w:tblLook w:firstColumn="1" w:firstRow="1" w:lastColumn="0" w:lastRow="0" w:noHBand="0" w:noVBand="1" w:val="04A0"/>
-      </w:tblPr>
-      <w:tblGrid>
-        <w:gridCol w:w="2880"/>
-        <w:gridCol w:w="2880"/>
-        <w:gridCol w:w="2880"/>
-      </w:tblGrid>
-      <w:tr>
-        <w:tc>
-          <w:tcPr>
-            <w:tcW w:type="dxa" w:w="2880"/>
-          </w:tcPr>
-          <w:p>
-            <w:r/>
-            <w:r>
-              <w:rPr>
-                <w:b/>
-                <w:sz w:val="17"/>
-              </w:rPr>
-              <w:t>Mejor modelo</w:t>
-            </w:r>
-          </w:p>
-        </w:tc>
-        <w:tc>
-          <w:tcPr>
-            <w:tcW w:type="dxa" w:w="2880"/>
-          </w:tcPr>
-          <w:p>
-            <w:r/>
-            <w:r>
-              <w:rPr>
-                <w:b/>
-                <w:sz w:val="17"/>
-              </w:rPr>
-              <w:t>Exactitud</w:t>
-            </w:r>
-          </w:p>
-        </w:tc>
-        <w:tc>
-          <w:tcPr>
-            <w:tcW w:type="dxa" w:w="2880"/>
-          </w:tcPr>
-          <w:p>
-            <w:r/>
-            <w:r>
-              <w:rPr>
-                <w:b/>
-                <w:sz w:val="17"/>
-              </w:rPr>
-              <w:t>Cambió</w:t>
-            </w:r>
-          </w:p>
-        </w:tc>
-      </w:tr>
-      <w:tr>
-        <w:tc>
-          <w:tcPr>
-            <w:tcW w:type="dxa" w:w="2880"/>
-          </w:tcPr>
-          <w:p>
-            <w:r/>
-            <w:r>
-              <w:rPr>
-                <w:sz w:val="17"/>
-              </w:rPr>
-              <w:t>Linear Discriminant, Quadratic Discriminant y Quadratic SVM</w:t>
-            </w:r>
-          </w:p>
-        </w:tc>
-        <w:tc>
-          <w:tcPr>
-            <w:tcW w:type="dxa" w:w="2880"/>
-          </w:tcPr>
-          <w:p>
-            <w:r/>
-            <w:r>
-              <w:rPr>
-                <w:sz w:val="17"/>
-              </w:rPr>
-              <w:t>98,0 %</w:t>
-            </w:r>
-          </w:p>
-        </w:tc>
-        <w:tc>
-          <w:tcPr>
-            <w:tcW w:type="dxa" w:w="2880"/>
-          </w:tcPr>
-          <w:p>
-            <w:r/>
-            <w:r>
-              <w:rPr>
-                <w:sz w:val="17"/>
-              </w:rPr>
-              <w:t>no</w:t>
-            </w:r>
-          </w:p>
-        </w:tc>
-      </w:tr>
-    </w:tbl>
-    <w:p/>
-    <w:p>
-      <w:r>
-        <w:t>Estandarizar no cambia el techo del 98 %, pero sube el SVM cuadrático de 97,3 a 98,0 y baja los árboles finos a 94,7. Tiene sentido: a los discriminantes y a los árboles la escala no les importa, a los SVM sí.</w:t>
+        <w:t>Tras la estandarización las cuatro medidas quedan con media 0 y desviación 1.</w:t>
       </w:r>
     </w:p>
     <w:p>
@@ -952,194 +901,12 @@
         <w:pStyle w:val="Heading3"/>
       </w:pPr>
       <w:r>
-        <w:t>1.5 Normalizando</w:t>
-      </w:r>
-    </w:p>
-    <w:p>
-      <w:pPr>
-        <w:jc w:val="center"/>
-      </w:pPr>
-      <w:r>
-        <w:drawing>
-          <wp:inline xmlns:a="http://schemas.openxmlformats.org/drawingml/2006/main" xmlns:pic="http://schemas.openxmlformats.org/drawingml/2006/picture">
-            <wp:extent cx="5760720" cy="3676504"/>
-            <wp:docPr id="7" name="Picture 7"/>
-            <wp:cNvGraphicFramePr>
-              <a:graphicFrameLocks noChangeAspect="1"/>
-            </wp:cNvGraphicFramePr>
-            <a:graphic>
-              <a:graphicData uri="http://schemas.openxmlformats.org/drawingml/2006/picture">
-                <pic:pic>
-                  <pic:nvPicPr>
-                    <pic:cNvPr id="0" name="rev_iris_boxplot_normalizado.png"/>
-                    <pic:cNvPicPr/>
-                  </pic:nvPicPr>
-                  <pic:blipFill>
-                    <a:blip r:embed="rId15"/>
-                    <a:stretch>
-                      <a:fillRect/>
-                    </a:stretch>
-                  </pic:blipFill>
-                  <pic:spPr>
-                    <a:xfrm>
-                      <a:off x="0" y="0"/>
-                      <a:ext cx="5760720" cy="3676504"/>
-                    </a:xfrm>
-                    <a:prstGeom prst="rect"/>
-                  </pic:spPr>
-                </pic:pic>
-              </a:graphicData>
-            </a:graphic>
-          </wp:inline>
-        </w:drawing>
-      </w:r>
-    </w:p>
-    <w:p>
-      <w:pPr>
-        <w:jc w:val="center"/>
-      </w:pPr>
-      <w:r>
-        <w:rPr>
-          <w:i/>
-          <w:sz w:val="18"/>
-        </w:rPr>
-        <w:t>Todo entre 0 y 1.</w:t>
-      </w:r>
-    </w:p>
-    <w:p>
-      <w:pPr>
-        <w:jc w:val="center"/>
-      </w:pPr>
-      <w:r>
-        <w:rPr>
-          <w:i/>
-          <w:sz w:val="18"/>
-        </w:rPr>
-        <w:t>Classification Learner con T4_normalizado.</w:t>
-      </w:r>
-    </w:p>
-    <w:tbl>
-      <w:tblPr>
-        <w:tblStyle w:val="LightGrid-Accent1"/>
-        <w:tblW w:type="auto" w:w="0"/>
-        <w:jc w:val="center"/>
-        <w:tblLayout w:type="autofit"/>
-        <w:tblLook w:firstColumn="1" w:firstRow="1" w:lastColumn="0" w:lastRow="0" w:noHBand="0" w:noVBand="1" w:val="04A0"/>
-      </w:tblPr>
-      <w:tblGrid>
-        <w:gridCol w:w="2880"/>
-        <w:gridCol w:w="2880"/>
-        <w:gridCol w:w="2880"/>
-      </w:tblGrid>
-      <w:tr>
-        <w:tc>
-          <w:tcPr>
-            <w:tcW w:type="dxa" w:w="2880"/>
-          </w:tcPr>
-          <w:p>
-            <w:r/>
-            <w:r>
-              <w:rPr>
-                <w:b/>
-                <w:sz w:val="17"/>
-              </w:rPr>
-              <w:t>Mejor modelo</w:t>
-            </w:r>
-          </w:p>
-        </w:tc>
-        <w:tc>
-          <w:tcPr>
-            <w:tcW w:type="dxa" w:w="2880"/>
-          </w:tcPr>
-          <w:p>
-            <w:r/>
-            <w:r>
-              <w:rPr>
-                <w:b/>
-                <w:sz w:val="17"/>
-              </w:rPr>
-              <w:t>Exactitud</w:t>
-            </w:r>
-          </w:p>
-        </w:tc>
-        <w:tc>
-          <w:tcPr>
-            <w:tcW w:type="dxa" w:w="2880"/>
-          </w:tcPr>
-          <w:p>
-            <w:r/>
-            <w:r>
-              <w:rPr>
-                <w:b/>
-                <w:sz w:val="17"/>
-              </w:rPr>
-              <w:t>Cambió</w:t>
-            </w:r>
-          </w:p>
-        </w:tc>
-      </w:tr>
-      <w:tr>
-        <w:tc>
-          <w:tcPr>
-            <w:tcW w:type="dxa" w:w="2880"/>
-          </w:tcPr>
-          <w:p>
-            <w:r/>
-            <w:r>
-              <w:rPr>
-                <w:sz w:val="17"/>
-              </w:rPr>
-              <w:t>Linear Discriminant</w:t>
-            </w:r>
-          </w:p>
-        </w:tc>
-        <w:tc>
-          <w:tcPr>
-            <w:tcW w:type="dxa" w:w="2880"/>
-          </w:tcPr>
-          <w:p>
-            <w:r/>
-            <w:r>
-              <w:rPr>
-                <w:sz w:val="17"/>
-              </w:rPr>
-              <w:t>98,0 %</w:t>
-            </w:r>
-          </w:p>
-        </w:tc>
-        <w:tc>
-          <w:tcPr>
-            <w:tcW w:type="dxa" w:w="2880"/>
-          </w:tcPr>
-          <w:p>
-            <w:r/>
-            <w:r>
-              <w:rPr>
-                <w:sz w:val="17"/>
-              </w:rPr>
-              <w:t>no</w:t>
-            </w:r>
-          </w:p>
-        </w:tc>
-      </w:tr>
-    </w:tbl>
-    <w:p/>
-    <w:p>
-      <w:r>
-        <w:t>Igual que estandarizar. El discriminante lineal da 98 % con cualquier versión de los datos.</w:t>
-      </w:r>
-    </w:p>
-    <w:p>
-      <w:pPr>
-        <w:pStyle w:val="Heading3"/>
-      </w:pPr>
-      <w:r>
-        <w:t>1.6 Qué pasó en Iris</w:t>
+        <w:t>2.3 Perceptrón y Adaline sobre cada versión</w:t>
       </w:r>
     </w:p>
     <w:p>
       <w:r>
-        <w:t>Los 12 modelos de la app en cada paso, exactitud de validación en %:</w:t>
+        <w:t>La neurona es una sola, así que se arman dos problemas de dos clases. El problema A es setosa contra las otras dos, que se separa con una recta. El problema B es versicolor contra virginica, que no se separa del todo. La exactitud se mide en el 30 por ciento de prueba, 45 flores en A y 30 en B.</w:t>
       </w:r>
     </w:p>
     <w:tbl>
@@ -1170,7 +937,7 @@
                 <w:b/>
                 <w:sz w:val="17"/>
               </w:rPr>
-              <w:t>Modelo</w:t>
+              <w:t>Problema</w:t>
             </w:r>
           </w:p>
         </w:tc>
@@ -1185,7 +952,7 @@
                 <w:b/>
                 <w:sz w:val="17"/>
               </w:rPr>
-              <w:t>T0 crudo</w:t>
+              <w:t>Paso</w:t>
             </w:r>
           </w:p>
         </w:tc>
@@ -1200,7 +967,7 @@
                 <w:b/>
                 <w:sz w:val="17"/>
               </w:rPr>
-              <w:t>T1 outliers</w:t>
+              <w:t>Perceptrón, épocas</w:t>
             </w:r>
           </w:p>
         </w:tc>
@@ -1215,7 +982,7 @@
                 <w:b/>
                 <w:sz w:val="17"/>
               </w:rPr>
-              <w:t>T2 balanceado</w:t>
+              <w:t>Perceptrón, exactitud</w:t>
             </w:r>
           </w:p>
         </w:tc>
@@ -1230,7 +997,7 @@
                 <w:b/>
                 <w:sz w:val="17"/>
               </w:rPr>
-              <w:t>T3 estandarizado</w:t>
+              <w:t>Adaline, épocas</w:t>
             </w:r>
           </w:p>
         </w:tc>
@@ -1245,7 +1012,7 @@
                 <w:b/>
                 <w:sz w:val="17"/>
               </w:rPr>
-              <w:t>T4 normalizado</w:t>
+              <w:t>Adaline, exactitud</w:t>
             </w:r>
           </w:p>
         </w:tc>
@@ -1261,7 +1028,7 @@
               <w:rPr>
                 <w:sz w:val="17"/>
               </w:rPr>
-              <w:t>Fine Tree</w:t>
+              <w:t>A</w:t>
             </w:r>
           </w:p>
         </w:tc>
@@ -1275,7 +1042,7 @@
               <w:rPr>
                 <w:sz w:val="17"/>
               </w:rPr>
-              <w:t>96,7</w:t>
+              <w:t>crudo</w:t>
             </w:r>
           </w:p>
         </w:tc>
@@ -1289,7 +1056,7 @@
               <w:rPr>
                 <w:sz w:val="17"/>
               </w:rPr>
-              <w:t>96,0</w:t>
+              <w:t>2</w:t>
             </w:r>
           </w:p>
         </w:tc>
@@ -1303,7 +1070,7 @@
               <w:rPr>
                 <w:sz w:val="17"/>
               </w:rPr>
-              <w:t>96,0</w:t>
+              <w:t>100 %</w:t>
             </w:r>
           </w:p>
         </w:tc>
@@ -1317,7 +1084,7 @@
               <w:rPr>
                 <w:sz w:val="17"/>
               </w:rPr>
-              <w:t>94,7</w:t>
+              <w:t>372</w:t>
             </w:r>
           </w:p>
         </w:tc>
@@ -1331,7 +1098,7 @@
               <w:rPr>
                 <w:sz w:val="17"/>
               </w:rPr>
-              <w:t>95,3</w:t>
+              <w:t>100 %</w:t>
             </w:r>
           </w:p>
         </w:tc>
@@ -1347,7 +1114,7 @@
               <w:rPr>
                 <w:sz w:val="17"/>
               </w:rPr>
-              <w:t>Medium Tree</w:t>
+              <w:t>A</w:t>
             </w:r>
           </w:p>
         </w:tc>
@@ -1361,7 +1128,7 @@
               <w:rPr>
                 <w:sz w:val="17"/>
               </w:rPr>
-              <w:t>96,7</w:t>
+              <w:t>sin outliers</w:t>
             </w:r>
           </w:p>
         </w:tc>
@@ -1375,7 +1142,7 @@
               <w:rPr>
                 <w:sz w:val="17"/>
               </w:rPr>
-              <w:t>96,0</w:t>
+              <w:t>2</w:t>
             </w:r>
           </w:p>
         </w:tc>
@@ -1389,7 +1156,7 @@
               <w:rPr>
                 <w:sz w:val="17"/>
               </w:rPr>
-              <w:t>96,0</w:t>
+              <w:t>100 %</w:t>
             </w:r>
           </w:p>
         </w:tc>
@@ -1403,7 +1170,7 @@
               <w:rPr>
                 <w:sz w:val="17"/>
               </w:rPr>
-              <w:t>94,7</w:t>
+              <w:t>346</w:t>
             </w:r>
           </w:p>
         </w:tc>
@@ -1417,7 +1184,7 @@
               <w:rPr>
                 <w:sz w:val="17"/>
               </w:rPr>
-              <w:t>95,3</w:t>
+              <w:t>100 %</w:t>
             </w:r>
           </w:p>
         </w:tc>
@@ -1433,7 +1200,7 @@
               <w:rPr>
                 <w:sz w:val="17"/>
               </w:rPr>
-              <w:t>Coarse Tree</w:t>
+              <w:t>A</w:t>
             </w:r>
           </w:p>
         </w:tc>
@@ -1447,7 +1214,7 @@
               <w:rPr>
                 <w:sz w:val="17"/>
               </w:rPr>
-              <w:t>96,7</w:t>
+              <w:t>balanceado</w:t>
             </w:r>
           </w:p>
         </w:tc>
@@ -1461,7 +1228,7 @@
               <w:rPr>
                 <w:sz w:val="17"/>
               </w:rPr>
-              <w:t>96,0</w:t>
+              <w:t>2</w:t>
             </w:r>
           </w:p>
         </w:tc>
@@ -1475,7 +1242,7 @@
               <w:rPr>
                 <w:sz w:val="17"/>
               </w:rPr>
-              <w:t>96,0</w:t>
+              <w:t>100 %</w:t>
             </w:r>
           </w:p>
         </w:tc>
@@ -1489,7 +1256,7 @@
               <w:rPr>
                 <w:sz w:val="17"/>
               </w:rPr>
-              <w:t>96,7</w:t>
+              <w:t>346</w:t>
             </w:r>
           </w:p>
         </w:tc>
@@ -1503,7 +1270,7 @@
               <w:rPr>
                 <w:sz w:val="17"/>
               </w:rPr>
-              <w:t>95,3</w:t>
+              <w:t>100 %</w:t>
             </w:r>
           </w:p>
         </w:tc>
@@ -1519,7 +1286,7 @@
               <w:rPr>
                 <w:sz w:val="17"/>
               </w:rPr>
-              <w:t>Linear Discriminant</w:t>
+              <w:t>A</w:t>
             </w:r>
           </w:p>
         </w:tc>
@@ -1533,7 +1300,7 @@
               <w:rPr>
                 <w:sz w:val="17"/>
               </w:rPr>
-              <w:t>98,0</w:t>
+              <w:t>estandarizado</w:t>
             </w:r>
           </w:p>
         </w:tc>
@@ -1547,7 +1314,7 @@
               <w:rPr>
                 <w:sz w:val="17"/>
               </w:rPr>
-              <w:t>98,0</w:t>
+              <w:t>2</w:t>
             </w:r>
           </w:p>
         </w:tc>
@@ -1561,7 +1328,7 @@
               <w:rPr>
                 <w:sz w:val="17"/>
               </w:rPr>
-              <w:t>98,0</w:t>
+              <w:t>100 %</w:t>
             </w:r>
           </w:p>
         </w:tc>
@@ -1575,7 +1342,7 @@
               <w:rPr>
                 <w:sz w:val="17"/>
               </w:rPr>
-              <w:t>98,0</w:t>
+              <w:t>40</w:t>
             </w:r>
           </w:p>
         </w:tc>
@@ -1589,7 +1356,7 @@
               <w:rPr>
                 <w:sz w:val="17"/>
               </w:rPr>
-              <w:t>98,0</w:t>
+              <w:t>100 %</w:t>
             </w:r>
           </w:p>
         </w:tc>
@@ -1605,7 +1372,7 @@
               <w:rPr>
                 <w:sz w:val="17"/>
               </w:rPr>
-              <w:t>Quadratic Discriminant</w:t>
+              <w:t>A</w:t>
             </w:r>
           </w:p>
         </w:tc>
@@ -1619,7 +1386,7 @@
               <w:rPr>
                 <w:sz w:val="17"/>
               </w:rPr>
-              <w:t>98,0</w:t>
+              <w:t>normalizado</w:t>
             </w:r>
           </w:p>
         </w:tc>
@@ -1633,7 +1400,7 @@
               <w:rPr>
                 <w:sz w:val="17"/>
               </w:rPr>
-              <w:t>96,7</w:t>
+              <w:t>4</w:t>
             </w:r>
           </w:p>
         </w:tc>
@@ -1647,7 +1414,7 @@
               <w:rPr>
                 <w:sz w:val="17"/>
               </w:rPr>
-              <w:t>97,3</w:t>
+              <w:t>100 %</w:t>
             </w:r>
           </w:p>
         </w:tc>
@@ -1661,7 +1428,7 @@
               <w:rPr>
                 <w:sz w:val="17"/>
               </w:rPr>
-              <w:t>98,0</w:t>
+              <w:t>500</w:t>
             </w:r>
           </w:p>
         </w:tc>
@@ -1675,7 +1442,7 @@
               <w:rPr>
                 <w:sz w:val="17"/>
               </w:rPr>
-              <w:t>96,7</w:t>
+              <w:t>100 %</w:t>
             </w:r>
           </w:p>
         </w:tc>
@@ -1691,7 +1458,7 @@
               <w:rPr>
                 <w:sz w:val="17"/>
               </w:rPr>
-              <w:t>Efficient Logistic Regression</w:t>
+              <w:t>B</w:t>
             </w:r>
           </w:p>
         </w:tc>
@@ -1705,7 +1472,7 @@
               <w:rPr>
                 <w:sz w:val="17"/>
               </w:rPr>
-              <w:t>96,7</w:t>
+              <w:t>crudo</w:t>
             </w:r>
           </w:p>
         </w:tc>
@@ -1719,7 +1486,7 @@
               <w:rPr>
                 <w:sz w:val="17"/>
               </w:rPr>
-              <w:t>97,3</w:t>
+              <w:t>200</w:t>
             </w:r>
           </w:p>
         </w:tc>
@@ -1733,7 +1500,7 @@
               <w:rPr>
                 <w:sz w:val="17"/>
               </w:rPr>
-              <w:t>96,7</w:t>
+              <w:t>100 %</w:t>
             </w:r>
           </w:p>
         </w:tc>
@@ -1747,7 +1514,7 @@
               <w:rPr>
                 <w:sz w:val="17"/>
               </w:rPr>
-              <w:t>96,0</w:t>
+              <w:t>500</w:t>
             </w:r>
           </w:p>
         </w:tc>
@@ -1761,7 +1528,7 @@
               <w:rPr>
                 <w:sz w:val="17"/>
               </w:rPr>
-              <w:t>95,3</w:t>
+              <w:t>93,3 %</w:t>
             </w:r>
           </w:p>
         </w:tc>
@@ -1777,7 +1544,7 @@
               <w:rPr>
                 <w:sz w:val="17"/>
               </w:rPr>
-              <w:t>Efficient Linear SVM</w:t>
+              <w:t>B</w:t>
             </w:r>
           </w:p>
         </w:tc>
@@ -1791,7 +1558,7 @@
               <w:rPr>
                 <w:sz w:val="17"/>
               </w:rPr>
-              <w:t>97,3</w:t>
+              <w:t>sin outliers</w:t>
             </w:r>
           </w:p>
         </w:tc>
@@ -1805,7 +1572,7 @@
               <w:rPr>
                 <w:sz w:val="17"/>
               </w:rPr>
-              <w:t>97,3</w:t>
+              <w:t>200</w:t>
             </w:r>
           </w:p>
         </w:tc>
@@ -1819,7 +1586,7 @@
               <w:rPr>
                 <w:sz w:val="17"/>
               </w:rPr>
-              <w:t>98,7</w:t>
+              <w:t>100 %</w:t>
             </w:r>
           </w:p>
         </w:tc>
@@ -1833,7 +1600,7 @@
               <w:rPr>
                 <w:sz w:val="17"/>
               </w:rPr>
-              <w:t>96,7</w:t>
+              <w:t>500</w:t>
             </w:r>
           </w:p>
         </w:tc>
@@ -1847,7 +1614,7 @@
               <w:rPr>
                 <w:sz w:val="17"/>
               </w:rPr>
-              <w:t>96,0</w:t>
+              <w:t>93,3 %</w:t>
             </w:r>
           </w:p>
         </w:tc>
@@ -1863,7 +1630,7 @@
               <w:rPr>
                 <w:sz w:val="17"/>
               </w:rPr>
-              <w:t>Gaussian Naive Bayes</w:t>
+              <w:t>B</w:t>
             </w:r>
           </w:p>
         </w:tc>
@@ -1877,7 +1644,7 @@
               <w:rPr>
                 <w:sz w:val="17"/>
               </w:rPr>
-              <w:t>94,7</w:t>
+              <w:t>balanceado</w:t>
             </w:r>
           </w:p>
         </w:tc>
@@ -1891,7 +1658,7 @@
               <w:rPr>
                 <w:sz w:val="17"/>
               </w:rPr>
-              <w:t>95,3</w:t>
+              <w:t>200</w:t>
             </w:r>
           </w:p>
         </w:tc>
@@ -1905,7 +1672,7 @@
               <w:rPr>
                 <w:sz w:val="17"/>
               </w:rPr>
-              <w:t>96,0</w:t>
+              <w:t>100 %</w:t>
             </w:r>
           </w:p>
         </w:tc>
@@ -1919,7 +1686,7 @@
               <w:rPr>
                 <w:sz w:val="17"/>
               </w:rPr>
-              <w:t>95,3</w:t>
+              <w:t>500</w:t>
             </w:r>
           </w:p>
         </w:tc>
@@ -1933,7 +1700,7 @@
               <w:rPr>
                 <w:sz w:val="17"/>
               </w:rPr>
-              <w:t>95,3</w:t>
+              <w:t>93,3 %</w:t>
             </w:r>
           </w:p>
         </w:tc>
@@ -1949,7 +1716,7 @@
               <w:rPr>
                 <w:sz w:val="17"/>
               </w:rPr>
-              <w:t>Kernel Naive Bayes</w:t>
+              <w:t>B</w:t>
             </w:r>
           </w:p>
         </w:tc>
@@ -1963,7 +1730,7 @@
               <w:rPr>
                 <w:sz w:val="17"/>
               </w:rPr>
-              <w:t>96,0</w:t>
+              <w:t>estandarizado</w:t>
             </w:r>
           </w:p>
         </w:tc>
@@ -1977,7 +1744,7 @@
               <w:rPr>
                 <w:sz w:val="17"/>
               </w:rPr>
-              <w:t>96,0</w:t>
+              <w:t>200</w:t>
             </w:r>
           </w:p>
         </w:tc>
@@ -1991,7 +1758,7 @@
               <w:rPr>
                 <w:sz w:val="17"/>
               </w:rPr>
-              <w:t>96,0</w:t>
+              <w:t>96,7 %</w:t>
             </w:r>
           </w:p>
         </w:tc>
@@ -2005,7 +1772,7 @@
               <w:rPr>
                 <w:sz w:val="17"/>
               </w:rPr>
-              <w:t>95,3</w:t>
+              <w:t>211</w:t>
             </w:r>
           </w:p>
         </w:tc>
@@ -2019,7 +1786,7 @@
               <w:rPr>
                 <w:sz w:val="17"/>
               </w:rPr>
-              <w:t>96,0</w:t>
+              <w:t>100 %</w:t>
             </w:r>
           </w:p>
         </w:tc>
@@ -2035,7 +1802,7 @@
               <w:rPr>
                 <w:sz w:val="17"/>
               </w:rPr>
-              <w:t>Linear SVM</w:t>
+              <w:t>B</w:t>
             </w:r>
           </w:p>
         </w:tc>
@@ -2049,7 +1816,7 @@
               <w:rPr>
                 <w:sz w:val="17"/>
               </w:rPr>
-              <w:t>95,3</w:t>
+              <w:t>normalizado</w:t>
             </w:r>
           </w:p>
         </w:tc>
@@ -2063,7 +1830,7 @@
               <w:rPr>
                 <w:sz w:val="17"/>
               </w:rPr>
-              <w:t>96,7</w:t>
+              <w:t>200</w:t>
             </w:r>
           </w:p>
         </w:tc>
@@ -2077,7 +1844,7 @@
               <w:rPr>
                 <w:sz w:val="17"/>
               </w:rPr>
-              <w:t>96,7</w:t>
+              <w:t>90,0 %</w:t>
             </w:r>
           </w:p>
         </w:tc>
@@ -2091,7 +1858,7 @@
               <w:rPr>
                 <w:sz w:val="17"/>
               </w:rPr>
-              <w:t>96,0</w:t>
+              <w:t>500</w:t>
             </w:r>
           </w:p>
         </w:tc>
@@ -2105,7 +1872,205 @@
               <w:rPr>
                 <w:sz w:val="17"/>
               </w:rPr>
-              <w:t>95,3</w:t>
+              <w:t>100 %</w:t>
+            </w:r>
+          </w:p>
+        </w:tc>
+      </w:tr>
+    </w:tbl>
+    <w:p/>
+    <w:p>
+      <w:pPr>
+        <w:jc w:val="center"/>
+      </w:pPr>
+      <w:r>
+        <w:drawing>
+          <wp:inline xmlns:a="http://schemas.openxmlformats.org/drawingml/2006/main" xmlns:pic="http://schemas.openxmlformats.org/drawingml/2006/picture">
+            <wp:extent cx="5760720" cy="2310850"/>
+            <wp:docPr id="6" name="Picture 6"/>
+            <wp:cNvGraphicFramePr>
+              <a:graphicFrameLocks noChangeAspect="1"/>
+            </wp:cNvGraphicFramePr>
+            <a:graphic>
+              <a:graphicData uri="http://schemas.openxmlformats.org/drawingml/2006/picture">
+                <pic:pic>
+                  <pic:nvPicPr>
+                    <pic:cNvPr id="0" name="rev_iris_modelos.png"/>
+                    <pic:cNvPicPr/>
+                  </pic:nvPicPr>
+                  <pic:blipFill>
+                    <a:blip r:embed="rId14"/>
+                    <a:stretch>
+                      <a:fillRect/>
+                    </a:stretch>
+                  </pic:blipFill>
+                  <pic:spPr>
+                    <a:xfrm>
+                      <a:off x="0" y="0"/>
+                      <a:ext cx="5760720" cy="2310850"/>
+                    </a:xfrm>
+                    <a:prstGeom prst="rect"/>
+                  </pic:spPr>
+                </pic:pic>
+              </a:graphicData>
+            </a:graphic>
+          </wp:inline>
+        </w:drawing>
+      </w:r>
+    </w:p>
+    <w:p>
+      <w:pPr>
+        <w:jc w:val="center"/>
+      </w:pPr>
+      <w:r>
+        <w:rPr>
+          <w:i/>
+          <w:sz w:val="18"/>
+        </w:rPr>
+        <w:t>Perceptrón y Adaline sobre las cinco versiones de Iris.</w:t>
+      </w:r>
+    </w:p>
+    <w:p>
+      <w:r>
+        <w:rPr>
+          <w:b/>
+        </w:rPr>
+        <w:t>Resultados.</w:t>
+      </w:r>
+      <w:r>
+        <w:t xml:space="preserve"> En el problema A los dos modelos alcanzan el 100 por ciento de exactitud en las cinco versiones del dato. El perceptrón converge en 2 épocas y ese número no varía con ningún paso del procesamiento. Sobre el Adaline el escalado no modifica la exactitud, pero sí el número de épocas que transcurren hasta que el error cuadrático deja de cambiar. Con el dato crudo se requieren 372 épocas y con el dato estandarizado 40. El comportamiento se explica por la regla delta, en la que la corrección de cada peso es proporcional al valor de la entrada correspondiente. Al estar las cuatro medidas centradas en cero y con dispersión comparable, las correcciones tienen magnitudes similares entre variables y el error desciende de forma más regular. La versión normalizada, en cambio, agota el tope de 500 épocas sin que el error deje de descender, porque al comprimir las entradas al intervalo de cero a uno cada corrección es de menor magnitud y el mismo factor de aprendizaje avanza más despacio.</w:t>
+      </w:r>
+    </w:p>
+    <w:p>
+      <w:r>
+        <w:t>En el problema B el perceptrón no converge y agota las 200 épocas en las cinco versiones, dado que versicolor y virginica no admiten una separación lineal exacta. Aun así clasifica correctamente las 30 flores de prueba con el dato crudo, y desciende a 96,7 y 90 por ciento con el dato estandarizado y normalizado. Ese 100 por ciento admite una lectura matizada. Al no haber convergencia, los pesos finales corresponden a la última corrección aplicada dentro de la época 200, de modo que el resultado sobre 30 flores de prueba depende del estado particular en que el entrenamiento quedó interrumpido y no de una solución estable. El Adaline muestra el comportamiento inverso. Obtiene 93,3 por ciento con el dato crudo y 100 por ciento con el dato escalado, y con el dato estandarizado el error cuadrático se estabiliza en 211 épocas, por debajo del tope de 500.</w:t>
+      </w:r>
+    </w:p>
+    <w:p>
+      <w:pPr>
+        <w:pStyle w:val="Heading2"/>
+      </w:pPr>
+      <w:r>
+        <w:t>3. Banknote</w:t>
+      </w:r>
+    </w:p>
+    <w:p>
+      <w:r>
+        <w:t>El conjunto reúne 1372 billetes. De cada uno se obtuvo una imagen digitalizada a la que se aplicó una transformada wavelet, y de los coeficientes resultantes se derivaron cuatro descriptores de textura, la varianza, la asimetría, la curtosis y la entropía. La variable de clase indica si el billete es auténtico o falso.</w:t>
+      </w:r>
+    </w:p>
+    <w:p>
+      <w:pPr>
+        <w:pStyle w:val="Heading3"/>
+      </w:pPr>
+      <w:r>
+        <w:t>3.1 Cómo viene el dato</w:t>
+      </w:r>
+    </w:p>
+    <w:tbl>
+      <w:tblPr>
+        <w:tblStyle w:val="LightGrid-Accent1"/>
+        <w:tblW w:type="auto" w:w="0"/>
+        <w:jc w:val="center"/>
+        <w:tblLayout w:type="autofit"/>
+        <w:tblLook w:firstColumn="1" w:firstRow="1" w:lastColumn="0" w:lastRow="0" w:noHBand="0" w:noVBand="1" w:val="04A0"/>
+      </w:tblPr>
+      <w:tblGrid>
+        <w:gridCol w:w="1440"/>
+        <w:gridCol w:w="1440"/>
+        <w:gridCol w:w="1440"/>
+        <w:gridCol w:w="1440"/>
+        <w:gridCol w:w="1440"/>
+        <w:gridCol w:w="1440"/>
+      </w:tblGrid>
+      <w:tr>
+        <w:tc>
+          <w:tcPr>
+            <w:tcW w:type="dxa" w:w="1440"/>
+          </w:tcPr>
+          <w:p>
+            <w:r/>
+            <w:r>
+              <w:rPr>
+                <w:b/>
+                <w:sz w:val="17"/>
+              </w:rPr>
+              <w:t>Variable</w:t>
+            </w:r>
+          </w:p>
+        </w:tc>
+        <w:tc>
+          <w:tcPr>
+            <w:tcW w:type="dxa" w:w="1440"/>
+          </w:tcPr>
+          <w:p>
+            <w:r/>
+            <w:r>
+              <w:rPr>
+                <w:b/>
+                <w:sz w:val="17"/>
+              </w:rPr>
+              <w:t>Mínimo</w:t>
+            </w:r>
+          </w:p>
+        </w:tc>
+        <w:tc>
+          <w:tcPr>
+            <w:tcW w:type="dxa" w:w="1440"/>
+          </w:tcPr>
+          <w:p>
+            <w:r/>
+            <w:r>
+              <w:rPr>
+                <w:b/>
+                <w:sz w:val="17"/>
+              </w:rPr>
+              <w:t>Máximo</w:t>
+            </w:r>
+          </w:p>
+        </w:tc>
+        <w:tc>
+          <w:tcPr>
+            <w:tcW w:type="dxa" w:w="1440"/>
+          </w:tcPr>
+          <w:p>
+            <w:r/>
+            <w:r>
+              <w:rPr>
+                <w:b/>
+                <w:sz w:val="17"/>
+              </w:rPr>
+              <w:t>Media</w:t>
+            </w:r>
+          </w:p>
+        </w:tc>
+        <w:tc>
+          <w:tcPr>
+            <w:tcW w:type="dxa" w:w="1440"/>
+          </w:tcPr>
+          <w:p>
+            <w:r/>
+            <w:r>
+              <w:rPr>
+                <w:b/>
+                <w:sz w:val="17"/>
+              </w:rPr>
+              <w:t>Desviación</w:t>
+            </w:r>
+          </w:p>
+        </w:tc>
+        <w:tc>
+          <w:tcPr>
+            <w:tcW w:type="dxa" w:w="1440"/>
+          </w:tcPr>
+          <w:p>
+            <w:r/>
+            <w:r>
+              <w:rPr>
+                <w:b/>
+                <w:sz w:val="17"/>
+              </w:rPr>
+              <w:t>Valores fuera de 1,5 RIC</w:t>
             </w:r>
           </w:p>
         </w:tc>
@@ -2121,7 +2086,7 @@
               <w:rPr>
                 <w:sz w:val="17"/>
               </w:rPr>
-              <w:t>Quadratic SVM</w:t>
+              <w:t>varianza</w:t>
             </w:r>
           </w:p>
         </w:tc>
@@ -2135,7 +2100,7 @@
               <w:rPr>
                 <w:sz w:val="17"/>
               </w:rPr>
-              <w:t>96,7</w:t>
+              <w:t>−7,04</w:t>
             </w:r>
           </w:p>
         </w:tc>
@@ -2149,7 +2114,7 @@
               <w:rPr>
                 <w:sz w:val="17"/>
               </w:rPr>
-              <w:t>94,7</w:t>
+              <w:t>6,82</w:t>
             </w:r>
           </w:p>
         </w:tc>
@@ -2163,7 +2128,7 @@
               <w:rPr>
                 <w:sz w:val="17"/>
               </w:rPr>
-              <w:t>97,3</w:t>
+              <w:t>0,43</w:t>
             </w:r>
           </w:p>
         </w:tc>
@@ -2177,7 +2142,7 @@
               <w:rPr>
                 <w:sz w:val="17"/>
               </w:rPr>
-              <w:t>98,0</w:t>
+              <w:t>2,84</w:t>
             </w:r>
           </w:p>
         </w:tc>
@@ -2191,7 +2156,7 @@
               <w:rPr>
                 <w:sz w:val="17"/>
               </w:rPr>
-              <w:t>96,7</w:t>
+              <w:t>0</w:t>
             </w:r>
           </w:p>
         </w:tc>
@@ -2207,7 +2172,7 @@
               <w:rPr>
                 <w:sz w:val="17"/>
               </w:rPr>
-              <w:t>Cubic SVM</w:t>
+              <w:t>asimetría</w:t>
             </w:r>
           </w:p>
         </w:tc>
@@ -2221,7 +2186,7 @@
               <w:rPr>
                 <w:sz w:val="17"/>
               </w:rPr>
-              <w:t>95,3</w:t>
+              <w:t>−13,77</w:t>
             </w:r>
           </w:p>
         </w:tc>
@@ -2235,7 +2200,7 @@
               <w:rPr>
                 <w:sz w:val="17"/>
               </w:rPr>
-              <w:t>92,7</w:t>
+              <w:t>12,95</w:t>
             </w:r>
           </w:p>
         </w:tc>
@@ -2249,7 +2214,7 @@
               <w:rPr>
                 <w:sz w:val="17"/>
               </w:rPr>
-              <w:t>96,0</w:t>
+              <w:t>1,92</w:t>
             </w:r>
           </w:p>
         </w:tc>
@@ -2263,7 +2228,7 @@
               <w:rPr>
                 <w:sz w:val="17"/>
               </w:rPr>
-              <w:t>96,7</w:t>
+              <w:t>5,87</w:t>
             </w:r>
           </w:p>
         </w:tc>
@@ -2277,85 +2242,7 @@
               <w:rPr>
                 <w:sz w:val="17"/>
               </w:rPr>
-              <w:t>94,7</w:t>
-            </w:r>
-          </w:p>
-        </w:tc>
-      </w:tr>
-    </w:tbl>
-    <w:p/>
-    <w:tbl>
-      <w:tblPr>
-        <w:tblStyle w:val="LightGrid-Accent1"/>
-        <w:tblW w:type="auto" w:w="0"/>
-        <w:jc w:val="center"/>
-        <w:tblLayout w:type="autofit"/>
-        <w:tblLook w:firstColumn="1" w:firstRow="1" w:lastColumn="0" w:lastRow="0" w:noHBand="0" w:noVBand="1" w:val="04A0"/>
-      </w:tblPr>
-      <w:tblGrid>
-        <w:gridCol w:w="2160"/>
-        <w:gridCol w:w="2160"/>
-        <w:gridCol w:w="2160"/>
-        <w:gridCol w:w="2160"/>
-      </w:tblGrid>
-      <w:tr>
-        <w:tc>
-          <w:tcPr>
-            <w:tcW w:type="dxa" w:w="2160"/>
-          </w:tcPr>
-          <w:p>
-            <w:r/>
-            <w:r>
-              <w:rPr>
-                <w:b/>
-                <w:sz w:val="17"/>
-              </w:rPr>
-              <w:t>Paso</w:t>
-            </w:r>
-          </w:p>
-        </w:tc>
-        <w:tc>
-          <w:tcPr>
-            <w:tcW w:type="dxa" w:w="2160"/>
-          </w:tcPr>
-          <w:p>
-            <w:r/>
-            <w:r>
-              <w:rPr>
-                <w:b/>
-                <w:sz w:val="17"/>
-              </w:rPr>
-              <w:t>Filas</w:t>
-            </w:r>
-          </w:p>
-        </w:tc>
-        <w:tc>
-          <w:tcPr>
-            <w:tcW w:type="dxa" w:w="2160"/>
-          </w:tcPr>
-          <w:p>
-            <w:r/>
-            <w:r>
-              <w:rPr>
-                <w:b/>
-                <w:sz w:val="17"/>
-              </w:rPr>
-              <w:t>Mejor modelo</w:t>
-            </w:r>
-          </w:p>
-        </w:tc>
-        <w:tc>
-          <w:tcPr>
-            <w:tcW w:type="dxa" w:w="2160"/>
-          </w:tcPr>
-          <w:p>
-            <w:r/>
-            <w:r>
-              <w:rPr>
-                <w:b/>
-                <w:sz w:val="17"/>
-              </w:rPr>
-              <w:t>Exactitud</w:t>
+              <w:t>0</w:t>
             </w:r>
           </w:p>
         </w:tc>
@@ -2363,7 +2250,7 @@
       <w:tr>
         <w:tc>
           <w:tcPr>
-            <w:tcW w:type="dxa" w:w="2160"/>
+            <w:tcW w:type="dxa" w:w="1440"/>
           </w:tcPr>
           <w:p>
             <w:r/>
@@ -2371,13 +2258,13 @@
               <w:rPr>
                 <w:sz w:val="17"/>
               </w:rPr>
-              <w:t>Crudo</w:t>
+              <w:t>curtosis</w:t>
             </w:r>
           </w:p>
         </w:tc>
         <w:tc>
           <w:tcPr>
-            <w:tcW w:type="dxa" w:w="2160"/>
+            <w:tcW w:type="dxa" w:w="1440"/>
           </w:tcPr>
           <w:p>
             <w:r/>
@@ -2385,13 +2272,13 @@
               <w:rPr>
                 <w:sz w:val="17"/>
               </w:rPr>
-              <w:t>150</w:t>
+              <w:t>−5,29</w:t>
             </w:r>
           </w:p>
         </w:tc>
         <w:tc>
           <w:tcPr>
-            <w:tcW w:type="dxa" w:w="2160"/>
+            <w:tcW w:type="dxa" w:w="1440"/>
           </w:tcPr>
           <w:p>
             <w:r/>
@@ -2399,13 +2286,13 @@
               <w:rPr>
                 <w:sz w:val="17"/>
               </w:rPr>
-              <w:t>Linear y Quadratic Discriminant</w:t>
+              <w:t>17,93</w:t>
             </w:r>
           </w:p>
         </w:tc>
         <w:tc>
           <w:tcPr>
-            <w:tcW w:type="dxa" w:w="2160"/>
+            <w:tcW w:type="dxa" w:w="1440"/>
           </w:tcPr>
           <w:p>
             <w:r/>
@@ -2413,7 +2300,35 @@
               <w:rPr>
                 <w:sz w:val="17"/>
               </w:rPr>
-              <w:t>98,0 %</w:t>
+              <w:t>1,40</w:t>
+            </w:r>
+          </w:p>
+        </w:tc>
+        <w:tc>
+          <w:tcPr>
+            <w:tcW w:type="dxa" w:w="1440"/>
+          </w:tcPr>
+          <w:p>
+            <w:r/>
+            <w:r>
+              <w:rPr>
+                <w:sz w:val="17"/>
+              </w:rPr>
+              <w:t>4,31</w:t>
+            </w:r>
+          </w:p>
+        </w:tc>
+        <w:tc>
+          <w:tcPr>
+            <w:tcW w:type="dxa" w:w="1440"/>
+          </w:tcPr>
+          <w:p>
+            <w:r/>
+            <w:r>
+              <w:rPr>
+                <w:sz w:val="17"/>
+              </w:rPr>
+              <w:t>57</w:t>
             </w:r>
           </w:p>
         </w:tc>
@@ -2421,7 +2336,7 @@
       <w:tr>
         <w:tc>
           <w:tcPr>
-            <w:tcW w:type="dxa" w:w="2160"/>
+            <w:tcW w:type="dxa" w:w="1440"/>
           </w:tcPr>
           <w:p>
             <w:r/>
@@ -2429,13 +2344,13 @@
               <w:rPr>
                 <w:sz w:val="17"/>
               </w:rPr>
-              <w:t>Sin outliers</w:t>
+              <w:t>entropía</w:t>
             </w:r>
           </w:p>
         </w:tc>
         <w:tc>
           <w:tcPr>
-            <w:tcW w:type="dxa" w:w="2160"/>
+            <w:tcW w:type="dxa" w:w="1440"/>
           </w:tcPr>
           <w:p>
             <w:r/>
@@ -2443,13 +2358,13 @@
               <w:rPr>
                 <w:sz w:val="17"/>
               </w:rPr>
-              <w:t>150</w:t>
+              <w:t>−8,55</w:t>
             </w:r>
           </w:p>
         </w:tc>
         <w:tc>
           <w:tcPr>
-            <w:tcW w:type="dxa" w:w="2160"/>
+            <w:tcW w:type="dxa" w:w="1440"/>
           </w:tcPr>
           <w:p>
             <w:r/>
@@ -2457,13 +2372,13 @@
               <w:rPr>
                 <w:sz w:val="17"/>
               </w:rPr>
-              <w:t>Linear Discriminant</w:t>
+              <w:t>2,45</w:t>
             </w:r>
           </w:p>
         </w:tc>
         <w:tc>
           <w:tcPr>
-            <w:tcW w:type="dxa" w:w="2160"/>
+            <w:tcW w:type="dxa" w:w="1440"/>
           </w:tcPr>
           <w:p>
             <w:r/>
@@ -2471,15 +2386,13 @@
               <w:rPr>
                 <w:sz w:val="17"/>
               </w:rPr>
-              <w:t>98,0 %</w:t>
+              <w:t>−1,19</w:t>
             </w:r>
           </w:p>
         </w:tc>
-      </w:tr>
-      <w:tr>
         <w:tc>
           <w:tcPr>
-            <w:tcW w:type="dxa" w:w="2160"/>
+            <w:tcW w:type="dxa" w:w="1440"/>
           </w:tcPr>
           <w:p>
             <w:r/>
@@ -2487,13 +2400,13 @@
               <w:rPr>
                 <w:sz w:val="17"/>
               </w:rPr>
-              <w:t>Balanceado</w:t>
+              <w:t>2,10</w:t>
             </w:r>
           </w:p>
         </w:tc>
         <w:tc>
           <w:tcPr>
-            <w:tcW w:type="dxa" w:w="2160"/>
+            <w:tcW w:type="dxa" w:w="1440"/>
           </w:tcPr>
           <w:p>
             <w:r/>
@@ -2501,151 +2414,7 @@
               <w:rPr>
                 <w:sz w:val="17"/>
               </w:rPr>
-              <w:t>150</w:t>
-            </w:r>
-          </w:p>
-        </w:tc>
-        <w:tc>
-          <w:tcPr>
-            <w:tcW w:type="dxa" w:w="2160"/>
-          </w:tcPr>
-          <w:p>
-            <w:r/>
-            <w:r>
-              <w:rPr>
-                <w:sz w:val="17"/>
-              </w:rPr>
-              <w:t>Efficient Linear SVM</w:t>
-            </w:r>
-          </w:p>
-        </w:tc>
-        <w:tc>
-          <w:tcPr>
-            <w:tcW w:type="dxa" w:w="2160"/>
-          </w:tcPr>
-          <w:p>
-            <w:r/>
-            <w:r>
-              <w:rPr>
-                <w:sz w:val="17"/>
-              </w:rPr>
-              <w:t>98,7 %</w:t>
-            </w:r>
-          </w:p>
-        </w:tc>
-      </w:tr>
-      <w:tr>
-        <w:tc>
-          <w:tcPr>
-            <w:tcW w:type="dxa" w:w="2160"/>
-          </w:tcPr>
-          <w:p>
-            <w:r/>
-            <w:r>
-              <w:rPr>
-                <w:sz w:val="17"/>
-              </w:rPr>
-              <w:t>Estandarizado</w:t>
-            </w:r>
-          </w:p>
-        </w:tc>
-        <w:tc>
-          <w:tcPr>
-            <w:tcW w:type="dxa" w:w="2160"/>
-          </w:tcPr>
-          <w:p>
-            <w:r/>
-            <w:r>
-              <w:rPr>
-                <w:sz w:val="17"/>
-              </w:rPr>
-              <w:t>150</w:t>
-            </w:r>
-          </w:p>
-        </w:tc>
-        <w:tc>
-          <w:tcPr>
-            <w:tcW w:type="dxa" w:w="2160"/>
-          </w:tcPr>
-          <w:p>
-            <w:r/>
-            <w:r>
-              <w:rPr>
-                <w:sz w:val="17"/>
-              </w:rPr>
-              <w:t>Linear Discriminant, Quadratic Discriminant, Quadratic SVM</w:t>
-            </w:r>
-          </w:p>
-        </w:tc>
-        <w:tc>
-          <w:tcPr>
-            <w:tcW w:type="dxa" w:w="2160"/>
-          </w:tcPr>
-          <w:p>
-            <w:r/>
-            <w:r>
-              <w:rPr>
-                <w:sz w:val="17"/>
-              </w:rPr>
-              <w:t>98,0 %</w:t>
-            </w:r>
-          </w:p>
-        </w:tc>
-      </w:tr>
-      <w:tr>
-        <w:tc>
-          <w:tcPr>
-            <w:tcW w:type="dxa" w:w="2160"/>
-          </w:tcPr>
-          <w:p>
-            <w:r/>
-            <w:r>
-              <w:rPr>
-                <w:sz w:val="17"/>
-              </w:rPr>
-              <w:t>Normalizado</w:t>
-            </w:r>
-          </w:p>
-        </w:tc>
-        <w:tc>
-          <w:tcPr>
-            <w:tcW w:type="dxa" w:w="2160"/>
-          </w:tcPr>
-          <w:p>
-            <w:r/>
-            <w:r>
-              <w:rPr>
-                <w:sz w:val="17"/>
-              </w:rPr>
-              <w:t>150</w:t>
-            </w:r>
-          </w:p>
-        </w:tc>
-        <w:tc>
-          <w:tcPr>
-            <w:tcW w:type="dxa" w:w="2160"/>
-          </w:tcPr>
-          <w:p>
-            <w:r/>
-            <w:r>
-              <w:rPr>
-                <w:sz w:val="17"/>
-              </w:rPr>
-              <w:t>Linear Discriminant</w:t>
-            </w:r>
-          </w:p>
-        </w:tc>
-        <w:tc>
-          <w:tcPr>
-            <w:tcW w:type="dxa" w:w="2160"/>
-          </w:tcPr>
-          <w:p>
-            <w:r/>
-            <w:r>
-              <w:rPr>
-                <w:sz w:val="17"/>
-              </w:rPr>
-              <w:t>98,0 %</w:t>
+              <w:t>33</w:t>
             </w:r>
           </w:p>
         </w:tc>
@@ -2654,28 +2423,7 @@
     <w:p/>
     <w:p>
       <w:r>
-        <w:t>En Iris ningún paso ayudó de verdad, y eso es lo que había que ver. El dataset viene limpio, balanceado y con las cuatro medidas en la misma escala, así que corregir outliers, balancear y escalar no tenían nada que corregir. El discriminante lineal da 98 % en las cinco versiones. Las subidas y bajadas de las otras filas son de una o dos flores y cambian con solo volver a repartir los pliegues. El único modelo al que sí le importa el escalado es el SVM, que con datos estandarizados sube al 98 %.</w:t>
-      </w:r>
-    </w:p>
-    <w:p>
-      <w:pPr>
-        <w:pStyle w:val="Heading2"/>
-      </w:pPr>
-      <w:r>
-        <w:t>2. Banknote</w:t>
-      </w:r>
-    </w:p>
-    <w:p>
-      <w:r>
-        <w:t>1372 billetes. A cada uno le tomaron una foto, le aplicaron una transformada wavelet y de ahí sacaron cuatro números que describen la textura: varianza, asimetría, curtosis y entropía. La clase es si el billete es auténtico o falso.</w:t>
-      </w:r>
-    </w:p>
-    <w:p>
-      <w:pPr>
-        <w:pStyle w:val="Heading3"/>
-      </w:pPr>
-      <w:r>
-        <w:t>2.1 Dato crudo</w:t>
+        <w:t>Las 1372 filas están completas y no se detectaron valores faltantes en ninguna de las cuatro variables.</w:t>
       </w:r>
     </w:p>
     <w:p>
@@ -2686,7 +2434,7 @@
         <w:drawing>
           <wp:inline xmlns:a="http://schemas.openxmlformats.org/drawingml/2006/main" xmlns:pic="http://schemas.openxmlformats.org/drawingml/2006/picture">
             <wp:extent cx="5760720" cy="4244474"/>
-            <wp:docPr id="8" name="Picture 8"/>
+            <wp:docPr id="7" name="Picture 7"/>
             <wp:cNvGraphicFramePr>
               <a:graphicFrameLocks noChangeAspect="1"/>
             </wp:cNvGraphicFramePr>
@@ -2698,7 +2446,7 @@
                     <pic:cNvPicPr/>
                   </pic:nvPicPr>
                   <pic:blipFill>
-                    <a:blip r:embed="rId16"/>
+                    <a:blip r:embed="rId15"/>
                     <a:stretch>
                       <a:fillRect/>
                     </a:stretch>
@@ -2726,7 +2474,7 @@
           <w:i/>
           <w:sz w:val="18"/>
         </w:rPr>
-        <w:t>La varianza separa bastante: los falsos se concentran en valores negativos. La entropía casi no distingue.</w:t>
+        <w:t>La varianza discrimina apreciablemente entre las dos clases y los billetes falsos se concentran en valores negativos. La entropía apenas aporta separación.</w:t>
       </w:r>
     </w:p>
     <w:p>
@@ -2737,7 +2485,7 @@
         <w:drawing>
           <wp:inline xmlns:a="http://schemas.openxmlformats.org/drawingml/2006/main" xmlns:pic="http://schemas.openxmlformats.org/drawingml/2006/picture">
             <wp:extent cx="5760720" cy="3672378"/>
-            <wp:docPr id="9" name="Picture 9"/>
+            <wp:docPr id="8" name="Picture 8"/>
             <wp:cNvGraphicFramePr>
               <a:graphicFrameLocks noChangeAspect="1"/>
             </wp:cNvGraphicFramePr>
@@ -2749,7 +2497,7 @@
                     <pic:cNvPicPr/>
                   </pic:nvPicPr>
                   <pic:blipFill>
-                    <a:blip r:embed="rId17"/>
+                    <a:blip r:embed="rId16"/>
                     <a:stretch>
                       <a:fillRect/>
                     </a:stretch>
@@ -2777,7 +2525,7 @@
           <w:i/>
           <w:sz w:val="18"/>
         </w:rPr>
-        <w:t>Cuatro escalas distintas. La curtosis llega a 18 y la entropía no pasa de 2,5. Aquí sí va a importar escalar.</w:t>
+        <w:t>Cuatro escalas distintas. La curtosis llega a 18 y la entropía no pasa de 2,5.</w:t>
       </w:r>
     </w:p>
     <w:p>
@@ -2788,7 +2536,7 @@
         <w:drawing>
           <wp:inline xmlns:a="http://schemas.openxmlformats.org/drawingml/2006/main" xmlns:pic="http://schemas.openxmlformats.org/drawingml/2006/picture">
             <wp:extent cx="5760720" cy="4244295"/>
-            <wp:docPr id="10" name="Picture 10"/>
+            <wp:docPr id="9" name="Picture 9"/>
             <wp:cNvGraphicFramePr>
               <a:graphicFrameLocks noChangeAspect="1"/>
             </wp:cNvGraphicFramePr>
@@ -2800,7 +2548,7 @@
                     <pic:cNvPicPr/>
                   </pic:nvPicPr>
                   <pic:blipFill>
-                    <a:blip r:embed="rId18"/>
+                    <a:blip r:embed="rId17"/>
                     <a:stretch>
                       <a:fillRect/>
                     </a:stretch>
@@ -2828,7 +2576,7 @@
           <w:i/>
           <w:sz w:val="18"/>
         </w:rPr>
-        <w:t>762 auténticos y 610 falsos. Desbalance suave.</w:t>
+        <w:t>La distribución es de 762 billetes auténticos frente a 610 falsos, un desbalance moderado.</w:t>
       </w:r>
     </w:p>
     <w:p>
@@ -2839,7 +2587,7 @@
         <w:drawing>
           <wp:inline xmlns:a="http://schemas.openxmlformats.org/drawingml/2006/main" xmlns:pic="http://schemas.openxmlformats.org/drawingml/2006/picture">
             <wp:extent cx="5760720" cy="4695773"/>
-            <wp:docPr id="11" name="Picture 11"/>
+            <wp:docPr id="10" name="Picture 10"/>
             <wp:cNvGraphicFramePr>
               <a:graphicFrameLocks noChangeAspect="1"/>
             </wp:cNvGraphicFramePr>
@@ -2851,7 +2599,7 @@
                     <pic:cNvPicPr/>
                   </pic:nvPicPr>
                   <pic:blipFill>
-                    <a:blip r:embed="rId19"/>
+                    <a:blip r:embed="rId18"/>
                     <a:stretch>
                       <a:fillRect/>
                     </a:stretch>
@@ -2879,100 +2627,7 @@
           <w:i/>
           <w:sz w:val="18"/>
         </w:rPr>
-        <w:t>Varianza contra asimetría. Con solo esas dos ya casi se separan.</w:t>
-      </w:r>
-    </w:p>
-    <w:p>
-      <w:pPr>
-        <w:jc w:val="center"/>
-      </w:pPr>
-      <w:r>
-        <w:rPr>
-          <w:i/>
-          <w:sz w:val="18"/>
-        </w:rPr>
-        <w:t>Classification Learner con T0_crudo, validación cruzada de 5 pliegues.</w:t>
-      </w:r>
-    </w:p>
-    <w:tbl>
-      <w:tblPr>
-        <w:tblStyle w:val="LightGrid-Accent1"/>
-        <w:tblW w:type="auto" w:w="0"/>
-        <w:jc w:val="center"/>
-        <w:tblLayout w:type="autofit"/>
-        <w:tblLook w:firstColumn="1" w:firstRow="1" w:lastColumn="0" w:lastRow="0" w:noHBand="0" w:noVBand="1" w:val="04A0"/>
-      </w:tblPr>
-      <w:tblGrid>
-        <w:gridCol w:w="4320"/>
-        <w:gridCol w:w="4320"/>
-      </w:tblGrid>
-      <w:tr>
-        <w:tc>
-          <w:tcPr>
-            <w:tcW w:type="dxa" w:w="4320"/>
-          </w:tcPr>
-          <w:p>
-            <w:r/>
-            <w:r>
-              <w:rPr>
-                <w:b/>
-                <w:sz w:val="17"/>
-              </w:rPr>
-              <w:t>Mejor modelo</w:t>
-            </w:r>
-          </w:p>
-        </w:tc>
-        <w:tc>
-          <w:tcPr>
-            <w:tcW w:type="dxa" w:w="4320"/>
-          </w:tcPr>
-          <w:p>
-            <w:r/>
-            <w:r>
-              <w:rPr>
-                <w:b/>
-                <w:sz w:val="17"/>
-              </w:rPr>
-              <w:t>Exactitud</w:t>
-            </w:r>
-          </w:p>
-        </w:tc>
-      </w:tr>
-      <w:tr>
-        <w:tc>
-          <w:tcPr>
-            <w:tcW w:type="dxa" w:w="4320"/>
-          </w:tcPr>
-          <w:p>
-            <w:r/>
-            <w:r>
-              <w:rPr>
-                <w:sz w:val="17"/>
-              </w:rPr>
-              <w:t>Quadratic SVM, Fine Gaussian SVM y Medium Gaussian SVM</w:t>
-            </w:r>
-          </w:p>
-        </w:tc>
-        <w:tc>
-          <w:tcPr>
-            <w:tcW w:type="dxa" w:w="4320"/>
-          </w:tcPr>
-          <w:p>
-            <w:r/>
-            <w:r>
-              <w:rPr>
-                <w:sz w:val="17"/>
-              </w:rPr>
-              <w:t>100 %</w:t>
-            </w:r>
-          </w:p>
-        </w:tc>
-      </w:tr>
-    </w:tbl>
-    <w:p/>
-    <w:p>
-      <w:r>
-        <w:t>Con el dato crudo, sin tocar nada, tres SVM clasifican los 1372 billetes sin un solo error, y los KNN quedan en 99,9 %. El SVM lineal se queda en 98,8 % y el Naive Bayes gaussiano en 84,2 %.</w:t>
+        <w:t>Varianza contra asimetría. Las dos nubes están separadas, pero la línea que las divide no es recta.</w:t>
       </w:r>
     </w:p>
     <w:p>
@@ -2980,12 +2635,12 @@
         <w:pStyle w:val="Heading3"/>
       </w:pPr>
       <w:r>
-        <w:t>2.2 Corrigiendo outliers</w:t>
+        <w:t>3.2 Efecto de cada paso sobre el dato</w:t>
       </w:r>
     </w:p>
     <w:p>
       <w:r>
-        <w:t>Regla del 1,5 por rango intercuartil, recortando al borde. Se recortan 57 valores de curtosis y 33 de entropía.</w:t>
+        <w:t>El recorte de atípicos afecta las colas de la curtosis y de la entropía, que son las dos variables con valores fuera del intervalo del rango intercuartil. El balanceo toma 610 auténticos al azar para igualar a los 610 falsos, con lo que quedan 1220 filas. La estandarización lleva las cuatro variables a una escala común, y ese es el cambio visible más importante de todo el procesamiento en este conjunto.</w:t>
       </w:r>
     </w:p>
     <w:p>
@@ -2996,7 +2651,7 @@
         <w:drawing>
           <wp:inline xmlns:a="http://schemas.openxmlformats.org/drawingml/2006/main" xmlns:pic="http://schemas.openxmlformats.org/drawingml/2006/picture">
             <wp:extent cx="5760720" cy="3672378"/>
-            <wp:docPr id="12" name="Picture 12"/>
+            <wp:docPr id="11" name="Picture 11"/>
             <wp:cNvGraphicFramePr>
               <a:graphicFrameLocks noChangeAspect="1"/>
             </wp:cNvGraphicFramePr>
@@ -3008,7 +2663,7 @@
                     <pic:cNvPicPr/>
                   </pic:nvPicPr>
                   <pic:blipFill>
-                    <a:blip r:embed="rId20"/>
+                    <a:blip r:embed="rId19"/>
                     <a:stretch>
                       <a:fillRect/>
                     </a:stretch>
@@ -3036,89 +2691,7 @@
           <w:i/>
           <w:sz w:val="18"/>
         </w:rPr>
-        <w:t>Se recortan las colas de la curtosis y la entropía.</w:t>
-      </w:r>
-    </w:p>
-    <w:p>
-      <w:r>
-        <w:t>No se corrió en la app. Como el crudo ya daba 100 %, se saltó directo a la última versión del dato para ver si el procesamiento completo cambiaba algo.</w:t>
-      </w:r>
-    </w:p>
-    <w:p>
-      <w:pPr>
-        <w:pStyle w:val="Heading3"/>
-      </w:pPr>
-      <w:r>
-        <w:t>2.3 Balanceando las clases</w:t>
-      </w:r>
-    </w:p>
-    <w:p>
-      <w:r>
-        <w:t>Se toman 610 auténticos al azar para igualar a los 610 falsos. Quedan 1220 filas.</w:t>
-      </w:r>
-    </w:p>
-    <w:p>
-      <w:pPr>
-        <w:jc w:val="center"/>
-      </w:pPr>
-      <w:r>
-        <w:drawing>
-          <wp:inline xmlns:a="http://schemas.openxmlformats.org/drawingml/2006/main" xmlns:pic="http://schemas.openxmlformats.org/drawingml/2006/picture">
-            <wp:extent cx="5760720" cy="4244295"/>
-            <wp:docPr id="13" name="Picture 13"/>
-            <wp:cNvGraphicFramePr>
-              <a:graphicFrameLocks noChangeAspect="1"/>
-            </wp:cNvGraphicFramePr>
-            <a:graphic>
-              <a:graphicData uri="http://schemas.openxmlformats.org/drawingml/2006/picture">
-                <pic:pic>
-                  <pic:nvPicPr>
-                    <pic:cNvPr id="0" name="rev_banknote_balance_despues.png"/>
-                    <pic:cNvPicPr/>
-                  </pic:nvPicPr>
-                  <pic:blipFill>
-                    <a:blip r:embed="rId21"/>
-                    <a:stretch>
-                      <a:fillRect/>
-                    </a:stretch>
-                  </pic:blipFill>
-                  <pic:spPr>
-                    <a:xfrm>
-                      <a:off x="0" y="0"/>
-                      <a:ext cx="5760720" cy="4244295"/>
-                    </a:xfrm>
-                    <a:prstGeom prst="rect"/>
-                  </pic:spPr>
-                </pic:pic>
-              </a:graphicData>
-            </a:graphic>
-          </wp:inline>
-        </w:drawing>
-      </w:r>
-    </w:p>
-    <w:p>
-      <w:pPr>
-        <w:jc w:val="center"/>
-      </w:pPr>
-      <w:r>
-        <w:rPr>
-          <w:i/>
-          <w:sz w:val="18"/>
-        </w:rPr>
-        <w:t>610 y 610.</w:t>
-      </w:r>
-    </w:p>
-    <w:p>
-      <w:r>
-        <w:t>No se corrió en la app por la misma razón.</w:t>
-      </w:r>
-    </w:p>
-    <w:p>
-      <w:pPr>
-        <w:pStyle w:val="Heading3"/>
-      </w:pPr>
-      <w:r>
-        <w:t>2.4 Estandarizando</w:t>
+        <w:t>El recorte afecta las colas de la curtosis y de la entropía.</w:t>
       </w:r>
     </w:p>
     <w:p>
@@ -3129,7 +2702,7 @@
         <w:drawing>
           <wp:inline xmlns:a="http://schemas.openxmlformats.org/drawingml/2006/main" xmlns:pic="http://schemas.openxmlformats.org/drawingml/2006/picture">
             <wp:extent cx="5760720" cy="3647814"/>
-            <wp:docPr id="14" name="Picture 14"/>
+            <wp:docPr id="12" name="Picture 12"/>
             <wp:cNvGraphicFramePr>
               <a:graphicFrameLocks noChangeAspect="1"/>
             </wp:cNvGraphicFramePr>
@@ -3141,7 +2714,7 @@
                     <pic:cNvPicPr/>
                   </pic:nvPicPr>
                   <pic:blipFill>
-                    <a:blip r:embed="rId22"/>
+                    <a:blip r:embed="rId20"/>
                     <a:stretch>
                       <a:fillRect/>
                     </a:stretch>
@@ -3169,12 +2742,7 @@
           <w:i/>
           <w:sz w:val="18"/>
         </w:rPr>
-        <w:t>Ahora las cuatro se comparan.</w:t>
-      </w:r>
-    </w:p>
-    <w:p>
-      <w:r>
-        <w:t>No se corrió en la app.</w:t>
+        <w:t>Tras la estandarización las cuatro variables quedan en una escala común y sus dispersiones resultan comparables.</w:t>
       </w:r>
     </w:p>
     <w:p>
@@ -3182,14 +2750,640 @@
         <w:pStyle w:val="Heading3"/>
       </w:pPr>
       <w:r>
-        <w:t>2.5 Normalizando</w:t>
+        <w:t>3.3 Perceptrón y Adaline sobre cada versión</w:t>
       </w:r>
     </w:p>
     <w:p>
       <w:r>
-        <w:t>Es el dato con todo el procesamiento encima: sin outliers, balanceado y entre 0 y 1.</w:t>
+        <w:t>La exactitud se mide en el 30 por ciento de prueba, 412 billetes en las dos primeras versiones y 366 en las balanceadas.</w:t>
       </w:r>
     </w:p>
+    <w:tbl>
+      <w:tblPr>
+        <w:tblStyle w:val="LightGrid-Accent1"/>
+        <w:tblW w:type="auto" w:w="0"/>
+        <w:jc w:val="center"/>
+        <w:tblLayout w:type="autofit"/>
+        <w:tblLook w:firstColumn="1" w:firstRow="1" w:lastColumn="0" w:lastRow="0" w:noHBand="0" w:noVBand="1" w:val="04A0"/>
+      </w:tblPr>
+      <w:tblGrid>
+        <w:gridCol w:w="1234"/>
+        <w:gridCol w:w="1234"/>
+        <w:gridCol w:w="1234"/>
+        <w:gridCol w:w="1234"/>
+        <w:gridCol w:w="1234"/>
+        <w:gridCol w:w="1234"/>
+        <w:gridCol w:w="1234"/>
+      </w:tblGrid>
+      <w:tr>
+        <w:tc>
+          <w:tcPr>
+            <w:tcW w:type="dxa" w:w="1234"/>
+          </w:tcPr>
+          <w:p>
+            <w:r/>
+            <w:r>
+              <w:rPr>
+                <w:b/>
+                <w:sz w:val="17"/>
+              </w:rPr>
+              <w:t>Paso</w:t>
+            </w:r>
+          </w:p>
+        </w:tc>
+        <w:tc>
+          <w:tcPr>
+            <w:tcW w:type="dxa" w:w="1234"/>
+          </w:tcPr>
+          <w:p>
+            <w:r/>
+            <w:r>
+              <w:rPr>
+                <w:b/>
+                <w:sz w:val="17"/>
+              </w:rPr>
+              <w:t>Filas</w:t>
+            </w:r>
+          </w:p>
+        </w:tc>
+        <w:tc>
+          <w:tcPr>
+            <w:tcW w:type="dxa" w:w="1234"/>
+          </w:tcPr>
+          <w:p>
+            <w:r/>
+            <w:r>
+              <w:rPr>
+                <w:b/>
+                <w:sz w:val="17"/>
+              </w:rPr>
+              <w:t>Perceptrón, épocas</w:t>
+            </w:r>
+          </w:p>
+        </w:tc>
+        <w:tc>
+          <w:tcPr>
+            <w:tcW w:type="dxa" w:w="1234"/>
+          </w:tcPr>
+          <w:p>
+            <w:r/>
+            <w:r>
+              <w:rPr>
+                <w:b/>
+                <w:sz w:val="17"/>
+              </w:rPr>
+              <w:t>Perceptrón, exactitud</w:t>
+            </w:r>
+          </w:p>
+        </w:tc>
+        <w:tc>
+          <w:tcPr>
+            <w:tcW w:type="dxa" w:w="1234"/>
+          </w:tcPr>
+          <w:p>
+            <w:r/>
+            <w:r>
+              <w:rPr>
+                <w:b/>
+                <w:sz w:val="17"/>
+              </w:rPr>
+              <w:t>Adaline, épocas</w:t>
+            </w:r>
+          </w:p>
+        </w:tc>
+        <w:tc>
+          <w:tcPr>
+            <w:tcW w:type="dxa" w:w="1234"/>
+          </w:tcPr>
+          <w:p>
+            <w:r/>
+            <w:r>
+              <w:rPr>
+                <w:b/>
+                <w:sz w:val="17"/>
+              </w:rPr>
+              <w:t>Adaline, error cuadrático final</w:t>
+            </w:r>
+          </w:p>
+        </w:tc>
+        <w:tc>
+          <w:tcPr>
+            <w:tcW w:type="dxa" w:w="1234"/>
+          </w:tcPr>
+          <w:p>
+            <w:r/>
+            <w:r>
+              <w:rPr>
+                <w:b/>
+                <w:sz w:val="17"/>
+              </w:rPr>
+              <w:t>Adaline, exactitud</w:t>
+            </w:r>
+          </w:p>
+        </w:tc>
+      </w:tr>
+      <w:tr>
+        <w:tc>
+          <w:tcPr>
+            <w:tcW w:type="dxa" w:w="1234"/>
+          </w:tcPr>
+          <w:p>
+            <w:r/>
+            <w:r>
+              <w:rPr>
+                <w:sz w:val="17"/>
+              </w:rPr>
+              <w:t>crudo</w:t>
+            </w:r>
+          </w:p>
+        </w:tc>
+        <w:tc>
+          <w:tcPr>
+            <w:tcW w:type="dxa" w:w="1234"/>
+          </w:tcPr>
+          <w:p>
+            <w:r/>
+            <w:r>
+              <w:rPr>
+                <w:sz w:val="17"/>
+              </w:rPr>
+              <w:t>1372</w:t>
+            </w:r>
+          </w:p>
+        </w:tc>
+        <w:tc>
+          <w:tcPr>
+            <w:tcW w:type="dxa" w:w="1234"/>
+          </w:tcPr>
+          <w:p>
+            <w:r/>
+            <w:r>
+              <w:rPr>
+                <w:sz w:val="17"/>
+              </w:rPr>
+              <w:t>200</w:t>
+            </w:r>
+          </w:p>
+        </w:tc>
+        <w:tc>
+          <w:tcPr>
+            <w:tcW w:type="dxa" w:w="1234"/>
+          </w:tcPr>
+          <w:p>
+            <w:r/>
+            <w:r>
+              <w:rPr>
+                <w:sz w:val="17"/>
+              </w:rPr>
+              <w:t>99,0 %</w:t>
+            </w:r>
+          </w:p>
+        </w:tc>
+        <w:tc>
+          <w:tcPr>
+            <w:tcW w:type="dxa" w:w="1234"/>
+          </w:tcPr>
+          <w:p>
+            <w:r/>
+            <w:r>
+              <w:rPr>
+                <w:sz w:val="17"/>
+              </w:rPr>
+              <w:t>6</w:t>
+            </w:r>
+          </w:p>
+        </w:tc>
+        <w:tc>
+          <w:tcPr>
+            <w:tcW w:type="dxa" w:w="1234"/>
+          </w:tcPr>
+          <w:p>
+            <w:r/>
+            <w:r>
+              <w:rPr>
+                <w:sz w:val="17"/>
+              </w:rPr>
+              <w:t>46,8</w:t>
+            </w:r>
+          </w:p>
+        </w:tc>
+        <w:tc>
+          <w:tcPr>
+            <w:tcW w:type="dxa" w:w="1234"/>
+          </w:tcPr>
+          <w:p>
+            <w:r/>
+            <w:r>
+              <w:rPr>
+                <w:sz w:val="17"/>
+              </w:rPr>
+              <w:t>97,3 %</w:t>
+            </w:r>
+          </w:p>
+        </w:tc>
+      </w:tr>
+      <w:tr>
+        <w:tc>
+          <w:tcPr>
+            <w:tcW w:type="dxa" w:w="1234"/>
+          </w:tcPr>
+          <w:p>
+            <w:r/>
+            <w:r>
+              <w:rPr>
+                <w:sz w:val="17"/>
+              </w:rPr>
+              <w:t>sin outliers</w:t>
+            </w:r>
+          </w:p>
+        </w:tc>
+        <w:tc>
+          <w:tcPr>
+            <w:tcW w:type="dxa" w:w="1234"/>
+          </w:tcPr>
+          <w:p>
+            <w:r/>
+            <w:r>
+              <w:rPr>
+                <w:sz w:val="17"/>
+              </w:rPr>
+              <w:t>1372</w:t>
+            </w:r>
+          </w:p>
+        </w:tc>
+        <w:tc>
+          <w:tcPr>
+            <w:tcW w:type="dxa" w:w="1234"/>
+          </w:tcPr>
+          <w:p>
+            <w:r/>
+            <w:r>
+              <w:rPr>
+                <w:sz w:val="17"/>
+              </w:rPr>
+              <w:t>200</w:t>
+            </w:r>
+          </w:p>
+        </w:tc>
+        <w:tc>
+          <w:tcPr>
+            <w:tcW w:type="dxa" w:w="1234"/>
+          </w:tcPr>
+          <w:p>
+            <w:r/>
+            <w:r>
+              <w:rPr>
+                <w:sz w:val="17"/>
+              </w:rPr>
+              <w:t>98,8 %</w:t>
+            </w:r>
+          </w:p>
+        </w:tc>
+        <w:tc>
+          <w:tcPr>
+            <w:tcW w:type="dxa" w:w="1234"/>
+          </w:tcPr>
+          <w:p>
+            <w:r/>
+            <w:r>
+              <w:rPr>
+                <w:sz w:val="17"/>
+              </w:rPr>
+              <w:t>6</w:t>
+            </w:r>
+          </w:p>
+        </w:tc>
+        <w:tc>
+          <w:tcPr>
+            <w:tcW w:type="dxa" w:w="1234"/>
+          </w:tcPr>
+          <w:p>
+            <w:r/>
+            <w:r>
+              <w:rPr>
+                <w:sz w:val="17"/>
+              </w:rPr>
+              <w:t>32,1</w:t>
+            </w:r>
+          </w:p>
+        </w:tc>
+        <w:tc>
+          <w:tcPr>
+            <w:tcW w:type="dxa" w:w="1234"/>
+          </w:tcPr>
+          <w:p>
+            <w:r/>
+            <w:r>
+              <w:rPr>
+                <w:sz w:val="17"/>
+              </w:rPr>
+              <w:t>97,3 %</w:t>
+            </w:r>
+          </w:p>
+        </w:tc>
+      </w:tr>
+      <w:tr>
+        <w:tc>
+          <w:tcPr>
+            <w:tcW w:type="dxa" w:w="1234"/>
+          </w:tcPr>
+          <w:p>
+            <w:r/>
+            <w:r>
+              <w:rPr>
+                <w:sz w:val="17"/>
+              </w:rPr>
+              <w:t>balanceado</w:t>
+            </w:r>
+          </w:p>
+        </w:tc>
+        <w:tc>
+          <w:tcPr>
+            <w:tcW w:type="dxa" w:w="1234"/>
+          </w:tcPr>
+          <w:p>
+            <w:r/>
+            <w:r>
+              <w:rPr>
+                <w:sz w:val="17"/>
+              </w:rPr>
+              <w:t>1220</w:t>
+            </w:r>
+          </w:p>
+        </w:tc>
+        <w:tc>
+          <w:tcPr>
+            <w:tcW w:type="dxa" w:w="1234"/>
+          </w:tcPr>
+          <w:p>
+            <w:r/>
+            <w:r>
+              <w:rPr>
+                <w:sz w:val="17"/>
+              </w:rPr>
+              <w:t>43</w:t>
+            </w:r>
+          </w:p>
+        </w:tc>
+        <w:tc>
+          <w:tcPr>
+            <w:tcW w:type="dxa" w:w="1234"/>
+          </w:tcPr>
+          <w:p>
+            <w:r/>
+            <w:r>
+              <w:rPr>
+                <w:sz w:val="17"/>
+              </w:rPr>
+              <w:t>98,9 %</w:t>
+            </w:r>
+          </w:p>
+        </w:tc>
+        <w:tc>
+          <w:tcPr>
+            <w:tcW w:type="dxa" w:w="1234"/>
+          </w:tcPr>
+          <w:p>
+            <w:r/>
+            <w:r>
+              <w:rPr>
+                <w:sz w:val="17"/>
+              </w:rPr>
+              <w:t>6</w:t>
+            </w:r>
+          </w:p>
+        </w:tc>
+        <w:tc>
+          <w:tcPr>
+            <w:tcW w:type="dxa" w:w="1234"/>
+          </w:tcPr>
+          <w:p>
+            <w:r/>
+            <w:r>
+              <w:rPr>
+                <w:sz w:val="17"/>
+              </w:rPr>
+              <w:t>29,4</w:t>
+            </w:r>
+          </w:p>
+        </w:tc>
+        <w:tc>
+          <w:tcPr>
+            <w:tcW w:type="dxa" w:w="1234"/>
+          </w:tcPr>
+          <w:p>
+            <w:r/>
+            <w:r>
+              <w:rPr>
+                <w:sz w:val="17"/>
+              </w:rPr>
+              <w:t>95,9 %</w:t>
+            </w:r>
+          </w:p>
+        </w:tc>
+      </w:tr>
+      <w:tr>
+        <w:tc>
+          <w:tcPr>
+            <w:tcW w:type="dxa" w:w="1234"/>
+          </w:tcPr>
+          <w:p>
+            <w:r/>
+            <w:r>
+              <w:rPr>
+                <w:sz w:val="17"/>
+              </w:rPr>
+              <w:t>estandarizado</w:t>
+            </w:r>
+          </w:p>
+        </w:tc>
+        <w:tc>
+          <w:tcPr>
+            <w:tcW w:type="dxa" w:w="1234"/>
+          </w:tcPr>
+          <w:p>
+            <w:r/>
+            <w:r>
+              <w:rPr>
+                <w:sz w:val="17"/>
+              </w:rPr>
+              <w:t>1220</w:t>
+            </w:r>
+          </w:p>
+        </w:tc>
+        <w:tc>
+          <w:tcPr>
+            <w:tcW w:type="dxa" w:w="1234"/>
+          </w:tcPr>
+          <w:p>
+            <w:r/>
+            <w:r>
+              <w:rPr>
+                <w:sz w:val="17"/>
+              </w:rPr>
+              <w:t>23</w:t>
+            </w:r>
+          </w:p>
+        </w:tc>
+        <w:tc>
+          <w:tcPr>
+            <w:tcW w:type="dxa" w:w="1234"/>
+          </w:tcPr>
+          <w:p>
+            <w:r/>
+            <w:r>
+              <w:rPr>
+                <w:sz w:val="17"/>
+              </w:rPr>
+              <w:t>99,2 %</w:t>
+            </w:r>
+          </w:p>
+        </w:tc>
+        <w:tc>
+          <w:tcPr>
+            <w:tcW w:type="dxa" w:w="1234"/>
+          </w:tcPr>
+          <w:p>
+            <w:r/>
+            <w:r>
+              <w:rPr>
+                <w:sz w:val="17"/>
+              </w:rPr>
+              <w:t>7</w:t>
+            </w:r>
+          </w:p>
+        </w:tc>
+        <w:tc>
+          <w:tcPr>
+            <w:tcW w:type="dxa" w:w="1234"/>
+          </w:tcPr>
+          <w:p>
+            <w:r/>
+            <w:r>
+              <w:rPr>
+                <w:sz w:val="17"/>
+              </w:rPr>
+              <w:t>13,4</w:t>
+            </w:r>
+          </w:p>
+        </w:tc>
+        <w:tc>
+          <w:tcPr>
+            <w:tcW w:type="dxa" w:w="1234"/>
+          </w:tcPr>
+          <w:p>
+            <w:r/>
+            <w:r>
+              <w:rPr>
+                <w:sz w:val="17"/>
+              </w:rPr>
+              <w:t>97,5 %</w:t>
+            </w:r>
+          </w:p>
+        </w:tc>
+      </w:tr>
+      <w:tr>
+        <w:tc>
+          <w:tcPr>
+            <w:tcW w:type="dxa" w:w="1234"/>
+          </w:tcPr>
+          <w:p>
+            <w:r/>
+            <w:r>
+              <w:rPr>
+                <w:sz w:val="17"/>
+              </w:rPr>
+              <w:t>normalizado</w:t>
+            </w:r>
+          </w:p>
+        </w:tc>
+        <w:tc>
+          <w:tcPr>
+            <w:tcW w:type="dxa" w:w="1234"/>
+          </w:tcPr>
+          <w:p>
+            <w:r/>
+            <w:r>
+              <w:rPr>
+                <w:sz w:val="17"/>
+              </w:rPr>
+              <w:t>1220</w:t>
+            </w:r>
+          </w:p>
+        </w:tc>
+        <w:tc>
+          <w:tcPr>
+            <w:tcW w:type="dxa" w:w="1234"/>
+          </w:tcPr>
+          <w:p>
+            <w:r/>
+            <w:r>
+              <w:rPr>
+                <w:sz w:val="17"/>
+              </w:rPr>
+              <w:t>42</w:t>
+            </w:r>
+          </w:p>
+        </w:tc>
+        <w:tc>
+          <w:tcPr>
+            <w:tcW w:type="dxa" w:w="1234"/>
+          </w:tcPr>
+          <w:p>
+            <w:r/>
+            <w:r>
+              <w:rPr>
+                <w:sz w:val="17"/>
+              </w:rPr>
+              <w:t>98,9 %</w:t>
+            </w:r>
+          </w:p>
+        </w:tc>
+        <w:tc>
+          <w:tcPr>
+            <w:tcW w:type="dxa" w:w="1234"/>
+          </w:tcPr>
+          <w:p>
+            <w:r/>
+            <w:r>
+              <w:rPr>
+                <w:sz w:val="17"/>
+              </w:rPr>
+              <w:t>161</w:t>
+            </w:r>
+          </w:p>
+        </w:tc>
+        <w:tc>
+          <w:tcPr>
+            <w:tcW w:type="dxa" w:w="1234"/>
+          </w:tcPr>
+          <w:p>
+            <w:r/>
+            <w:r>
+              <w:rPr>
+                <w:sz w:val="17"/>
+              </w:rPr>
+              <w:t>13,1</w:t>
+            </w:r>
+          </w:p>
+        </w:tc>
+        <w:tc>
+          <w:tcPr>
+            <w:tcW w:type="dxa" w:w="1234"/>
+          </w:tcPr>
+          <w:p>
+            <w:r/>
+            <w:r>
+              <w:rPr>
+                <w:sz w:val="17"/>
+              </w:rPr>
+              <w:t>97,3 %</w:t>
+            </w:r>
+          </w:p>
+        </w:tc>
+      </w:tr>
+    </w:tbl>
+    <w:p/>
     <w:p>
       <w:pPr>
         <w:jc w:val="center"/>
@@ -3197,8 +3391,8 @@
       <w:r>
         <w:drawing>
           <wp:inline xmlns:a="http://schemas.openxmlformats.org/drawingml/2006/main" xmlns:pic="http://schemas.openxmlformats.org/drawingml/2006/picture">
-            <wp:extent cx="5760720" cy="3676504"/>
-            <wp:docPr id="15" name="Picture 15"/>
+            <wp:extent cx="5760720" cy="3599555"/>
+            <wp:docPr id="13" name="Picture 13"/>
             <wp:cNvGraphicFramePr>
               <a:graphicFrameLocks noChangeAspect="1"/>
             </wp:cNvGraphicFramePr>
@@ -3206,11 +3400,11 @@
               <a:graphicData uri="http://schemas.openxmlformats.org/drawingml/2006/picture">
                 <pic:pic>
                   <pic:nvPicPr>
-                    <pic:cNvPr id="0" name="rev_banknote_boxplot_normalizado.png"/>
+                    <pic:cNvPr id="0" name="rev_banknote_modelos.png"/>
                     <pic:cNvPicPr/>
                   </pic:nvPicPr>
                   <pic:blipFill>
-                    <a:blip r:embed="rId23"/>
+                    <a:blip r:embed="rId21"/>
                     <a:stretch>
                       <a:fillRect/>
                     </a:stretch>
@@ -3218,7 +3412,7 @@
                   <pic:spPr>
                     <a:xfrm>
                       <a:off x="0" y="0"/>
-                      <a:ext cx="5760720" cy="3676504"/>
+                      <a:ext cx="5760720" cy="3599555"/>
                     </a:xfrm>
                     <a:prstGeom prst="rect"/>
                   </pic:spPr>
@@ -3238,764 +3432,33 @@
           <w:i/>
           <w:sz w:val="18"/>
         </w:rPr>
-        <w:t>Todo entre 0 y 1.</w:t>
+        <w:t>Perceptrón y Adaline sobre las cinco versiones de banknote.</w:t>
       </w:r>
     </w:p>
-    <w:p>
-      <w:pPr>
-        <w:jc w:val="center"/>
-      </w:pPr>
-      <w:r>
-        <w:rPr>
-          <w:i/>
-          <w:sz w:val="18"/>
-        </w:rPr>
-        <w:t>Classification Learner con T4_normalizado, 1220 billetes.</w:t>
-      </w:r>
-    </w:p>
-    <w:tbl>
-      <w:tblPr>
-        <w:tblStyle w:val="LightGrid-Accent1"/>
-        <w:tblW w:type="auto" w:w="0"/>
-        <w:jc w:val="center"/>
-        <w:tblLayout w:type="autofit"/>
-        <w:tblLook w:firstColumn="1" w:firstRow="1" w:lastColumn="0" w:lastRow="0" w:noHBand="0" w:noVBand="1" w:val="04A0"/>
-      </w:tblPr>
-      <w:tblGrid>
-        <w:gridCol w:w="2880"/>
-        <w:gridCol w:w="2880"/>
-        <w:gridCol w:w="2880"/>
-      </w:tblGrid>
-      <w:tr>
-        <w:tc>
-          <w:tcPr>
-            <w:tcW w:type="dxa" w:w="2880"/>
-          </w:tcPr>
-          <w:p>
-            <w:r/>
-            <w:r>
-              <w:rPr>
-                <w:b/>
-                <w:sz w:val="17"/>
-              </w:rPr>
-              <w:t>Mejor modelo</w:t>
-            </w:r>
-          </w:p>
-        </w:tc>
-        <w:tc>
-          <w:tcPr>
-            <w:tcW w:type="dxa" w:w="2880"/>
-          </w:tcPr>
-          <w:p>
-            <w:r/>
-            <w:r>
-              <w:rPr>
-                <w:b/>
-                <w:sz w:val="17"/>
-              </w:rPr>
-              <w:t>Exactitud</w:t>
-            </w:r>
-          </w:p>
-        </w:tc>
-        <w:tc>
-          <w:tcPr>
-            <w:tcW w:type="dxa" w:w="2880"/>
-          </w:tcPr>
-          <w:p>
-            <w:r/>
-            <w:r>
-              <w:rPr>
-                <w:b/>
-                <w:sz w:val="17"/>
-              </w:rPr>
-              <w:t>Cambió</w:t>
-            </w:r>
-          </w:p>
-        </w:tc>
-      </w:tr>
-      <w:tr>
-        <w:tc>
-          <w:tcPr>
-            <w:tcW w:type="dxa" w:w="2880"/>
-          </w:tcPr>
-          <w:p>
-            <w:r/>
-            <w:r>
-              <w:rPr>
-                <w:sz w:val="17"/>
-              </w:rPr>
-              <w:t>Cubic SVM y Fine Gaussian SVM</w:t>
-            </w:r>
-          </w:p>
-        </w:tc>
-        <w:tc>
-          <w:tcPr>
-            <w:tcW w:type="dxa" w:w="2880"/>
-          </w:tcPr>
-          <w:p>
-            <w:r/>
-            <w:r>
-              <w:rPr>
-                <w:sz w:val="17"/>
-              </w:rPr>
-              <w:t>100 %</w:t>
-            </w:r>
-          </w:p>
-        </w:tc>
-        <w:tc>
-          <w:tcPr>
-            <w:tcW w:type="dxa" w:w="2880"/>
-          </w:tcPr>
-          <w:p>
-            <w:r/>
-            <w:r>
-              <w:rPr>
-                <w:sz w:val="17"/>
-              </w:rPr>
-              <w:t>no</w:t>
-            </w:r>
-          </w:p>
-        </w:tc>
-      </w:tr>
-    </w:tbl>
-    <w:p/>
-    <w:p>
-      <w:r>
-        <w:t>Lo mismo que con el crudo. Cambia cuál SVM llega al 100 % y cuál se queda en 99,9 %, pero eso es un billete de 1220.</w:t>
-      </w:r>
-    </w:p>
-    <w:p>
-      <w:pPr>
-        <w:pStyle w:val="Heading3"/>
-      </w:pPr>
-      <w:r>
-        <w:t>2.6 Qué pasó en banknote</w:t>
-      </w:r>
-    </w:p>
-    <w:p>
-      <w:r>
-        <w:t>Los modelos de la app en los dos pasos que se corrieron, exactitud de validación en %:</w:t>
-      </w:r>
-    </w:p>
-    <w:tbl>
-      <w:tblPr>
-        <w:tblStyle w:val="LightGrid-Accent1"/>
-        <w:tblW w:type="auto" w:w="0"/>
-        <w:jc w:val="center"/>
-        <w:tblLayout w:type="autofit"/>
-        <w:tblLook w:firstColumn="1" w:firstRow="1" w:lastColumn="0" w:lastRow="0" w:noHBand="0" w:noVBand="1" w:val="04A0"/>
-      </w:tblPr>
-      <w:tblGrid>
-        <w:gridCol w:w="2880"/>
-        <w:gridCol w:w="2880"/>
-        <w:gridCol w:w="2880"/>
-      </w:tblGrid>
-      <w:tr>
-        <w:tc>
-          <w:tcPr>
-            <w:tcW w:type="dxa" w:w="2880"/>
-          </w:tcPr>
-          <w:p>
-            <w:r/>
-            <w:r>
-              <w:rPr>
-                <w:b/>
-                <w:sz w:val="17"/>
-              </w:rPr>
-              <w:t>Modelo</w:t>
-            </w:r>
-          </w:p>
-        </w:tc>
-        <w:tc>
-          <w:tcPr>
-            <w:tcW w:type="dxa" w:w="2880"/>
-          </w:tcPr>
-          <w:p>
-            <w:r/>
-            <w:r>
-              <w:rPr>
-                <w:b/>
-                <w:sz w:val="17"/>
-              </w:rPr>
-              <w:t>T0 crudo (1372)</w:t>
-            </w:r>
-          </w:p>
-        </w:tc>
-        <w:tc>
-          <w:tcPr>
-            <w:tcW w:type="dxa" w:w="2880"/>
-          </w:tcPr>
-          <w:p>
-            <w:r/>
-            <w:r>
-              <w:rPr>
-                <w:b/>
-                <w:sz w:val="17"/>
-              </w:rPr>
-              <w:t>T4 procesado (1220)</w:t>
-            </w:r>
-          </w:p>
-        </w:tc>
-      </w:tr>
-      <w:tr>
-        <w:tc>
-          <w:tcPr>
-            <w:tcW w:type="dxa" w:w="2880"/>
-          </w:tcPr>
-          <w:p>
-            <w:r/>
-            <w:r>
-              <w:rPr>
-                <w:sz w:val="17"/>
-              </w:rPr>
-              <w:t>Gaussian Naive Bayes</w:t>
-            </w:r>
-          </w:p>
-        </w:tc>
-        <w:tc>
-          <w:tcPr>
-            <w:tcW w:type="dxa" w:w="2880"/>
-          </w:tcPr>
-          <w:p>
-            <w:r/>
-            <w:r>
-              <w:rPr>
-                <w:sz w:val="17"/>
-              </w:rPr>
-              <w:t>84,2</w:t>
-            </w:r>
-          </w:p>
-        </w:tc>
-        <w:tc>
-          <w:tcPr>
-            <w:tcW w:type="dxa" w:w="2880"/>
-          </w:tcPr>
-          <w:p>
-            <w:r/>
-            <w:r>
-              <w:rPr>
-                <w:sz w:val="17"/>
-              </w:rPr>
-              <w:t>84,8</w:t>
-            </w:r>
-          </w:p>
-        </w:tc>
-      </w:tr>
-      <w:tr>
-        <w:tc>
-          <w:tcPr>
-            <w:tcW w:type="dxa" w:w="2880"/>
-          </w:tcPr>
-          <w:p>
-            <w:r/>
-            <w:r>
-              <w:rPr>
-                <w:sz w:val="17"/>
-              </w:rPr>
-              <w:t>Kernel Naive Bayes</w:t>
-            </w:r>
-          </w:p>
-        </w:tc>
-        <w:tc>
-          <w:tcPr>
-            <w:tcW w:type="dxa" w:w="2880"/>
-          </w:tcPr>
-          <w:p>
-            <w:r/>
-            <w:r>
-              <w:rPr>
-                <w:sz w:val="17"/>
-              </w:rPr>
-              <w:t>91,6</w:t>
-            </w:r>
-          </w:p>
-        </w:tc>
-        <w:tc>
-          <w:tcPr>
-            <w:tcW w:type="dxa" w:w="2880"/>
-          </w:tcPr>
-          <w:p>
-            <w:r/>
-            <w:r>
-              <w:rPr>
-                <w:sz w:val="17"/>
-              </w:rPr>
-              <w:t>92,4</w:t>
-            </w:r>
-          </w:p>
-        </w:tc>
-      </w:tr>
-      <w:tr>
-        <w:tc>
-          <w:tcPr>
-            <w:tcW w:type="dxa" w:w="2880"/>
-          </w:tcPr>
-          <w:p>
-            <w:r/>
-            <w:r>
-              <w:rPr>
-                <w:sz w:val="17"/>
-              </w:rPr>
-              <w:t>Linear SVM</w:t>
-            </w:r>
-          </w:p>
-        </w:tc>
-        <w:tc>
-          <w:tcPr>
-            <w:tcW w:type="dxa" w:w="2880"/>
-          </w:tcPr>
-          <w:p>
-            <w:r/>
-            <w:r>
-              <w:rPr>
-                <w:sz w:val="17"/>
-              </w:rPr>
-              <w:t>98,8</w:t>
-            </w:r>
-          </w:p>
-        </w:tc>
-        <w:tc>
-          <w:tcPr>
-            <w:tcW w:type="dxa" w:w="2880"/>
-          </w:tcPr>
-          <w:p>
-            <w:r/>
-            <w:r>
-              <w:rPr>
-                <w:sz w:val="17"/>
-              </w:rPr>
-              <w:t>98,8</w:t>
-            </w:r>
-          </w:p>
-        </w:tc>
-      </w:tr>
-      <w:tr>
-        <w:tc>
-          <w:tcPr>
-            <w:tcW w:type="dxa" w:w="2880"/>
-          </w:tcPr>
-          <w:p>
-            <w:r/>
-            <w:r>
-              <w:rPr>
-                <w:sz w:val="17"/>
-              </w:rPr>
-              <w:t>Quadratic SVM</w:t>
-            </w:r>
-          </w:p>
-        </w:tc>
-        <w:tc>
-          <w:tcPr>
-            <w:tcW w:type="dxa" w:w="2880"/>
-          </w:tcPr>
-          <w:p>
-            <w:r/>
-            <w:r>
-              <w:rPr>
-                <w:sz w:val="17"/>
-              </w:rPr>
-              <w:t>100</w:t>
-            </w:r>
-          </w:p>
-        </w:tc>
-        <w:tc>
-          <w:tcPr>
-            <w:tcW w:type="dxa" w:w="2880"/>
-          </w:tcPr>
-          <w:p>
-            <w:r/>
-            <w:r>
-              <w:rPr>
-                <w:sz w:val="17"/>
-              </w:rPr>
-              <w:t>99,9</w:t>
-            </w:r>
-          </w:p>
-        </w:tc>
-      </w:tr>
-      <w:tr>
-        <w:tc>
-          <w:tcPr>
-            <w:tcW w:type="dxa" w:w="2880"/>
-          </w:tcPr>
-          <w:p>
-            <w:r/>
-            <w:r>
-              <w:rPr>
-                <w:sz w:val="17"/>
-              </w:rPr>
-              <w:t>Cubic SVM</w:t>
-            </w:r>
-          </w:p>
-        </w:tc>
-        <w:tc>
-          <w:tcPr>
-            <w:tcW w:type="dxa" w:w="2880"/>
-          </w:tcPr>
-          <w:p>
-            <w:r/>
-            <w:r>
-              <w:rPr>
-                <w:sz w:val="17"/>
-              </w:rPr>
-              <w:t>99,9</w:t>
-            </w:r>
-          </w:p>
-        </w:tc>
-        <w:tc>
-          <w:tcPr>
-            <w:tcW w:type="dxa" w:w="2880"/>
-          </w:tcPr>
-          <w:p>
-            <w:r/>
-            <w:r>
-              <w:rPr>
-                <w:sz w:val="17"/>
-              </w:rPr>
-              <w:t>100</w:t>
-            </w:r>
-          </w:p>
-        </w:tc>
-      </w:tr>
-      <w:tr>
-        <w:tc>
-          <w:tcPr>
-            <w:tcW w:type="dxa" w:w="2880"/>
-          </w:tcPr>
-          <w:p>
-            <w:r/>
-            <w:r>
-              <w:rPr>
-                <w:sz w:val="17"/>
-              </w:rPr>
-              <w:t>Fine Gaussian SVM</w:t>
-            </w:r>
-          </w:p>
-        </w:tc>
-        <w:tc>
-          <w:tcPr>
-            <w:tcW w:type="dxa" w:w="2880"/>
-          </w:tcPr>
-          <w:p>
-            <w:r/>
-            <w:r>
-              <w:rPr>
-                <w:sz w:val="17"/>
-              </w:rPr>
-              <w:t>100</w:t>
-            </w:r>
-          </w:p>
-        </w:tc>
-        <w:tc>
-          <w:tcPr>
-            <w:tcW w:type="dxa" w:w="2880"/>
-          </w:tcPr>
-          <w:p>
-            <w:r/>
-            <w:r>
-              <w:rPr>
-                <w:sz w:val="17"/>
-              </w:rPr>
-              <w:t>100</w:t>
-            </w:r>
-          </w:p>
-        </w:tc>
-      </w:tr>
-      <w:tr>
-        <w:tc>
-          <w:tcPr>
-            <w:tcW w:type="dxa" w:w="2880"/>
-          </w:tcPr>
-          <w:p>
-            <w:r/>
-            <w:r>
-              <w:rPr>
-                <w:sz w:val="17"/>
-              </w:rPr>
-              <w:t>Medium Gaussian SVM</w:t>
-            </w:r>
-          </w:p>
-        </w:tc>
-        <w:tc>
-          <w:tcPr>
-            <w:tcW w:type="dxa" w:w="2880"/>
-          </w:tcPr>
-          <w:p>
-            <w:r/>
-            <w:r>
-              <w:rPr>
-                <w:sz w:val="17"/>
-              </w:rPr>
-              <w:t>100</w:t>
-            </w:r>
-          </w:p>
-        </w:tc>
-        <w:tc>
-          <w:tcPr>
-            <w:tcW w:type="dxa" w:w="2880"/>
-          </w:tcPr>
-          <w:p>
-            <w:r/>
-            <w:r>
-              <w:rPr>
-                <w:sz w:val="17"/>
-              </w:rPr>
-              <w:t>99,8</w:t>
-            </w:r>
-          </w:p>
-        </w:tc>
-      </w:tr>
-      <w:tr>
-        <w:tc>
-          <w:tcPr>
-            <w:tcW w:type="dxa" w:w="2880"/>
-          </w:tcPr>
-          <w:p>
-            <w:r/>
-            <w:r>
-              <w:rPr>
-                <w:sz w:val="17"/>
-              </w:rPr>
-              <w:t>Coarse Gaussian SVM</w:t>
-            </w:r>
-          </w:p>
-        </w:tc>
-        <w:tc>
-          <w:tcPr>
-            <w:tcW w:type="dxa" w:w="2880"/>
-          </w:tcPr>
-          <w:p>
-            <w:r/>
-            <w:r>
-              <w:rPr>
-                <w:sz w:val="17"/>
-              </w:rPr>
-              <w:t>97,9</w:t>
-            </w:r>
-          </w:p>
-        </w:tc>
-        <w:tc>
-          <w:tcPr>
-            <w:tcW w:type="dxa" w:w="2880"/>
-          </w:tcPr>
-          <w:p>
-            <w:r/>
-            <w:r>
-              <w:rPr>
-                <w:sz w:val="17"/>
-              </w:rPr>
-              <w:t>97,5</w:t>
-            </w:r>
-          </w:p>
-        </w:tc>
-      </w:tr>
-      <w:tr>
-        <w:tc>
-          <w:tcPr>
-            <w:tcW w:type="dxa" w:w="2880"/>
-          </w:tcPr>
-          <w:p>
-            <w:r/>
-            <w:r>
-              <w:rPr>
-                <w:sz w:val="17"/>
-              </w:rPr>
-              <w:t>Fine KNN</w:t>
-            </w:r>
-          </w:p>
-        </w:tc>
-        <w:tc>
-          <w:tcPr>
-            <w:tcW w:type="dxa" w:w="2880"/>
-          </w:tcPr>
-          <w:p>
-            <w:r/>
-            <w:r>
-              <w:rPr>
-                <w:sz w:val="17"/>
-              </w:rPr>
-              <w:t>99,9</w:t>
-            </w:r>
-          </w:p>
-        </w:tc>
-        <w:tc>
-          <w:tcPr>
-            <w:tcW w:type="dxa" w:w="2880"/>
-          </w:tcPr>
-          <w:p>
-            <w:r/>
-            <w:r>
-              <w:rPr>
-                <w:sz w:val="17"/>
-              </w:rPr>
-              <w:t>99,8</w:t>
-            </w:r>
-          </w:p>
-        </w:tc>
-      </w:tr>
-      <w:tr>
-        <w:tc>
-          <w:tcPr>
-            <w:tcW w:type="dxa" w:w="2880"/>
-          </w:tcPr>
-          <w:p>
-            <w:r/>
-            <w:r>
-              <w:rPr>
-                <w:sz w:val="17"/>
-              </w:rPr>
-              <w:t>Medium KNN</w:t>
-            </w:r>
-          </w:p>
-        </w:tc>
-        <w:tc>
-          <w:tcPr>
-            <w:tcW w:type="dxa" w:w="2880"/>
-          </w:tcPr>
-          <w:p>
-            <w:r/>
-            <w:r>
-              <w:rPr>
-                <w:sz w:val="17"/>
-              </w:rPr>
-              <w:t>99,9</w:t>
-            </w:r>
-          </w:p>
-        </w:tc>
-        <w:tc>
-          <w:tcPr>
-            <w:tcW w:type="dxa" w:w="2880"/>
-          </w:tcPr>
-          <w:p>
-            <w:r/>
-            <w:r>
-              <w:rPr>
-                <w:sz w:val="17"/>
-              </w:rPr>
-              <w:t>99,7</w:t>
-            </w:r>
-          </w:p>
-        </w:tc>
-      </w:tr>
-      <w:tr>
-        <w:tc>
-          <w:tcPr>
-            <w:tcW w:type="dxa" w:w="2880"/>
-          </w:tcPr>
-          <w:p>
-            <w:r/>
-            <w:r>
-              <w:rPr>
-                <w:sz w:val="17"/>
-              </w:rPr>
-              <w:t>Coarse KNN</w:t>
-            </w:r>
-          </w:p>
-        </w:tc>
-        <w:tc>
-          <w:tcPr>
-            <w:tcW w:type="dxa" w:w="2880"/>
-          </w:tcPr>
-          <w:p>
-            <w:r/>
-            <w:r>
-              <w:rPr>
-                <w:sz w:val="17"/>
-              </w:rPr>
-              <w:t>97,3</w:t>
-            </w:r>
-          </w:p>
-        </w:tc>
-        <w:tc>
-          <w:tcPr>
-            <w:tcW w:type="dxa" w:w="2880"/>
-          </w:tcPr>
-          <w:p>
-            <w:r/>
-            <w:r>
-              <w:rPr>
-                <w:sz w:val="17"/>
-              </w:rPr>
-              <w:t>97,5</w:t>
-            </w:r>
-          </w:p>
-        </w:tc>
-      </w:tr>
-      <w:tr>
-        <w:tc>
-          <w:tcPr>
-            <w:tcW w:type="dxa" w:w="2880"/>
-          </w:tcPr>
-          <w:p>
-            <w:r/>
-            <w:r>
-              <w:rPr>
-                <w:sz w:val="17"/>
-              </w:rPr>
-              <w:t>Cosine KNN</w:t>
-            </w:r>
-          </w:p>
-        </w:tc>
-        <w:tc>
-          <w:tcPr>
-            <w:tcW w:type="dxa" w:w="2880"/>
-          </w:tcPr>
-          <w:p>
-            <w:r/>
-            <w:r>
-              <w:rPr>
-                <w:sz w:val="17"/>
-              </w:rPr>
-              <w:t>98,8</w:t>
-            </w:r>
-          </w:p>
-        </w:tc>
-        <w:tc>
-          <w:tcPr>
-            <w:tcW w:type="dxa" w:w="2880"/>
-          </w:tcPr>
-          <w:p>
-            <w:r/>
-            <w:r>
-              <w:rPr>
-                <w:sz w:val="17"/>
-              </w:rPr>
-              <w:t>99,1</w:t>
-            </w:r>
-          </w:p>
-        </w:tc>
-      </w:tr>
-    </w:tbl>
-    <w:p/>
     <w:p>
       <w:r>
         <w:rPr>
           <w:b/>
         </w:rPr>
-        <w:t>Por qué da 100 % con el dato crudo y también con el procesado.</w:t>
+        <w:t>Resultados.</w:t>
       </w:r>
       <w:r>
-        <w:t xml:space="preserve"> Hay dos preguntas distintas mezcladas aquí.</w:t>
+        <w:t xml:space="preserve"> La exactitud permanece prácticamente constante. El perceptrón se sitúa entre 98,8 y 99,2 por ciento y el Adaline entre 95,9 y 97,5 por ciento en las cinco versiones. Lo que varía de forma apreciable es el proceso de entrenamiento que conduce a ese resultado.</w:t>
       </w:r>
     </w:p>
     <w:p>
       <w:r>
-        <w:t>La primera es si las clases son linealmente separables, o sea si existe un plano que deje todos los auténticos de un lado y todos los falsos del otro. La respuesta es que casi, pero no del todo. El SVM lineal, que es el modelo que busca exactamente ese plano, se queda en 98,8 %: hay alrededor de 16 billetes que quedan del lado equivocado de cualquier plano. Eso coincide con lo que pasó en el taller con el perceptrón, que nunca convergió en 200 épocas sobre este dataset aunque acertara el 98 o 99 %. Si fueran linealmente separables el perceptrón tendría que haber convergido, por el teorema de convergencia.</w:t>
+        <w:t>El perceptrón no converge con el dato crudo ni con el dato sin atípicos, y agota en ambos casos las 200 épocas. Con el dato balanceado converge en 43 épocas, con el estandarizado en 23 y con el normalizado en 42. La lectura es que el conjunto de entrenamiento completo no admite una separación lineal exacta dentro del tope de épocas fijado, mientras que el subconjunto que resulta de retirar 152 billetes auténticos al azar sí la admite, y la neurona encuentra el plano separador. La exactitud en prueba no cambia y se mantiene alrededor del 99 por ciento, porque los billetes que ningún plano clasifica correctamente permanecen en el conjunto de prueba, que el balanceo no altera.</w:t>
       </w:r>
     </w:p>
     <w:p>
       <w:r>
-        <w:t>La segunda es si las clases se pueden separar con una frontera curva. Ahí la respuesta es sí, y limpiamente. El SVM cuadrático, el cúbico y el gaussiano llegan al 100 %, y los KNN al 99,9 %. Eso quiere decir que las dos clases no se traslapan en ninguna parte del espacio de las cuatro variables: no hay billetes auténticos y falsos con los mismos valores. Lo único que pasa es que la frontera que los separa tiene una curva que un plano no puede seguir. Se ve en la dispersión de varianza contra asimetría de la sección 2.1: las dos nubes están separadas pero la línea que las divide no es recta.</w:t>
+        <w:t>Sobre el Adaline el paso determinante es el escalado, y su efecto se aprecia en el error cuadrático final, que pasa de 46,8 con el dato crudo a 13,4 con el estandarizado. Sin escalar, la curtosis, cuyos valores llegan a 18, domina las correcciones de peso y el error se estanca en un valor alto, que es el efecto previsto cuando las entradas presentan escalas muy desiguales (LeCun et al., 1998). Conviene notar que el entrenamiento se detiene cuando el error cuadrático deja de cambiar entre épocas consecutivas, no cuando alcanza un valor pequeño, de modo que las 6 épocas de las tres primeras versiones no indican una convergencia rápida sino un estancamiento temprano en un error elevado. Con el dato normalizado el error final es 13,1, equivalente al del dato estandarizado, pero se alcanza en 161 épocas frente a 7, porque al quedar todas las entradas comprimidas en el intervalo de cero a uno cada corrección tiene menor magnitud y, con el mismo factor de aprendizaje de 0,01, el descenso del error se reparte a lo largo de más épocas.</w:t>
       </w:r>
     </w:p>
     <w:p>
       <w:r>
-        <w:t>Por eso el procesamiento no cambia nada. Quitar outliers recortando al borde no mueve ningún billete al otro lado de la frontera. Balancear quita 152 auténticos al azar, y una clase con 610 en vez de 762 sigue siendo la misma nube. Y escalar tampoco importa para el resultado, por una razón práctica: Classification Learner estandariza las entradas por defecto antes de entrenar los SVM y los KNN, así que a esos modelos les llega el dato ya escalado aunque uno le pase el crudo. Los únicos que sí ven el dato tal cual son los Naive Bayes, y son justamente los que peor van, 84 y 92 %, porque asumen que cada variable es una campana y las cuatro tienen colas largas.</w:t>
-      </w:r>
-    </w:p>
-    <w:p>
-      <w:r>
-        <w:t>En resumen: banknote no es linealmente separable, pero sí es separable, y con una frontera curva cualquier modelo flexible lo resuelve completo con el dato crudo. El preprocesamiento no tenía nada que arreglar.</w:t>
+        <w:t>El techo de aproximadamente 99 por ciento del perceptrón se explica por la geometría del problema. El teorema de convergencia del perceptrón garantiza que, si las dos clases son linealmente separables, el entrenamiento converge en un número finito de correcciones (Novikoff, 1962). El hecho de que sobre el conjunto completo no converja dentro de las 200 épocas fijadas constituye por tanto evidencia de que no existe un plano que deje todos los billetes auténticos a un lado y todos los falsos al otro, aunque el tope de épocas impide afirmarlo de forma concluyente. La gráfica de dispersión de varianza contra asimetría de la sección 3.1 muestra dos nubes bien diferenciadas, sin regiones donde ambas clases compartan los mismos valores, pero separadas por una frontera curva que un plano no puede reproducir. Una neurona única define exclusivamente fronteras lineales, y ninguno de los cuatro pasos de procesamiento modifica esa limitación. El recorte de atípicos al borde del intervalo no traslada ningún billete al lado opuesto de la frontera, el balanceo retira filas sin alterar la forma de las nubes, y el escalado cambia las unidades pero no la geometría.</w:t>
       </w:r>
     </w:p>
     <w:p>
@@ -4003,12 +3466,62 @@
         <w:pStyle w:val="Heading2"/>
       </w:pPr>
       <w:r>
-        <w:t>3. Conclusión</w:t>
+        <w:t>4. Conclusión</w:t>
       </w:r>
     </w:p>
     <w:p>
       <w:r>
-        <w:t>En ninguno de los dos datasets el preprocesamiento mejoró el mejor modelo, y eso es lo que había que aprender de esta revisión. Iris viene balanceado, en una sola escala y casi separable: el discriminante lineal da 98 % con las cinco versiones del dato y los 3 errores son flores de la frontera entre versicolor y virginica que ningún paso puede mover. Banknote tiene escalas distintas y un desbalance suave, pero las clases no se traslapan, así que un SVM con kernel llega al 100 % con el dato crudo y con el procesado. Lo que sí se vio en los dos es qué modelos dependen de la escala y cuáles no: discriminantes y árboles no la notan, los SVM sí, y la app se la corrige sola. Corregir outliers, balancear y escalar son pasos que hay que hacer cuando el dato lo necesita; estos dos no lo necesitaban, y la forma de saberlo fue mirar las gráficas antes de correr nada.</w:t>
+        <w:t>En ninguno de los dos conjuntos de datos el procesamiento mejoró la exactitud de forma apreciable, y ese es el resultado principal de la revisión. Iris llega balanceado, con las cuatro variables en una misma escala, y plantea un problema linealmente separable y otro que no lo es. Banknote presenta escalas heterogéneas y un desbalance moderado, pero sus clases no se superponen y la frontera que las divide es curva. En ambos casos el procesamiento sí modificó el entrenamiento. El escalado redujo en el Adaline las épocas de 372 a 40 en Iris y el error cuadrático final de 46,8 a 13,4 en banknote, y el balanceo permitió que el perceptrón convergiera en banknote cuando con el conjunto completo no lo hacía. La exactitud final se mantiene porque el límite no proviene de la calidad del dato sino de la capacidad del modelo. Una neurona única define una única frontera lineal, y allí donde las clases no admiten una separación lineal ningún paso de preparación del dato compensa esa restricción.</w:t>
+      </w:r>
+    </w:p>
+    <w:p>
+      <w:pPr>
+        <w:pStyle w:val="Heading2"/>
+      </w:pPr>
+      <w:r>
+        <w:t>Referencias</w:t>
+      </w:r>
+    </w:p>
+    <w:p>
+      <w:r>
+        <w:t xml:space="preserve">LeCun, Y., Bottou, L., Orr, G. B. y Müller, K. R. (1998). Efficient BackProp. En G. B. Orr y K. R. Müller (Eds.), </w:t>
+      </w:r>
+      <w:r>
+        <w:rPr>
+          <w:i/>
+        </w:rPr>
+        <w:t>Neural Networks: Tricks of the Trade</w:t>
+      </w:r>
+      <w:r>
+        <w:t xml:space="preserve"> (Lecture Notes in Computer Science, vol. 1524, pp. 9 a 50). Springer.</w:t>
+      </w:r>
+    </w:p>
+    <w:p>
+      <w:r>
+        <w:t xml:space="preserve">Novikoff, A. B. J. (1962). On convergence proofs on perceptrons. En </w:t>
+      </w:r>
+      <w:r>
+        <w:rPr>
+          <w:i/>
+        </w:rPr>
+        <w:t>Proceedings of the Symposium on the Mathematical Theory of Automata</w:t>
+      </w:r>
+      <w:r>
+        <w:t xml:space="preserve"> (vol. 12, pp. 615 a 622). Polytechnic Institute of Brooklyn.</w:t>
+      </w:r>
+    </w:p>
+    <w:p>
+      <w:r>
+        <w:t xml:space="preserve">Tukey, J. W. (1977). </w:t>
+      </w:r>
+      <w:r>
+        <w:rPr>
+          <w:i/>
+        </w:rPr>
+        <w:t>Exploratory Data Analysis</w:t>
+      </w:r>
+      <w:r>
+        <w:t>. Addison-Wesley.</w:t>
       </w:r>
     </w:p>
     <w:sectPr>

</xml_diff>

<commit_message>
Taller 1: bloque de autor con maestria y correo institucional
</commit_message>
<xml_diff>
--- a/Taller 1/Revision_datos.docx
+++ b/Taller 1/Revision_datos.docx
@@ -611,89 +611,11 @@
         <w:jc w:val="center"/>
       </w:pPr>
       <w:r>
-        <w:drawing>
-          <wp:inline xmlns:a="http://schemas.openxmlformats.org/drawingml/2006/main" xmlns:pic="http://schemas.openxmlformats.org/drawingml/2006/picture">
-            <wp:extent cx="5760720" cy="4417573"/>
-            <wp:docPr id="1" name="Picture 1"/>
-            <wp:cNvGraphicFramePr>
-              <a:graphicFrameLocks noChangeAspect="1"/>
-            </wp:cNvGraphicFramePr>
-            <a:graphic>
-              <a:graphicData uri="http://schemas.openxmlformats.org/drawingml/2006/picture">
-                <pic:pic>
-                  <pic:nvPicPr>
-                    <pic:cNvPr id="0" name="rev_iris_histogramas.png"/>
-                    <pic:cNvPicPr/>
-                  </pic:nvPicPr>
-                  <pic:blipFill>
-                    <a:blip r:embed="rId9"/>
-                    <a:stretch>
-                      <a:fillRect/>
-                    </a:stretch>
-                  </pic:blipFill>
-                  <pic:spPr>
-                    <a:xfrm>
-                      <a:off x="0" y="0"/>
-                      <a:ext cx="5760720" cy="4417573"/>
-                    </a:xfrm>
-                    <a:prstGeom prst="rect"/>
-                  </pic:spPr>
-                </pic:pic>
-              </a:graphicData>
-            </a:graphic>
-          </wp:inline>
-        </w:drawing>
-      </w:r>
-    </w:p>
-    <w:p>
-      <w:pPr>
-        <w:jc w:val="center"/>
-      </w:pPr>
-      <w:r>
         <w:rPr>
           <w:i/>
           <w:sz w:val="18"/>
         </w:rPr>
         <w:t>Las medidas del pétalo separan setosa de las otras dos especies por sí solas. Las del sépalo presentan un traslape mayor entre clases.</w:t>
-      </w:r>
-    </w:p>
-    <w:p>
-      <w:pPr>
-        <w:jc w:val="center"/>
-      </w:pPr>
-      <w:r>
-        <w:drawing>
-          <wp:inline xmlns:a="http://schemas.openxmlformats.org/drawingml/2006/main" xmlns:pic="http://schemas.openxmlformats.org/drawingml/2006/picture">
-            <wp:extent cx="5760720" cy="3639699"/>
-            <wp:docPr id="2" name="Picture 2"/>
-            <wp:cNvGraphicFramePr>
-              <a:graphicFrameLocks noChangeAspect="1"/>
-            </wp:cNvGraphicFramePr>
-            <a:graphic>
-              <a:graphicData uri="http://schemas.openxmlformats.org/drawingml/2006/picture">
-                <pic:pic>
-                  <pic:nvPicPr>
-                    <pic:cNvPr id="0" name="rev_iris_boxplot_crudo.png"/>
-                    <pic:cNvPicPr/>
-                  </pic:nvPicPr>
-                  <pic:blipFill>
-                    <a:blip r:embed="rId10"/>
-                    <a:stretch>
-                      <a:fillRect/>
-                    </a:stretch>
-                  </pic:blipFill>
-                  <pic:spPr>
-                    <a:xfrm>
-                      <a:off x="0" y="0"/>
-                      <a:ext cx="5760720" cy="3639699"/>
-                    </a:xfrm>
-                    <a:prstGeom prst="rect"/>
-                  </pic:spPr>
-                </pic:pic>
-              </a:graphicData>
-            </a:graphic>
-          </wp:inline>
-        </w:drawing>
       </w:r>
     </w:p>
     <w:p>
@@ -713,89 +635,11 @@
         <w:jc w:val="center"/>
       </w:pPr>
       <w:r>
-        <w:drawing>
-          <wp:inline xmlns:a="http://schemas.openxmlformats.org/drawingml/2006/main" xmlns:pic="http://schemas.openxmlformats.org/drawingml/2006/picture">
-            <wp:extent cx="5760720" cy="4348526"/>
-            <wp:docPr id="3" name="Picture 3"/>
-            <wp:cNvGraphicFramePr>
-              <a:graphicFrameLocks noChangeAspect="1"/>
-            </wp:cNvGraphicFramePr>
-            <a:graphic>
-              <a:graphicData uri="http://schemas.openxmlformats.org/drawingml/2006/picture">
-                <pic:pic>
-                  <pic:nvPicPr>
-                    <pic:cNvPr id="0" name="rev_iris_balance.png"/>
-                    <pic:cNvPicPr/>
-                  </pic:nvPicPr>
-                  <pic:blipFill>
-                    <a:blip r:embed="rId11"/>
-                    <a:stretch>
-                      <a:fillRect/>
-                    </a:stretch>
-                  </pic:blipFill>
-                  <pic:spPr>
-                    <a:xfrm>
-                      <a:off x="0" y="0"/>
-                      <a:ext cx="5760720" cy="4348526"/>
-                    </a:xfrm>
-                    <a:prstGeom prst="rect"/>
-                  </pic:spPr>
-                </pic:pic>
-              </a:graphicData>
-            </a:graphic>
-          </wp:inline>
-        </w:drawing>
-      </w:r>
-    </w:p>
-    <w:p>
-      <w:pPr>
-        <w:jc w:val="center"/>
-      </w:pPr>
-      <w:r>
         <w:rPr>
           <w:i/>
           <w:sz w:val="18"/>
         </w:rPr>
         <w:t>50 de cada clase. El conjunto ya viene balanceado.</w:t>
-      </w:r>
-    </w:p>
-    <w:p>
-      <w:pPr>
-        <w:jc w:val="center"/>
-      </w:pPr>
-      <w:r>
-        <w:drawing>
-          <wp:inline xmlns:a="http://schemas.openxmlformats.org/drawingml/2006/main" xmlns:pic="http://schemas.openxmlformats.org/drawingml/2006/picture">
-            <wp:extent cx="5760720" cy="4772962"/>
-            <wp:docPr id="4" name="Picture 4"/>
-            <wp:cNvGraphicFramePr>
-              <a:graphicFrameLocks noChangeAspect="1"/>
-            </wp:cNvGraphicFramePr>
-            <a:graphic>
-              <a:graphicData uri="http://schemas.openxmlformats.org/drawingml/2006/picture">
-                <pic:pic>
-                  <pic:nvPicPr>
-                    <pic:cNvPr id="0" name="rev_iris_dispersion.png"/>
-                    <pic:cNvPicPr/>
-                  </pic:nvPicPr>
-                  <pic:blipFill>
-                    <a:blip r:embed="rId12"/>
-                    <a:stretch>
-                      <a:fillRect/>
-                    </a:stretch>
-                  </pic:blipFill>
-                  <pic:spPr>
-                    <a:xfrm>
-                      <a:off x="0" y="0"/>
-                      <a:ext cx="5760720" cy="4772962"/>
-                    </a:xfrm>
-                    <a:prstGeom prst="rect"/>
-                  </pic:spPr>
-                </pic:pic>
-              </a:graphicData>
-            </a:graphic>
-          </wp:inline>
-        </w:drawing>
       </w:r>
     </w:p>
     <w:p>
@@ -843,45 +687,6 @@
       </w:r>
       <w:r>
         <w:t>. La estandarización y la normalización cambian las unidades pero no la forma de las distribuciones, porque las cuatro variables ya estaban en escalas comparables.</w:t>
-      </w:r>
-    </w:p>
-    <w:p>
-      <w:pPr>
-        <w:jc w:val="center"/>
-      </w:pPr>
-      <w:r>
-        <w:drawing>
-          <wp:inline xmlns:a="http://schemas.openxmlformats.org/drawingml/2006/main" xmlns:pic="http://schemas.openxmlformats.org/drawingml/2006/picture">
-            <wp:extent cx="5760720" cy="3647814"/>
-            <wp:docPr id="5" name="Picture 5"/>
-            <wp:cNvGraphicFramePr>
-              <a:graphicFrameLocks noChangeAspect="1"/>
-            </wp:cNvGraphicFramePr>
-            <a:graphic>
-              <a:graphicData uri="http://schemas.openxmlformats.org/drawingml/2006/picture">
-                <pic:pic>
-                  <pic:nvPicPr>
-                    <pic:cNvPr id="0" name="rev_iris_boxplot_estandarizado.png"/>
-                    <pic:cNvPicPr/>
-                  </pic:nvPicPr>
-                  <pic:blipFill>
-                    <a:blip r:embed="rId13"/>
-                    <a:stretch>
-                      <a:fillRect/>
-                    </a:stretch>
-                  </pic:blipFill>
-                  <pic:spPr>
-                    <a:xfrm>
-                      <a:off x="0" y="0"/>
-                      <a:ext cx="5760720" cy="3647814"/>
-                    </a:xfrm>
-                    <a:prstGeom prst="rect"/>
-                  </pic:spPr>
-                </pic:pic>
-              </a:graphicData>
-            </a:graphic>
-          </wp:inline>
-        </w:drawing>
       </w:r>
     </w:p>
     <w:p>
@@ -1884,45 +1689,6 @@
         <w:jc w:val="center"/>
       </w:pPr>
       <w:r>
-        <w:drawing>
-          <wp:inline xmlns:a="http://schemas.openxmlformats.org/drawingml/2006/main" xmlns:pic="http://schemas.openxmlformats.org/drawingml/2006/picture">
-            <wp:extent cx="5760720" cy="2310850"/>
-            <wp:docPr id="6" name="Picture 6"/>
-            <wp:cNvGraphicFramePr>
-              <a:graphicFrameLocks noChangeAspect="1"/>
-            </wp:cNvGraphicFramePr>
-            <a:graphic>
-              <a:graphicData uri="http://schemas.openxmlformats.org/drawingml/2006/picture">
-                <pic:pic>
-                  <pic:nvPicPr>
-                    <pic:cNvPr id="0" name="rev_iris_modelos.png"/>
-                    <pic:cNvPicPr/>
-                  </pic:nvPicPr>
-                  <pic:blipFill>
-                    <a:blip r:embed="rId14"/>
-                    <a:stretch>
-                      <a:fillRect/>
-                    </a:stretch>
-                  </pic:blipFill>
-                  <pic:spPr>
-                    <a:xfrm>
-                      <a:off x="0" y="0"/>
-                      <a:ext cx="5760720" cy="2310850"/>
-                    </a:xfrm>
-                    <a:prstGeom prst="rect"/>
-                  </pic:spPr>
-                </pic:pic>
-              </a:graphicData>
-            </a:graphic>
-          </wp:inline>
-        </w:drawing>
-      </w:r>
-    </w:p>
-    <w:p>
-      <w:pPr>
-        <w:jc w:val="center"/>
-      </w:pPr>
-      <w:r>
         <w:rPr>
           <w:i/>
           <w:sz w:val="18"/>
@@ -2431,89 +2197,11 @@
         <w:jc w:val="center"/>
       </w:pPr>
       <w:r>
-        <w:drawing>
-          <wp:inline xmlns:a="http://schemas.openxmlformats.org/drawingml/2006/main" xmlns:pic="http://schemas.openxmlformats.org/drawingml/2006/picture">
-            <wp:extent cx="5760720" cy="4244474"/>
-            <wp:docPr id="7" name="Picture 7"/>
-            <wp:cNvGraphicFramePr>
-              <a:graphicFrameLocks noChangeAspect="1"/>
-            </wp:cNvGraphicFramePr>
-            <a:graphic>
-              <a:graphicData uri="http://schemas.openxmlformats.org/drawingml/2006/picture">
-                <pic:pic>
-                  <pic:nvPicPr>
-                    <pic:cNvPr id="0" name="rev_banknote_histogramas.png"/>
-                    <pic:cNvPicPr/>
-                  </pic:nvPicPr>
-                  <pic:blipFill>
-                    <a:blip r:embed="rId15"/>
-                    <a:stretch>
-                      <a:fillRect/>
-                    </a:stretch>
-                  </pic:blipFill>
-                  <pic:spPr>
-                    <a:xfrm>
-                      <a:off x="0" y="0"/>
-                      <a:ext cx="5760720" cy="4244474"/>
-                    </a:xfrm>
-                    <a:prstGeom prst="rect"/>
-                  </pic:spPr>
-                </pic:pic>
-              </a:graphicData>
-            </a:graphic>
-          </wp:inline>
-        </w:drawing>
-      </w:r>
-    </w:p>
-    <w:p>
-      <w:pPr>
-        <w:jc w:val="center"/>
-      </w:pPr>
-      <w:r>
         <w:rPr>
           <w:i/>
           <w:sz w:val="18"/>
         </w:rPr>
         <w:t>La varianza discrimina apreciablemente entre las dos clases y los billetes falsos se concentran en valores negativos. La entropía apenas aporta separación.</w:t>
-      </w:r>
-    </w:p>
-    <w:p>
-      <w:pPr>
-        <w:jc w:val="center"/>
-      </w:pPr>
-      <w:r>
-        <w:drawing>
-          <wp:inline xmlns:a="http://schemas.openxmlformats.org/drawingml/2006/main" xmlns:pic="http://schemas.openxmlformats.org/drawingml/2006/picture">
-            <wp:extent cx="5760720" cy="3672378"/>
-            <wp:docPr id="8" name="Picture 8"/>
-            <wp:cNvGraphicFramePr>
-              <a:graphicFrameLocks noChangeAspect="1"/>
-            </wp:cNvGraphicFramePr>
-            <a:graphic>
-              <a:graphicData uri="http://schemas.openxmlformats.org/drawingml/2006/picture">
-                <pic:pic>
-                  <pic:nvPicPr>
-                    <pic:cNvPr id="0" name="rev_banknote_boxplot_crudo.png"/>
-                    <pic:cNvPicPr/>
-                  </pic:nvPicPr>
-                  <pic:blipFill>
-                    <a:blip r:embed="rId16"/>
-                    <a:stretch>
-                      <a:fillRect/>
-                    </a:stretch>
-                  </pic:blipFill>
-                  <pic:spPr>
-                    <a:xfrm>
-                      <a:off x="0" y="0"/>
-                      <a:ext cx="5760720" cy="3672378"/>
-                    </a:xfrm>
-                    <a:prstGeom prst="rect"/>
-                  </pic:spPr>
-                </pic:pic>
-              </a:graphicData>
-            </a:graphic>
-          </wp:inline>
-        </w:drawing>
       </w:r>
     </w:p>
     <w:p>
@@ -2533,89 +2221,11 @@
         <w:jc w:val="center"/>
       </w:pPr>
       <w:r>
-        <w:drawing>
-          <wp:inline xmlns:a="http://schemas.openxmlformats.org/drawingml/2006/main" xmlns:pic="http://schemas.openxmlformats.org/drawingml/2006/picture">
-            <wp:extent cx="5760720" cy="4244295"/>
-            <wp:docPr id="9" name="Picture 9"/>
-            <wp:cNvGraphicFramePr>
-              <a:graphicFrameLocks noChangeAspect="1"/>
-            </wp:cNvGraphicFramePr>
-            <a:graphic>
-              <a:graphicData uri="http://schemas.openxmlformats.org/drawingml/2006/picture">
-                <pic:pic>
-                  <pic:nvPicPr>
-                    <pic:cNvPr id="0" name="rev_banknote_balance.png"/>
-                    <pic:cNvPicPr/>
-                  </pic:nvPicPr>
-                  <pic:blipFill>
-                    <a:blip r:embed="rId17"/>
-                    <a:stretch>
-                      <a:fillRect/>
-                    </a:stretch>
-                  </pic:blipFill>
-                  <pic:spPr>
-                    <a:xfrm>
-                      <a:off x="0" y="0"/>
-                      <a:ext cx="5760720" cy="4244295"/>
-                    </a:xfrm>
-                    <a:prstGeom prst="rect"/>
-                  </pic:spPr>
-                </pic:pic>
-              </a:graphicData>
-            </a:graphic>
-          </wp:inline>
-        </w:drawing>
-      </w:r>
-    </w:p>
-    <w:p>
-      <w:pPr>
-        <w:jc w:val="center"/>
-      </w:pPr>
-      <w:r>
         <w:rPr>
           <w:i/>
           <w:sz w:val="18"/>
         </w:rPr>
         <w:t>La distribución es de 762 billetes auténticos frente a 610 falsos, un desbalance moderado.</w:t>
-      </w:r>
-    </w:p>
-    <w:p>
-      <w:pPr>
-        <w:jc w:val="center"/>
-      </w:pPr>
-      <w:r>
-        <w:drawing>
-          <wp:inline xmlns:a="http://schemas.openxmlformats.org/drawingml/2006/main" xmlns:pic="http://schemas.openxmlformats.org/drawingml/2006/picture">
-            <wp:extent cx="5760720" cy="4695773"/>
-            <wp:docPr id="10" name="Picture 10"/>
-            <wp:cNvGraphicFramePr>
-              <a:graphicFrameLocks noChangeAspect="1"/>
-            </wp:cNvGraphicFramePr>
-            <a:graphic>
-              <a:graphicData uri="http://schemas.openxmlformats.org/drawingml/2006/picture">
-                <pic:pic>
-                  <pic:nvPicPr>
-                    <pic:cNvPr id="0" name="rev_banknote_dispersion.png"/>
-                    <pic:cNvPicPr/>
-                  </pic:nvPicPr>
-                  <pic:blipFill>
-                    <a:blip r:embed="rId18"/>
-                    <a:stretch>
-                      <a:fillRect/>
-                    </a:stretch>
-                  </pic:blipFill>
-                  <pic:spPr>
-                    <a:xfrm>
-                      <a:off x="0" y="0"/>
-                      <a:ext cx="5760720" cy="4695773"/>
-                    </a:xfrm>
-                    <a:prstGeom prst="rect"/>
-                  </pic:spPr>
-                </pic:pic>
-              </a:graphicData>
-            </a:graphic>
-          </wp:inline>
-        </w:drawing>
       </w:r>
     </w:p>
     <w:p>
@@ -2648,89 +2258,11 @@
         <w:jc w:val="center"/>
       </w:pPr>
       <w:r>
-        <w:drawing>
-          <wp:inline xmlns:a="http://schemas.openxmlformats.org/drawingml/2006/main" xmlns:pic="http://schemas.openxmlformats.org/drawingml/2006/picture">
-            <wp:extent cx="5760720" cy="3672378"/>
-            <wp:docPr id="11" name="Picture 11"/>
-            <wp:cNvGraphicFramePr>
-              <a:graphicFrameLocks noChangeAspect="1"/>
-            </wp:cNvGraphicFramePr>
-            <a:graphic>
-              <a:graphicData uri="http://schemas.openxmlformats.org/drawingml/2006/picture">
-                <pic:pic>
-                  <pic:nvPicPr>
-                    <pic:cNvPr id="0" name="rev_banknote_boxplot_outliers.png"/>
-                    <pic:cNvPicPr/>
-                  </pic:nvPicPr>
-                  <pic:blipFill>
-                    <a:blip r:embed="rId19"/>
-                    <a:stretch>
-                      <a:fillRect/>
-                    </a:stretch>
-                  </pic:blipFill>
-                  <pic:spPr>
-                    <a:xfrm>
-                      <a:off x="0" y="0"/>
-                      <a:ext cx="5760720" cy="3672378"/>
-                    </a:xfrm>
-                    <a:prstGeom prst="rect"/>
-                  </pic:spPr>
-                </pic:pic>
-              </a:graphicData>
-            </a:graphic>
-          </wp:inline>
-        </w:drawing>
-      </w:r>
-    </w:p>
-    <w:p>
-      <w:pPr>
-        <w:jc w:val="center"/>
-      </w:pPr>
-      <w:r>
         <w:rPr>
           <w:i/>
           <w:sz w:val="18"/>
         </w:rPr>
         <w:t>El recorte afecta las colas de la curtosis y de la entropía.</w:t>
-      </w:r>
-    </w:p>
-    <w:p>
-      <w:pPr>
-        <w:jc w:val="center"/>
-      </w:pPr>
-      <w:r>
-        <w:drawing>
-          <wp:inline xmlns:a="http://schemas.openxmlformats.org/drawingml/2006/main" xmlns:pic="http://schemas.openxmlformats.org/drawingml/2006/picture">
-            <wp:extent cx="5760720" cy="3647814"/>
-            <wp:docPr id="12" name="Picture 12"/>
-            <wp:cNvGraphicFramePr>
-              <a:graphicFrameLocks noChangeAspect="1"/>
-            </wp:cNvGraphicFramePr>
-            <a:graphic>
-              <a:graphicData uri="http://schemas.openxmlformats.org/drawingml/2006/picture">
-                <pic:pic>
-                  <pic:nvPicPr>
-                    <pic:cNvPr id="0" name="rev_banknote_boxplot_estandarizado.png"/>
-                    <pic:cNvPicPr/>
-                  </pic:nvPicPr>
-                  <pic:blipFill>
-                    <a:blip r:embed="rId20"/>
-                    <a:stretch>
-                      <a:fillRect/>
-                    </a:stretch>
-                  </pic:blipFill>
-                  <pic:spPr>
-                    <a:xfrm>
-                      <a:off x="0" y="0"/>
-                      <a:ext cx="5760720" cy="3647814"/>
-                    </a:xfrm>
-                    <a:prstGeom prst="rect"/>
-                  </pic:spPr>
-                </pic:pic>
-              </a:graphicData>
-            </a:graphic>
-          </wp:inline>
-        </w:drawing>
       </w:r>
     </w:p>
     <w:p>
@@ -3389,45 +2921,6 @@
         <w:jc w:val="center"/>
       </w:pPr>
       <w:r>
-        <w:drawing>
-          <wp:inline xmlns:a="http://schemas.openxmlformats.org/drawingml/2006/main" xmlns:pic="http://schemas.openxmlformats.org/drawingml/2006/picture">
-            <wp:extent cx="5760720" cy="3599555"/>
-            <wp:docPr id="13" name="Picture 13"/>
-            <wp:cNvGraphicFramePr>
-              <a:graphicFrameLocks noChangeAspect="1"/>
-            </wp:cNvGraphicFramePr>
-            <a:graphic>
-              <a:graphicData uri="http://schemas.openxmlformats.org/drawingml/2006/picture">
-                <pic:pic>
-                  <pic:nvPicPr>
-                    <pic:cNvPr id="0" name="rev_banknote_modelos.png"/>
-                    <pic:cNvPicPr/>
-                  </pic:nvPicPr>
-                  <pic:blipFill>
-                    <a:blip r:embed="rId21"/>
-                    <a:stretch>
-                      <a:fillRect/>
-                    </a:stretch>
-                  </pic:blipFill>
-                  <pic:spPr>
-                    <a:xfrm>
-                      <a:off x="0" y="0"/>
-                      <a:ext cx="5760720" cy="3599555"/>
-                    </a:xfrm>
-                    <a:prstGeom prst="rect"/>
-                  </pic:spPr>
-                </pic:pic>
-              </a:graphicData>
-            </a:graphic>
-          </wp:inline>
-        </w:drawing>
-      </w:r>
-    </w:p>
-    <w:p>
-      <w:pPr>
-        <w:jc w:val="center"/>
-      </w:pPr>
-      <w:r>
         <w:rPr>
           <w:i/>
           <w:sz w:val="18"/>

</xml_diff>

<commit_message>
Taller 1: acentos en el informe y conversor con rutas de imagen relativas
</commit_message>
<xml_diff>
--- a/Taller 1/Revision_datos.docx
+++ b/Taller 1/Revision_datos.docx
@@ -611,11 +611,89 @@
         <w:jc w:val="center"/>
       </w:pPr>
       <w:r>
+        <w:drawing>
+          <wp:inline xmlns:a="http://schemas.openxmlformats.org/drawingml/2006/main" xmlns:pic="http://schemas.openxmlformats.org/drawingml/2006/picture">
+            <wp:extent cx="5760720" cy="4417573"/>
+            <wp:docPr id="1" name="Picture 1"/>
+            <wp:cNvGraphicFramePr>
+              <a:graphicFrameLocks noChangeAspect="1"/>
+            </wp:cNvGraphicFramePr>
+            <a:graphic>
+              <a:graphicData uri="http://schemas.openxmlformats.org/drawingml/2006/picture">
+                <pic:pic>
+                  <pic:nvPicPr>
+                    <pic:cNvPr id="0" name="rev_iris_histogramas.png"/>
+                    <pic:cNvPicPr/>
+                  </pic:nvPicPr>
+                  <pic:blipFill>
+                    <a:blip r:embed="rId9"/>
+                    <a:stretch>
+                      <a:fillRect/>
+                    </a:stretch>
+                  </pic:blipFill>
+                  <pic:spPr>
+                    <a:xfrm>
+                      <a:off x="0" y="0"/>
+                      <a:ext cx="5760720" cy="4417573"/>
+                    </a:xfrm>
+                    <a:prstGeom prst="rect"/>
+                  </pic:spPr>
+                </pic:pic>
+              </a:graphicData>
+            </a:graphic>
+          </wp:inline>
+        </w:drawing>
+      </w:r>
+    </w:p>
+    <w:p>
+      <w:pPr>
+        <w:jc w:val="center"/>
+      </w:pPr>
+      <w:r>
         <w:rPr>
           <w:i/>
           <w:sz w:val="18"/>
         </w:rPr>
         <w:t>Las medidas del pétalo separan setosa de las otras dos especies por sí solas. Las del sépalo presentan un traslape mayor entre clases.</w:t>
+      </w:r>
+    </w:p>
+    <w:p>
+      <w:pPr>
+        <w:jc w:val="center"/>
+      </w:pPr>
+      <w:r>
+        <w:drawing>
+          <wp:inline xmlns:a="http://schemas.openxmlformats.org/drawingml/2006/main" xmlns:pic="http://schemas.openxmlformats.org/drawingml/2006/picture">
+            <wp:extent cx="5760720" cy="3639699"/>
+            <wp:docPr id="2" name="Picture 2"/>
+            <wp:cNvGraphicFramePr>
+              <a:graphicFrameLocks noChangeAspect="1"/>
+            </wp:cNvGraphicFramePr>
+            <a:graphic>
+              <a:graphicData uri="http://schemas.openxmlformats.org/drawingml/2006/picture">
+                <pic:pic>
+                  <pic:nvPicPr>
+                    <pic:cNvPr id="0" name="rev_iris_boxplot_crudo.png"/>
+                    <pic:cNvPicPr/>
+                  </pic:nvPicPr>
+                  <pic:blipFill>
+                    <a:blip r:embed="rId10"/>
+                    <a:stretch>
+                      <a:fillRect/>
+                    </a:stretch>
+                  </pic:blipFill>
+                  <pic:spPr>
+                    <a:xfrm>
+                      <a:off x="0" y="0"/>
+                      <a:ext cx="5760720" cy="3639699"/>
+                    </a:xfrm>
+                    <a:prstGeom prst="rect"/>
+                  </pic:spPr>
+                </pic:pic>
+              </a:graphicData>
+            </a:graphic>
+          </wp:inline>
+        </w:drawing>
       </w:r>
     </w:p>
     <w:p>
@@ -635,11 +713,89 @@
         <w:jc w:val="center"/>
       </w:pPr>
       <w:r>
+        <w:drawing>
+          <wp:inline xmlns:a="http://schemas.openxmlformats.org/drawingml/2006/main" xmlns:pic="http://schemas.openxmlformats.org/drawingml/2006/picture">
+            <wp:extent cx="5760720" cy="4348526"/>
+            <wp:docPr id="3" name="Picture 3"/>
+            <wp:cNvGraphicFramePr>
+              <a:graphicFrameLocks noChangeAspect="1"/>
+            </wp:cNvGraphicFramePr>
+            <a:graphic>
+              <a:graphicData uri="http://schemas.openxmlformats.org/drawingml/2006/picture">
+                <pic:pic>
+                  <pic:nvPicPr>
+                    <pic:cNvPr id="0" name="rev_iris_balance.png"/>
+                    <pic:cNvPicPr/>
+                  </pic:nvPicPr>
+                  <pic:blipFill>
+                    <a:blip r:embed="rId11"/>
+                    <a:stretch>
+                      <a:fillRect/>
+                    </a:stretch>
+                  </pic:blipFill>
+                  <pic:spPr>
+                    <a:xfrm>
+                      <a:off x="0" y="0"/>
+                      <a:ext cx="5760720" cy="4348526"/>
+                    </a:xfrm>
+                    <a:prstGeom prst="rect"/>
+                  </pic:spPr>
+                </pic:pic>
+              </a:graphicData>
+            </a:graphic>
+          </wp:inline>
+        </w:drawing>
+      </w:r>
+    </w:p>
+    <w:p>
+      <w:pPr>
+        <w:jc w:val="center"/>
+      </w:pPr>
+      <w:r>
         <w:rPr>
           <w:i/>
           <w:sz w:val="18"/>
         </w:rPr>
         <w:t>50 de cada clase. El conjunto ya viene balanceado.</w:t>
+      </w:r>
+    </w:p>
+    <w:p>
+      <w:pPr>
+        <w:jc w:val="center"/>
+      </w:pPr>
+      <w:r>
+        <w:drawing>
+          <wp:inline xmlns:a="http://schemas.openxmlformats.org/drawingml/2006/main" xmlns:pic="http://schemas.openxmlformats.org/drawingml/2006/picture">
+            <wp:extent cx="5760720" cy="4772962"/>
+            <wp:docPr id="4" name="Picture 4"/>
+            <wp:cNvGraphicFramePr>
+              <a:graphicFrameLocks noChangeAspect="1"/>
+            </wp:cNvGraphicFramePr>
+            <a:graphic>
+              <a:graphicData uri="http://schemas.openxmlformats.org/drawingml/2006/picture">
+                <pic:pic>
+                  <pic:nvPicPr>
+                    <pic:cNvPr id="0" name="rev_iris_dispersion.png"/>
+                    <pic:cNvPicPr/>
+                  </pic:nvPicPr>
+                  <pic:blipFill>
+                    <a:blip r:embed="rId12"/>
+                    <a:stretch>
+                      <a:fillRect/>
+                    </a:stretch>
+                  </pic:blipFill>
+                  <pic:spPr>
+                    <a:xfrm>
+                      <a:off x="0" y="0"/>
+                      <a:ext cx="5760720" cy="4772962"/>
+                    </a:xfrm>
+                    <a:prstGeom prst="rect"/>
+                  </pic:spPr>
+                </pic:pic>
+              </a:graphicData>
+            </a:graphic>
+          </wp:inline>
+        </w:drawing>
       </w:r>
     </w:p>
     <w:p>
@@ -687,6 +843,45 @@
       </w:r>
       <w:r>
         <w:t>. La estandarización y la normalización cambian las unidades pero no la forma de las distribuciones, porque las cuatro variables ya estaban en escalas comparables.</w:t>
+      </w:r>
+    </w:p>
+    <w:p>
+      <w:pPr>
+        <w:jc w:val="center"/>
+      </w:pPr>
+      <w:r>
+        <w:drawing>
+          <wp:inline xmlns:a="http://schemas.openxmlformats.org/drawingml/2006/main" xmlns:pic="http://schemas.openxmlformats.org/drawingml/2006/picture">
+            <wp:extent cx="5760720" cy="3647814"/>
+            <wp:docPr id="5" name="Picture 5"/>
+            <wp:cNvGraphicFramePr>
+              <a:graphicFrameLocks noChangeAspect="1"/>
+            </wp:cNvGraphicFramePr>
+            <a:graphic>
+              <a:graphicData uri="http://schemas.openxmlformats.org/drawingml/2006/picture">
+                <pic:pic>
+                  <pic:nvPicPr>
+                    <pic:cNvPr id="0" name="rev_iris_boxplot_estandarizado.png"/>
+                    <pic:cNvPicPr/>
+                  </pic:nvPicPr>
+                  <pic:blipFill>
+                    <a:blip r:embed="rId13"/>
+                    <a:stretch>
+                      <a:fillRect/>
+                    </a:stretch>
+                  </pic:blipFill>
+                  <pic:spPr>
+                    <a:xfrm>
+                      <a:off x="0" y="0"/>
+                      <a:ext cx="5760720" cy="3647814"/>
+                    </a:xfrm>
+                    <a:prstGeom prst="rect"/>
+                  </pic:spPr>
+                </pic:pic>
+              </a:graphicData>
+            </a:graphic>
+          </wp:inline>
+        </w:drawing>
       </w:r>
     </w:p>
     <w:p>
@@ -1689,6 +1884,45 @@
         <w:jc w:val="center"/>
       </w:pPr>
       <w:r>
+        <w:drawing>
+          <wp:inline xmlns:a="http://schemas.openxmlformats.org/drawingml/2006/main" xmlns:pic="http://schemas.openxmlformats.org/drawingml/2006/picture">
+            <wp:extent cx="5760720" cy="2310850"/>
+            <wp:docPr id="6" name="Picture 6"/>
+            <wp:cNvGraphicFramePr>
+              <a:graphicFrameLocks noChangeAspect="1"/>
+            </wp:cNvGraphicFramePr>
+            <a:graphic>
+              <a:graphicData uri="http://schemas.openxmlformats.org/drawingml/2006/picture">
+                <pic:pic>
+                  <pic:nvPicPr>
+                    <pic:cNvPr id="0" name="rev_iris_modelos.png"/>
+                    <pic:cNvPicPr/>
+                  </pic:nvPicPr>
+                  <pic:blipFill>
+                    <a:blip r:embed="rId14"/>
+                    <a:stretch>
+                      <a:fillRect/>
+                    </a:stretch>
+                  </pic:blipFill>
+                  <pic:spPr>
+                    <a:xfrm>
+                      <a:off x="0" y="0"/>
+                      <a:ext cx="5760720" cy="2310850"/>
+                    </a:xfrm>
+                    <a:prstGeom prst="rect"/>
+                  </pic:spPr>
+                </pic:pic>
+              </a:graphicData>
+            </a:graphic>
+          </wp:inline>
+        </w:drawing>
+      </w:r>
+    </w:p>
+    <w:p>
+      <w:pPr>
+        <w:jc w:val="center"/>
+      </w:pPr>
+      <w:r>
         <w:rPr>
           <w:i/>
           <w:sz w:val="18"/>
@@ -2197,11 +2431,89 @@
         <w:jc w:val="center"/>
       </w:pPr>
       <w:r>
+        <w:drawing>
+          <wp:inline xmlns:a="http://schemas.openxmlformats.org/drawingml/2006/main" xmlns:pic="http://schemas.openxmlformats.org/drawingml/2006/picture">
+            <wp:extent cx="5760720" cy="4244474"/>
+            <wp:docPr id="7" name="Picture 7"/>
+            <wp:cNvGraphicFramePr>
+              <a:graphicFrameLocks noChangeAspect="1"/>
+            </wp:cNvGraphicFramePr>
+            <a:graphic>
+              <a:graphicData uri="http://schemas.openxmlformats.org/drawingml/2006/picture">
+                <pic:pic>
+                  <pic:nvPicPr>
+                    <pic:cNvPr id="0" name="rev_banknote_histogramas.png"/>
+                    <pic:cNvPicPr/>
+                  </pic:nvPicPr>
+                  <pic:blipFill>
+                    <a:blip r:embed="rId15"/>
+                    <a:stretch>
+                      <a:fillRect/>
+                    </a:stretch>
+                  </pic:blipFill>
+                  <pic:spPr>
+                    <a:xfrm>
+                      <a:off x="0" y="0"/>
+                      <a:ext cx="5760720" cy="4244474"/>
+                    </a:xfrm>
+                    <a:prstGeom prst="rect"/>
+                  </pic:spPr>
+                </pic:pic>
+              </a:graphicData>
+            </a:graphic>
+          </wp:inline>
+        </w:drawing>
+      </w:r>
+    </w:p>
+    <w:p>
+      <w:pPr>
+        <w:jc w:val="center"/>
+      </w:pPr>
+      <w:r>
         <w:rPr>
           <w:i/>
           <w:sz w:val="18"/>
         </w:rPr>
         <w:t>La varianza discrimina apreciablemente entre las dos clases y los billetes falsos se concentran en valores negativos. La entropía apenas aporta separación.</w:t>
+      </w:r>
+    </w:p>
+    <w:p>
+      <w:pPr>
+        <w:jc w:val="center"/>
+      </w:pPr>
+      <w:r>
+        <w:drawing>
+          <wp:inline xmlns:a="http://schemas.openxmlformats.org/drawingml/2006/main" xmlns:pic="http://schemas.openxmlformats.org/drawingml/2006/picture">
+            <wp:extent cx="5760720" cy="3672378"/>
+            <wp:docPr id="8" name="Picture 8"/>
+            <wp:cNvGraphicFramePr>
+              <a:graphicFrameLocks noChangeAspect="1"/>
+            </wp:cNvGraphicFramePr>
+            <a:graphic>
+              <a:graphicData uri="http://schemas.openxmlformats.org/drawingml/2006/picture">
+                <pic:pic>
+                  <pic:nvPicPr>
+                    <pic:cNvPr id="0" name="rev_banknote_boxplot_crudo.png"/>
+                    <pic:cNvPicPr/>
+                  </pic:nvPicPr>
+                  <pic:blipFill>
+                    <a:blip r:embed="rId16"/>
+                    <a:stretch>
+                      <a:fillRect/>
+                    </a:stretch>
+                  </pic:blipFill>
+                  <pic:spPr>
+                    <a:xfrm>
+                      <a:off x="0" y="0"/>
+                      <a:ext cx="5760720" cy="3672378"/>
+                    </a:xfrm>
+                    <a:prstGeom prst="rect"/>
+                  </pic:spPr>
+                </pic:pic>
+              </a:graphicData>
+            </a:graphic>
+          </wp:inline>
+        </w:drawing>
       </w:r>
     </w:p>
     <w:p>
@@ -2221,11 +2533,89 @@
         <w:jc w:val="center"/>
       </w:pPr>
       <w:r>
+        <w:drawing>
+          <wp:inline xmlns:a="http://schemas.openxmlformats.org/drawingml/2006/main" xmlns:pic="http://schemas.openxmlformats.org/drawingml/2006/picture">
+            <wp:extent cx="5760720" cy="4244295"/>
+            <wp:docPr id="9" name="Picture 9"/>
+            <wp:cNvGraphicFramePr>
+              <a:graphicFrameLocks noChangeAspect="1"/>
+            </wp:cNvGraphicFramePr>
+            <a:graphic>
+              <a:graphicData uri="http://schemas.openxmlformats.org/drawingml/2006/picture">
+                <pic:pic>
+                  <pic:nvPicPr>
+                    <pic:cNvPr id="0" name="rev_banknote_balance.png"/>
+                    <pic:cNvPicPr/>
+                  </pic:nvPicPr>
+                  <pic:blipFill>
+                    <a:blip r:embed="rId17"/>
+                    <a:stretch>
+                      <a:fillRect/>
+                    </a:stretch>
+                  </pic:blipFill>
+                  <pic:spPr>
+                    <a:xfrm>
+                      <a:off x="0" y="0"/>
+                      <a:ext cx="5760720" cy="4244295"/>
+                    </a:xfrm>
+                    <a:prstGeom prst="rect"/>
+                  </pic:spPr>
+                </pic:pic>
+              </a:graphicData>
+            </a:graphic>
+          </wp:inline>
+        </w:drawing>
+      </w:r>
+    </w:p>
+    <w:p>
+      <w:pPr>
+        <w:jc w:val="center"/>
+      </w:pPr>
+      <w:r>
         <w:rPr>
           <w:i/>
           <w:sz w:val="18"/>
         </w:rPr>
         <w:t>La distribución es de 762 billetes auténticos frente a 610 falsos, un desbalance moderado.</w:t>
+      </w:r>
+    </w:p>
+    <w:p>
+      <w:pPr>
+        <w:jc w:val="center"/>
+      </w:pPr>
+      <w:r>
+        <w:drawing>
+          <wp:inline xmlns:a="http://schemas.openxmlformats.org/drawingml/2006/main" xmlns:pic="http://schemas.openxmlformats.org/drawingml/2006/picture">
+            <wp:extent cx="5760720" cy="4695773"/>
+            <wp:docPr id="10" name="Picture 10"/>
+            <wp:cNvGraphicFramePr>
+              <a:graphicFrameLocks noChangeAspect="1"/>
+            </wp:cNvGraphicFramePr>
+            <a:graphic>
+              <a:graphicData uri="http://schemas.openxmlformats.org/drawingml/2006/picture">
+                <pic:pic>
+                  <pic:nvPicPr>
+                    <pic:cNvPr id="0" name="rev_banknote_dispersion.png"/>
+                    <pic:cNvPicPr/>
+                  </pic:nvPicPr>
+                  <pic:blipFill>
+                    <a:blip r:embed="rId18"/>
+                    <a:stretch>
+                      <a:fillRect/>
+                    </a:stretch>
+                  </pic:blipFill>
+                  <pic:spPr>
+                    <a:xfrm>
+                      <a:off x="0" y="0"/>
+                      <a:ext cx="5760720" cy="4695773"/>
+                    </a:xfrm>
+                    <a:prstGeom prst="rect"/>
+                  </pic:spPr>
+                </pic:pic>
+              </a:graphicData>
+            </a:graphic>
+          </wp:inline>
+        </w:drawing>
       </w:r>
     </w:p>
     <w:p>
@@ -2258,11 +2648,89 @@
         <w:jc w:val="center"/>
       </w:pPr>
       <w:r>
+        <w:drawing>
+          <wp:inline xmlns:a="http://schemas.openxmlformats.org/drawingml/2006/main" xmlns:pic="http://schemas.openxmlformats.org/drawingml/2006/picture">
+            <wp:extent cx="5760720" cy="3672378"/>
+            <wp:docPr id="11" name="Picture 11"/>
+            <wp:cNvGraphicFramePr>
+              <a:graphicFrameLocks noChangeAspect="1"/>
+            </wp:cNvGraphicFramePr>
+            <a:graphic>
+              <a:graphicData uri="http://schemas.openxmlformats.org/drawingml/2006/picture">
+                <pic:pic>
+                  <pic:nvPicPr>
+                    <pic:cNvPr id="0" name="rev_banknote_boxplot_outliers.png"/>
+                    <pic:cNvPicPr/>
+                  </pic:nvPicPr>
+                  <pic:blipFill>
+                    <a:blip r:embed="rId19"/>
+                    <a:stretch>
+                      <a:fillRect/>
+                    </a:stretch>
+                  </pic:blipFill>
+                  <pic:spPr>
+                    <a:xfrm>
+                      <a:off x="0" y="0"/>
+                      <a:ext cx="5760720" cy="3672378"/>
+                    </a:xfrm>
+                    <a:prstGeom prst="rect"/>
+                  </pic:spPr>
+                </pic:pic>
+              </a:graphicData>
+            </a:graphic>
+          </wp:inline>
+        </w:drawing>
+      </w:r>
+    </w:p>
+    <w:p>
+      <w:pPr>
+        <w:jc w:val="center"/>
+      </w:pPr>
+      <w:r>
         <w:rPr>
           <w:i/>
           <w:sz w:val="18"/>
         </w:rPr>
         <w:t>El recorte afecta las colas de la curtosis y de la entropía.</w:t>
+      </w:r>
+    </w:p>
+    <w:p>
+      <w:pPr>
+        <w:jc w:val="center"/>
+      </w:pPr>
+      <w:r>
+        <w:drawing>
+          <wp:inline xmlns:a="http://schemas.openxmlformats.org/drawingml/2006/main" xmlns:pic="http://schemas.openxmlformats.org/drawingml/2006/picture">
+            <wp:extent cx="5760720" cy="3647814"/>
+            <wp:docPr id="12" name="Picture 12"/>
+            <wp:cNvGraphicFramePr>
+              <a:graphicFrameLocks noChangeAspect="1"/>
+            </wp:cNvGraphicFramePr>
+            <a:graphic>
+              <a:graphicData uri="http://schemas.openxmlformats.org/drawingml/2006/picture">
+                <pic:pic>
+                  <pic:nvPicPr>
+                    <pic:cNvPr id="0" name="rev_banknote_boxplot_estandarizado.png"/>
+                    <pic:cNvPicPr/>
+                  </pic:nvPicPr>
+                  <pic:blipFill>
+                    <a:blip r:embed="rId20"/>
+                    <a:stretch>
+                      <a:fillRect/>
+                    </a:stretch>
+                  </pic:blipFill>
+                  <pic:spPr>
+                    <a:xfrm>
+                      <a:off x="0" y="0"/>
+                      <a:ext cx="5760720" cy="3647814"/>
+                    </a:xfrm>
+                    <a:prstGeom prst="rect"/>
+                  </pic:spPr>
+                </pic:pic>
+              </a:graphicData>
+            </a:graphic>
+          </wp:inline>
+        </w:drawing>
       </w:r>
     </w:p>
     <w:p>
@@ -2921,6 +3389,45 @@
         <w:jc w:val="center"/>
       </w:pPr>
       <w:r>
+        <w:drawing>
+          <wp:inline xmlns:a="http://schemas.openxmlformats.org/drawingml/2006/main" xmlns:pic="http://schemas.openxmlformats.org/drawingml/2006/picture">
+            <wp:extent cx="5760720" cy="3599555"/>
+            <wp:docPr id="13" name="Picture 13"/>
+            <wp:cNvGraphicFramePr>
+              <a:graphicFrameLocks noChangeAspect="1"/>
+            </wp:cNvGraphicFramePr>
+            <a:graphic>
+              <a:graphicData uri="http://schemas.openxmlformats.org/drawingml/2006/picture">
+                <pic:pic>
+                  <pic:nvPicPr>
+                    <pic:cNvPr id="0" name="rev_banknote_modelos.png"/>
+                    <pic:cNvPicPr/>
+                  </pic:nvPicPr>
+                  <pic:blipFill>
+                    <a:blip r:embed="rId21"/>
+                    <a:stretch>
+                      <a:fillRect/>
+                    </a:stretch>
+                  </pic:blipFill>
+                  <pic:spPr>
+                    <a:xfrm>
+                      <a:off x="0" y="0"/>
+                      <a:ext cx="5760720" cy="3599555"/>
+                    </a:xfrm>
+                    <a:prstGeom prst="rect"/>
+                  </pic:spPr>
+                </pic:pic>
+              </a:graphicData>
+            </a:graphic>
+          </wp:inline>
+        </w:drawing>
+      </w:r>
+    </w:p>
+    <w:p>
+      <w:pPr>
+        <w:jc w:val="center"/>
+      </w:pPr>
+      <w:r>
         <w:rPr>
           <w:i/>
           <w:sz w:val="18"/>

</xml_diff>